<commit_message>
Strengthen paper with scoring-rule comparison and verified pilot source link
</commit_message>
<xml_diff>
--- a/docs/research-paper/CodeVedha_EmergIN2027_Paper.docx
+++ b/docs/research-paper/CodeVedha_EmergIN2027_Paper.docx
@@ -135,7 +135,7 @@
         <w:pStyle w:val="Abstract"/>
       </w:pPr>
       <w:r>
-        <w:t>Abstract—Programming assessment platforms must distinguish observed test outcomes, inferred resource complexity, and generated learning advice. Combining these signals without explicit constraints can produce high grades for incorrect programs or promise improvements that have not been evaluated. This paper presents CodeVedha, an implemented assessment platform that combines isolated execution, structural complexity analysis, deterministic style checks, and optional language model assistance. Its versioned rubric allocates thirty percent to correctness, thirty-five percent to time complexity, twenty-five percent to space complexity, and ten percent to style, while limiting the final mark by observed correctness. We establish this scoring invariant and describe how incomplete evidence remains unscored. A separate revision workflow generates a private candidate, reviews its alignment with the displayed guidance, executes it, and measures its score using the saved rubric without changing the learner's official grade. Verification of the frozen implementation includes 333 backend tests, nine projection interface checks, eight live execution contracts, and candidate-to-official score consistency under two weight configurations. A small, explicitly AI-assisted pilot of twenty snippets across five languages and two problem groups gives nineteen joint exact complexity-label matches with model proposals. These findings support implementation consistency and expose a symbolic-bound limitation; they do not establish expert grading accuracy, optimal weights, or improved learning outcomes.</w:t>
+        <w:t>Abstract—Programming assessment must distinguish observed correctness, inferred resource complexity, and generated advice. CodeVedha combines isolated execution, structural analysis, deterministic style checks, and optional language model assistance under a versioned scoring contract. Its correctness ceiling limits the final grade by the fraction of evaluated cases passed, while missing weighted evidence remains explicit. A separate projection route generates a private candidate, reviews its alignment with displayed guidance, executes it, and measures its score using the saved rubric. We establish the ceiling invariant and compare four scoring rules on the same eighty-four component and weight configurations. Weighted aggregation alone exceeds observed correctness in forty-nine configurations; a fixed failure cap does so in forty-three. Both multiplicative scaling and the proposed ceiling have no unrounded violations, with different partial-credit behavior. Eight live execution contracts meet their expected outcomes, and candidate scores match fresh official scores under two weight configurations. A twenty-snippet AI-assisted pilot across five languages gives nineteen joint exact complexity-label matches with model proposals and identifies a symbolic-bound limitation. These results characterize policy behavior and implementation consistency. They do not establish expert grading accuracy, optimal weights, or educational benefit.</w:t>
       </w:r>
     </w:p>
     <w:p>
@@ -186,7 +186,7 @@
         <w:pStyle w:val="BodyText"/>
       </w:pPr>
       <w:r>
-        <w:t>The contribution is an implemented assessment design with three inspectable properties. First, a correctness ceiling bounds the final mark even when complexity and style components are high. Second, unavailable weighted evidence is retained as incomplete instead of silently redistributing credit. Third, a score projection is associated with an executed private candidate and the learner's saved rubric; it is not a promised grade for a future implementation. We evaluate these properties through reproducible contracts and a limited complexity-label pilot. We make no claim of a new general complexity inference algorithm or experimentally demonstrated learning benefit.</w:t>
+        <w:t>The contribution is an implemented evidence contract linking three decisions: a correctness ceiling on the mark, explicit incompleteness when weighted evidence is missing, and a separately measured candidate projection tied to the saved rubric. We investigate whether these decisions prevent violations of the stipulated ceiling, how they differ from alternative correctness constraints, and whether candidate scoring agrees with a fresh official assessment. The contribution is this integration and its controlled characterization, rather than a new asymptotic inference algorithm. The arithmetic invariant alone does not establish pedagogical validity.</w:t>
       </w:r>
     </w:p>
     <w:p>
@@ -213,7 +213,7 @@
         <w:pStyle w:val="BodyText"/>
       </w:pPr>
       <w:r>
-        <w:t>The selected base paper, Autograder+, combines adapted language models, instructional prompt selection, and learned representations for feedback and cohort visualization [4]. CodeVedha uses that work as motivation rather than inheriting its data or experimental results. Our emphasis is a versioned scoring contract and a guarded relationship between staged guidance, private revision assessment, and the saved learner grade. We do not reproduce Autograder+'s training or claim a controlled comparison against it.</w:t>
+        <w:t>Autograder+ combines adapted language models, instructional prompt selection, and learned representations for feedback and cohort visualization [4]. Its evaluation emphasizes feedback alignment and submission representations. CodeVedha instead studies the contract connecting execution evidence, withheld scores, rubric snapshots, and revision projections. We use Autograder+ as motivation, without inheriting its data, training results, or numerical feedback claims. The present controlled comparison varies scoring rules within CodeVedha; it is not a head-to-head evaluation of the two platforms.</w:t>
       </w:r>
     </w:p>
     <w:p>
@@ -367,7 +367,7 @@
         <w:pStyle w:val="BodyText"/>
       </w:pPr>
       <w:r>
-        <w:t>The structural analyzer inspects loop bounds, nesting, recognized operations, function structure, and allocation patterns. A parsing infrastructure such as Tree-sitter supplies syntax structure [8]; syntax alone does not prove asymptotic cost. The platform records the estimated time and space expressions, confidence, method, status, and supporting signals. Complete structural results above the configured direct threshold, 0.85 by default, can proceed without an optional model review. This threshold is an engineering heuristic, not a calibrated probability of correctness.</w:t>
+        <w:t>The structural analyzer inspects loop bounds, nesting, recognized operations, function structure, and allocation patterns. Tree-sitter supplies syntax structure [8]; syntax alone does not prove asymptotic cost. The platform records estimated time and space expressions, confidence, method, status, and supporting signals. Complete structural results at or above the configured direct threshold, 0.85 by default, can proceed without an optional model review. This threshold is an engineering heuristic, not a calibrated probability of correctness.</w:t>
       </w:r>
     </w:p>
     <w:p>
@@ -391,7 +391,7 @@
         <w:pStyle w:val="BodyText"/>
       </w:pPr>
       <w:r>
-        <w:t>Let the submitted and target ranks be rₛ and rₜ, indexed from one, and let L be the number of buckets. The implementation subtracts a penalty proportional to max(0, rₛ minus rₜ) divided by max(1, L minus rₜ), clips the result to zero through twenty-five marks, and rounds to three decimal places. Multiplying those marks by four gives a component percentage. Time and space follow the same relative-rank rule. Expressions that cannot be mapped require review instead of a guessed rank.</w:t>
+        <w:t>Let the submitted and target ranks be rₛ and rₜ, indexed from one, and let L be the number of buckets. The penalty is twenty-five times max(0, rₛ minus rₜ) divided by max(1, L minus rₜ). Subtracting it from twenty-five, clipping to zero through twenty-five, and rounding to three decimal places gives component marks. Multiplying those marks by four gives a percentage. Time and space follow this relative-rank rule. Unmappable expressions require review instead of a guessed rank.</w:t>
       </w:r>
     </w:p>
     <w:p>
@@ -463,7 +463,7 @@
         <w:pStyle w:val="BodyText"/>
       </w:pPr>
       <w:r>
-        <w:t>Table I gives the default rubric. With every component expressed as a percentage, the weighted quality score and the unrounded final policy are given by (2). Instructors may specify nonnegative question or assignment-context weights totaling one hundred percent. The correctness ceiling remains mandatory. The selected weights and policy version are stored with the submission and cannot silently change when a question is edited later.</w:t>
+        <w:t>Table I gives the default rubric. T, M, and Y denote time, space, and style percentages, respectively; C is observed correctness. The weighted quality score and unrounded final policy are given by (2). Instructors may specify nonnegative question or assignment-context weights totaling one hundred percent. The correctness ceiling remains mandatory. Selected weights and the policy version are stored with the submission and cannot silently change when a question is edited later.</w:t>
       </w:r>
     </w:p>
     <w:p>
@@ -1184,7 +1184,7 @@
         <w:pStyle w:val="BodyText"/>
       </w:pPr>
       <w:r>
-        <w:t>The backend suite passed 333 tests, the projection interface passed nine rendering checks, and frontend lint and production build completed successfully. Tests cover rubric arithmetic, incomplete evidence, privacy, stale projection requests, alignment rejection, interface states, and related API behavior. Optional provider responses are mocked where needed. These are software regression results, not 342 independently sampled learner assessments or a percentage accuracy measure.</w:t>
+        <w:t>The backend suite passed 333 tests, projection rendering passed nine checks, and frontend lint and build passed. Coverage includes arithmetic, incomplete evidence, privacy, stale requests, alignment rejection, and API behavior. Optional provider responses are mocked where needed. These counts establish regression behavior, not grading accuracy.</w:t>
       </w:r>
     </w:p>
     <w:p>
@@ -1815,15 +1815,15 @@
         <w:pStyle w:val="BodyText"/>
       </w:pPr>
       <w:r>
-        <w:t>The pilot comprises twenty original AI-assisted synthetic function snippets: four variants in each of Python, C, C++, Java, and JavaScript. The variants cover direct summation, deliberately repeated summation, linear search, and binary search, belonging to only two original problem groups. Function inputs are supplied by the caller; the review convention is worst-case time and auxiliary space excluding those inputs, with unit-cost arithmetic assumptions. The snippets are not a representative sample of student programs or twenty independent problems.</w:t>
-      </w:r>
-    </w:p>
-    <w:p>
-      <w:pPr>
-        <w:pStyle w:val="BodyText"/>
-      </w:pPr>
-      <w:r>
-        <w:t>Two externally supplied review files proposed labels for every canonical solution identifier. They self-report model identities, but model settings, prompts, and independence were not verified. Their provenance remains AI-assisted and unverified. We preserved the original files and source hashes, reconciled identifier-based associations, and recorded discrepancies in returned source ending newlines, hash assertions, and replaced problem-group identifiers. We did not reinterpret these files as human expert reviews or invent instructor grades.</w:t>
+        <w:t>The pilot comprises twenty original AI-assisted synthetic function snippets: four variants in each of Python, C, C++, Java, and JavaScript. The variants cover direct summation, deliberately repeated summation, linear search, and binary search, belonging to only two original problem groups. Search inputs are sorted ascending arrays. Function inputs are supplied by the caller; the review convention is worst-case time and auxiliary space excluding those inputs, with unit-cost arithmetic assumptions. The snippets are not a representative sample of student programs or twenty independent problems.</w:t>
+      </w:r>
+    </w:p>
+    <w:p>
+      <w:pPr>
+        <w:pStyle w:val="BodyText"/>
+      </w:pPr>
+      <w:r>
+        <w:t>Two externally supplied files proposed labels for every canonical solution identifier. Model identities, settings, prompts, and independence were not verified. Their provenance remains AI-assisted and unverified. We preserved the original files, used canonical source hashes and problem groups, and recorded returned metadata discrepancies. Neither file supplies human expert reviews or instructor grades.</w:t>
       </w:r>
     </w:p>
     <w:p>
@@ -2920,15 +2920,23 @@
         </w:numPr>
       </w:pPr>
       <w:r>
-        <w:t>D. Interpreting Sensitivity and Coverage</w:t>
-      </w:r>
-    </w:p>
-    <w:p>
-      <w:pPr>
-        <w:pStyle w:val="BodyText"/>
-      </w:pPr>
-      <w:r>
-        <w:t>Table IV reports selected audit scenarios. With perfect non-correctness components, seventy-five percent correctness yields the same seventy-five-point ceiling under all three policies. When correctness is complete but time and space percentages are fifty and style is eighty, the default yields 68.0, equal weighting yields 70.0, and the correctness-heavier policy yields 73.0. These differences show which preferences each policy encodes; a higher arithmetic total is not evidence of a better educational rubric.</w:t>
+        <w:t>D. Controlled Comparison of Correctness Constraints</w:t>
+      </w:r>
+    </w:p>
+    <w:p>
+      <w:pPr>
+        <w:pStyle w:val="BodyText"/>
+      </w:pPr>
+      <w:r>
+        <w:t>To isolate the correctness constraint from weight selection, we hold component vectors and weights fixed across four rules: weighted-only Q, a fixed cap min(Q, 79) when C is below one hundred, multiplicative scaling Q times C divided by one hundred, and min(Q, C). We reuse the twenty-eight-scenario audit grid: seven correctness levels (zero, twenty-five, fifty, seventy-five, ninety, ninety-nine, and one hundred), crossed with four time/space/style triples: 100/100/100, 50/100/80, 100/50/80, and 50/50/80. Three C/T/M/Y profiles (30/35/25/10, 25/25/25/25, and 40/30/20/10) produce eighty-four configurations per rule. This is a synthetic mechanism experiment, not sampled instructor grades.</w:t>
+      </w:r>
+    </w:p>
+    <w:p>
+      <w:pPr>
+        <w:pStyle w:val="BodyText"/>
+      </w:pPr>
+      <w:r>
+        <w:t>The violation metric is an unrounded mark greater than C, with a numerical tolerance of one billionth. Table IV shows forty-nine violations for weighted-only aggregation and forty-three for the fixed cap. Both also award nonzero marks in all twelve zero-correctness configurations. Multiplication and the ceiling have no violations. The comparator uses the current weights to isolate the cap's effect; it does not reproduce all historical application settings. The reproducible experiment is frozen at commit 7ddc4aa, while the application snapshot remains d4cdb86.</w:t>
       </w:r>
     </w:p>
     <w:p>
@@ -2941,7 +2949,7 @@
         <w:spacing w:before="100" w:after="80"/>
       </w:pPr>
       <w:r>
-        <w:t>TABLE IV. SYNTHETIC WEIGHT SENSITIVITY</w:t>
+        <w:t>TABLE IV. CONTROLLED SCORING RULE COMPARISON</w:t>
       </w:r>
     </w:p>
     <w:tbl>
@@ -2959,10 +2967,9 @@
         </w:tblBorders>
       </w:tblPr>
       <w:tblGrid>
-        <w:gridCol w:w="1800"/>
-        <w:gridCol w:w="994"/>
-        <w:gridCol w:w="936"/>
-        <w:gridCol w:w="1080"/>
+        <w:gridCol w:w="2160"/>
+        <w:gridCol w:w="1051"/>
+        <w:gridCol w:w="1598"/>
       </w:tblGrid>
       <w:tr>
         <w:trPr>
@@ -2971,7 +2978,7 @@
         </w:trPr>
         <w:tc>
           <w:tcPr>
-            <w:tcW w:type="dxa" w:w="1800"/>
+            <w:tcW w:type="dxa" w:w="2160"/>
             <w:shd w:fill="EEEEEE"/>
             <w:tcMar>
               <w:top w:w="55" w:type="dxa"/>
@@ -2994,13 +3001,13 @@
                 <w:b/>
                 <w:sz w:val="16"/>
               </w:rPr>
-              <w:t>C/T/M/Y</w:t>
-            </w:r>
-          </w:p>
-        </w:tc>
-        <w:tc>
-          <w:tcPr>
-            <w:tcW w:type="dxa" w:w="994"/>
+              <w:t>Rule</w:t>
+            </w:r>
+          </w:p>
+        </w:tc>
+        <w:tc>
+          <w:tcPr>
+            <w:tcW w:type="dxa" w:w="1051"/>
             <w:shd w:fill="EEEEEE"/>
             <w:tcMar>
               <w:top w:w="55" w:type="dxa"/>
@@ -3023,13 +3030,15 @@
                 <w:b/>
                 <w:sz w:val="16"/>
               </w:rPr>
-              <w:t>Default</w:t>
-            </w:r>
-          </w:p>
-        </w:tc>
-        <w:tc>
-          <w:tcPr>
-            <w:tcW w:type="dxa" w:w="936"/>
+              <w:t>Mark &gt; C</w:t>
+              <w:br/>
+              <w:t>(of 84)</w:t>
+            </w:r>
+          </w:p>
+        </w:tc>
+        <w:tc>
+          <w:tcPr>
+            <w:tcW w:type="dxa" w:w="1598"/>
             <w:shd w:fill="EEEEEE"/>
             <w:tcMar>
               <w:top w:w="55" w:type="dxa"/>
@@ -3052,36 +3061,9 @@
                 <w:b/>
                 <w:sz w:val="16"/>
               </w:rPr>
-              <w:t>Equal</w:t>
-            </w:r>
-          </w:p>
-        </w:tc>
-        <w:tc>
-          <w:tcPr>
-            <w:tcW w:type="dxa" w:w="1080"/>
-            <w:shd w:fill="EEEEEE"/>
-            <w:tcMar>
-              <w:top w:w="55" w:type="dxa"/>
-              <w:left w:w="55" w:type="dxa"/>
-              <w:bottom w:w="55" w:type="dxa"/>
-              <w:right w:w="55" w:type="dxa"/>
-            </w:tcMar>
-          </w:tcPr>
-          <w:p>
-            <w:pPr>
-              <w:pStyle w:val="tablecopy"/>
-              <w:keepNext/>
-              <w:spacing w:after="20"/>
-              <w:ind w:firstLine="0"/>
-              <w:jc w:val="center"/>
-            </w:pPr>
-            <w:r>
-              <w:rPr>
-                <w:rFonts w:ascii="Times New Roman" w:hAnsi="Times New Roman"/>
-                <w:b/>
-                <w:sz w:val="16"/>
-              </w:rPr>
-              <w:t>C heavier</w:t>
+              <w:t>Nonzero at C = 0</w:t>
+              <w:br/>
+              <w:t>(of 12)</w:t>
             </w:r>
           </w:p>
         </w:tc>
@@ -3092,7 +3074,7 @@
         </w:trPr>
         <w:tc>
           <w:tcPr>
-            <w:tcW w:type="dxa" w:w="1800"/>
+            <w:tcW w:type="dxa" w:w="2160"/>
             <w:tcMar>
               <w:top w:w="55" w:type="dxa"/>
               <w:left w:w="55" w:type="dxa"/>
@@ -3114,13 +3096,13 @@
                 <w:b w:val="0"/>
                 <w:sz w:val="16"/>
               </w:rPr>
-              <w:t>75/100/100/100</w:t>
-            </w:r>
-          </w:p>
-        </w:tc>
-        <w:tc>
-          <w:tcPr>
-            <w:tcW w:type="dxa" w:w="994"/>
+              <w:t>Weighted only</w:t>
+            </w:r>
+          </w:p>
+        </w:tc>
+        <w:tc>
+          <w:tcPr>
+            <w:tcW w:type="dxa" w:w="1051"/>
             <w:tcMar>
               <w:top w:w="55" w:type="dxa"/>
               <w:left w:w="55" w:type="dxa"/>
@@ -3142,13 +3124,13 @@
                 <w:b w:val="0"/>
                 <w:sz w:val="16"/>
               </w:rPr>
-              <w:t>75.0</w:t>
-            </w:r>
-          </w:p>
-        </w:tc>
-        <w:tc>
-          <w:tcPr>
-            <w:tcW w:type="dxa" w:w="936"/>
+              <w:t>49</w:t>
+            </w:r>
+          </w:p>
+        </w:tc>
+        <w:tc>
+          <w:tcPr>
+            <w:tcW w:type="dxa" w:w="1598"/>
             <w:tcMar>
               <w:top w:w="55" w:type="dxa"/>
               <w:left w:w="55" w:type="dxa"/>
@@ -3170,35 +3152,7 @@
                 <w:b w:val="0"/>
                 <w:sz w:val="16"/>
               </w:rPr>
-              <w:t>75.0</w:t>
-            </w:r>
-          </w:p>
-        </w:tc>
-        <w:tc>
-          <w:tcPr>
-            <w:tcW w:type="dxa" w:w="1080"/>
-            <w:tcMar>
-              <w:top w:w="55" w:type="dxa"/>
-              <w:left w:w="55" w:type="dxa"/>
-              <w:bottom w:w="55" w:type="dxa"/>
-              <w:right w:w="55" w:type="dxa"/>
-            </w:tcMar>
-          </w:tcPr>
-          <w:p>
-            <w:pPr>
-              <w:pStyle w:val="tablecopy"/>
-              <w:keepNext/>
-              <w:spacing w:after="20"/>
-              <w:ind w:firstLine="0"/>
-              <w:jc w:val="center"/>
-            </w:pPr>
-            <w:r>
-              <w:rPr>
-                <w:rFonts w:ascii="Times New Roman" w:hAnsi="Times New Roman"/>
-                <w:b w:val="0"/>
-                <w:sz w:val="16"/>
-              </w:rPr>
-              <w:t>75.0</w:t>
+              <w:t>12</w:t>
             </w:r>
           </w:p>
         </w:tc>
@@ -3209,7 +3163,7 @@
         </w:trPr>
         <w:tc>
           <w:tcPr>
-            <w:tcW w:type="dxa" w:w="1800"/>
+            <w:tcW w:type="dxa" w:w="2160"/>
             <w:tcMar>
               <w:top w:w="55" w:type="dxa"/>
               <w:left w:w="55" w:type="dxa"/>
@@ -3231,13 +3185,13 @@
                 <w:b w:val="0"/>
                 <w:sz w:val="16"/>
               </w:rPr>
-              <w:t>90/50/50/80</w:t>
-            </w:r>
-          </w:p>
-        </w:tc>
-        <w:tc>
-          <w:tcPr>
-            <w:tcW w:type="dxa" w:w="994"/>
+              <w:t>Fixed cap 79</w:t>
+            </w:r>
+          </w:p>
+        </w:tc>
+        <w:tc>
+          <w:tcPr>
+            <w:tcW w:type="dxa" w:w="1051"/>
             <w:tcMar>
               <w:top w:w="55" w:type="dxa"/>
               <w:left w:w="55" w:type="dxa"/>
@@ -3259,13 +3213,13 @@
                 <w:b w:val="0"/>
                 <w:sz w:val="16"/>
               </w:rPr>
-              <w:t>65.0</w:t>
-            </w:r>
-          </w:p>
-        </w:tc>
-        <w:tc>
-          <w:tcPr>
-            <w:tcW w:type="dxa" w:w="936"/>
+              <w:t>43</w:t>
+            </w:r>
+          </w:p>
+        </w:tc>
+        <w:tc>
+          <w:tcPr>
+            <w:tcW w:type="dxa" w:w="1598"/>
             <w:tcMar>
               <w:top w:w="55" w:type="dxa"/>
               <w:left w:w="55" w:type="dxa"/>
@@ -3287,35 +3241,7 @@
                 <w:b w:val="0"/>
                 <w:sz w:val="16"/>
               </w:rPr>
-              <w:t>67.5</w:t>
-            </w:r>
-          </w:p>
-        </w:tc>
-        <w:tc>
-          <w:tcPr>
-            <w:tcW w:type="dxa" w:w="1080"/>
-            <w:tcMar>
-              <w:top w:w="55" w:type="dxa"/>
-              <w:left w:w="55" w:type="dxa"/>
-              <w:bottom w:w="55" w:type="dxa"/>
-              <w:right w:w="55" w:type="dxa"/>
-            </w:tcMar>
-          </w:tcPr>
-          <w:p>
-            <w:pPr>
-              <w:pStyle w:val="tablecopy"/>
-              <w:keepNext/>
-              <w:spacing w:after="20"/>
-              <w:ind w:firstLine="0"/>
-              <w:jc w:val="center"/>
-            </w:pPr>
-            <w:r>
-              <w:rPr>
-                <w:rFonts w:ascii="Times New Roman" w:hAnsi="Times New Roman"/>
-                <w:b w:val="0"/>
-                <w:sz w:val="16"/>
-              </w:rPr>
-              <w:t>69.0</w:t>
+              <w:t>12</w:t>
             </w:r>
           </w:p>
         </w:tc>
@@ -3326,7 +3252,96 @@
         </w:trPr>
         <w:tc>
           <w:tcPr>
-            <w:tcW w:type="dxa" w:w="1800"/>
+            <w:tcW w:type="dxa" w:w="2160"/>
+            <w:tcMar>
+              <w:top w:w="55" w:type="dxa"/>
+              <w:left w:w="55" w:type="dxa"/>
+              <w:bottom w:w="55" w:type="dxa"/>
+              <w:right w:w="55" w:type="dxa"/>
+            </w:tcMar>
+          </w:tcPr>
+          <w:p>
+            <w:pPr>
+              <w:pStyle w:val="tablecopy"/>
+              <w:keepNext/>
+              <w:spacing w:after="20"/>
+              <w:ind w:firstLine="0"/>
+              <w:jc w:val="left"/>
+            </w:pPr>
+            <w:r>
+              <w:rPr>
+                <w:rFonts w:ascii="Times New Roman" w:hAnsi="Times New Roman"/>
+                <w:b w:val="0"/>
+                <w:sz w:val="16"/>
+              </w:rPr>
+              <w:t>Multiplicative scaling</w:t>
+            </w:r>
+          </w:p>
+        </w:tc>
+        <w:tc>
+          <w:tcPr>
+            <w:tcW w:type="dxa" w:w="1051"/>
+            <w:tcMar>
+              <w:top w:w="55" w:type="dxa"/>
+              <w:left w:w="55" w:type="dxa"/>
+              <w:bottom w:w="55" w:type="dxa"/>
+              <w:right w:w="55" w:type="dxa"/>
+            </w:tcMar>
+          </w:tcPr>
+          <w:p>
+            <w:pPr>
+              <w:pStyle w:val="tablecopy"/>
+              <w:keepNext/>
+              <w:spacing w:after="20"/>
+              <w:ind w:firstLine="0"/>
+              <w:jc w:val="center"/>
+            </w:pPr>
+            <w:r>
+              <w:rPr>
+                <w:rFonts w:ascii="Times New Roman" w:hAnsi="Times New Roman"/>
+                <w:b w:val="0"/>
+                <w:sz w:val="16"/>
+              </w:rPr>
+              <w:t>0</w:t>
+            </w:r>
+          </w:p>
+        </w:tc>
+        <w:tc>
+          <w:tcPr>
+            <w:tcW w:type="dxa" w:w="1598"/>
+            <w:tcMar>
+              <w:top w:w="55" w:type="dxa"/>
+              <w:left w:w="55" w:type="dxa"/>
+              <w:bottom w:w="55" w:type="dxa"/>
+              <w:right w:w="55" w:type="dxa"/>
+            </w:tcMar>
+          </w:tcPr>
+          <w:p>
+            <w:pPr>
+              <w:pStyle w:val="tablecopy"/>
+              <w:keepNext/>
+              <w:spacing w:after="20"/>
+              <w:ind w:firstLine="0"/>
+              <w:jc w:val="center"/>
+            </w:pPr>
+            <w:r>
+              <w:rPr>
+                <w:rFonts w:ascii="Times New Roman" w:hAnsi="Times New Roman"/>
+                <w:b w:val="0"/>
+                <w:sz w:val="16"/>
+              </w:rPr>
+              <w:t>0</w:t>
+            </w:r>
+          </w:p>
+        </w:tc>
+      </w:tr>
+      <w:tr>
+        <w:trPr>
+          <w:cantSplit/>
+        </w:trPr>
+        <w:tc>
+          <w:tcPr>
+            <w:tcW w:type="dxa" w:w="2160"/>
             <w:tcMar>
               <w:top w:w="55" w:type="dxa"/>
               <w:left w:w="55" w:type="dxa"/>
@@ -3348,13 +3363,13 @@
                 <w:b w:val="0"/>
                 <w:sz w:val="16"/>
               </w:rPr>
-              <w:t>100/50/50/80</w:t>
-            </w:r>
-          </w:p>
-        </w:tc>
-        <w:tc>
-          <w:tcPr>
-            <w:tcW w:type="dxa" w:w="994"/>
+              <w:t>Correctness ceiling</w:t>
+            </w:r>
+          </w:p>
+        </w:tc>
+        <w:tc>
+          <w:tcPr>
+            <w:tcW w:type="dxa" w:w="1051"/>
             <w:tcMar>
               <w:top w:w="55" w:type="dxa"/>
               <w:left w:w="55" w:type="dxa"/>
@@ -3376,13 +3391,13 @@
                 <w:b w:val="0"/>
                 <w:sz w:val="16"/>
               </w:rPr>
-              <w:t>68.0</w:t>
-            </w:r>
-          </w:p>
-        </w:tc>
-        <w:tc>
-          <w:tcPr>
-            <w:tcW w:type="dxa" w:w="936"/>
+              <w:t>0</w:t>
+            </w:r>
+          </w:p>
+        </w:tc>
+        <w:tc>
+          <w:tcPr>
+            <w:tcW w:type="dxa" w:w="1598"/>
             <w:tcMar>
               <w:top w:w="55" w:type="dxa"/>
               <w:left w:w="55" w:type="dxa"/>
@@ -3404,35 +3419,7 @@
                 <w:b w:val="0"/>
                 <w:sz w:val="16"/>
               </w:rPr>
-              <w:t>70.0</w:t>
-            </w:r>
-          </w:p>
-        </w:tc>
-        <w:tc>
-          <w:tcPr>
-            <w:tcW w:type="dxa" w:w="1080"/>
-            <w:tcMar>
-              <w:top w:w="55" w:type="dxa"/>
-              <w:left w:w="55" w:type="dxa"/>
-              <w:bottom w:w="55" w:type="dxa"/>
-              <w:right w:w="55" w:type="dxa"/>
-            </w:tcMar>
-          </w:tcPr>
-          <w:p>
-            <w:pPr>
-              <w:pStyle w:val="tablecopy"/>
-              <w:keepNext w:val="0"/>
-              <w:spacing w:after="20"/>
-              <w:ind w:firstLine="0"/>
-              <w:jc w:val="center"/>
-            </w:pPr>
-            <w:r>
-              <w:rPr>
-                <w:rFonts w:ascii="Times New Roman" w:hAnsi="Times New Roman"/>
-                <w:b w:val="0"/>
-                <w:sz w:val="16"/>
-              </w:rPr>
-              <w:t>73.0</w:t>
+              <w:t>0</w:t>
             </w:r>
           </w:p>
         </w:tc>
@@ -3449,7 +3436,23 @@
         <w:pStyle w:val="BodyText"/>
       </w:pPr>
       <w:r>
-        <w:t>The ceiling's active region can be characterized directly. Write the weighted contribution of time, space, and style as B and the correctness weight as w. For w less than one, Q is at least C exactly when C is no larger than B divided by one minus w. Below that boundary the unrounded mark equals C; above it the weighted sum governs. For w equal to one, the mark always equals C. Thus reducing correctness's internal weight is not irrelevant merely because a ceiling exists: it can change grades and the boundary at which complexity improvement becomes visible.</w:t>
+        <w:t>Multiplication also respects the ceiling, because Q and C are each at most one hundred. It is no greater than either operand, and therefore no greater than min(Q, C). The proposed policy selects the largest mark compatible with both the weighted total and the stipulated correctness bound; it avoids another whole-score correctness discount. This is a declared partial-credit preference, not proof that multiplication is educationally inferior.</w:t>
+      </w:r>
+    </w:p>
+    <w:p>
+      <w:pPr>
+        <w:pStyle w:val="BodyText"/>
+      </w:pPr>
+      <w:r>
+        <w:t>With default weights and perfect remaining components, increasing C from ninety-nine to one hundred moves the fixed-cap mark from 79 to 100, whereas the ceiling moves from 99 to 100. Separately, at correctness 99.999, ordinary nearest-tenth rounding can display 100 even for min(Q, C); conservative rounding displays 99.9. We separate this presentation check from the unrounded comparison to avoid attributing a rounding difference to the constraint itself.</w:t>
+      </w:r>
+    </w:p>
+    <w:p>
+      <w:pPr>
+        <w:pStyle w:val="BodyText"/>
+      </w:pPr>
+      <w:r>
+        <w:t>Weights still matter. With complete correctness, time and space percentages of fifty, and style eighty, the default gives 68.0, equal weighting 70.0, and correctness-heavier weighting 73.0. Higher totals do not establish a better rubric. For correctness weight w below one and remaining weighted contribution B, the ceiling is active when C is no larger than B divided by one minus w. Reducing correctness's internal weight can therefore change both grades and the region where optimization becomes visible.</w:t>
       </w:r>
     </w:p>
     <w:p>
@@ -3458,6 +3461,25 @@
       </w:pPr>
       <w:r>
         <w:t>For future label studies, coverage should be the number of scoreable analyzer answers divided by the number of eligible programs. Exact agreement conditional on answering should use the answered-program denominator, with time, space, and joint counts reported separately. In this pilot, those denominators coincide at twenty; they will not coincide when the analyzer abstains. Keeping both metrics prevents a selective system from appearing accurate by silently omitting difficult programs.</w:t>
+      </w:r>
+    </w:p>
+    <w:p>
+      <w:pPr>
+        <w:pStyle w:val="Heading2"/>
+        <w:numPr>
+          <w:numId w:val="0"/>
+        </w:numPr>
+      </w:pPr>
+      <w:r>
+        <w:t>E. Reproducibility and Data Availability</w:t>
+      </w:r>
+    </w:p>
+    <w:p>
+      <w:pPr>
+        <w:pStyle w:val="BodyText"/>
+      </w:pPr>
+      <w:r>
+        <w:t>The twenty source fixtures are reproducible from the public, commit-pinned generator [9], including statements, assumptions, source hashes, and AI-assisted provenance. Model label files and the complete experiment package were retained locally, not publicly archived at preparation. Fixture access therefore does not establish full public reproducibility of label agreement. A final artifact release should identify source and label versions and exclude learner records, credentials, and private course cases.</w:t>
       </w:r>
     </w:p>
     <w:p>
@@ -3492,15 +3514,15 @@
         <w:pStyle w:val="BodyText"/>
       </w:pPr>
       <w:r>
-        <w:t>Feedback quality and alignment review also remain unvalidated by independent experts. A candidate can pass finite tests while being wrong on untested inputs, and a model can approve an unsupported explanation. The current guard reduces the conditions under which a projection is displayed but cannot make it a guaranteed learning outcome. The latest live-provider path has not been benchmarked for success rate or representative latency. The interface screenshot motivating a repair is not a controlled experiment.</w:t>
-      </w:r>
-    </w:p>
-    <w:p>
-      <w:pPr>
-        <w:pStyle w:val="BodyText"/>
-      </w:pPr>
-      <w:r>
-        <w:t>Before a broader efficacy claim, two qualified reviewers should independently label a diverse corpus, adjudicate disagreements, and preserve problem-level train/validation/test separation. Instructors should grade matched submissions while blinded to the platform total. Policy alternatives can then be compared using mean absolute grade error and agreement measures on held-out problems. Feedback evaluation should separately rate factuality, relevance, actionability, and private-data disclosure. Repeated warm and cold requests should report latency distributions and provider failures, rather than one convenient response time.</w:t>
+        <w:t>Feedback quality and alignment review remain unvalidated by independent experts. A candidate can pass finite tests yet fail on untested inputs, and a model can approve an unsupported explanation. The guard restricts projection eligibility without guaranteeing a learning outcome. Live-provider success rate and representative latency have not been benchmarked.</w:t>
+      </w:r>
+    </w:p>
+    <w:p>
+      <w:pPr>
+        <w:pStyle w:val="BodyText"/>
+      </w:pPr>
+      <w:r>
+        <w:t>Before broader efficacy claims, two qualified reviewers should label a diverse corpus and adjudicate disagreements with problem-level holdouts. Blinded instructor grades would permit comparisons of policy error and agreement. Feedback should be rated for factuality, relevance, actionability, and private-data disclosure. Repeated warm and cold requests should report latency distributions and provider failures.</w:t>
       </w:r>
     </w:p>
     <w:p>
@@ -3527,7 +3549,7 @@
         <w:pStyle w:val="BodyText"/>
       </w:pPr>
       <w:r>
-        <w:t>CodeVedha integrates execution evidence, structural resource estimates, deterministic style analysis, and optional AI guidance under an auditable assessment contract. A versioned correctness ceiling bounds the final grade, unavailable weighted evidence remains explicit, and measured candidate projections use the saved rubric without replacing fresh official assessment. Regression checks, eight live execution contracts, two candidate-score consistency checks, and an explicitly AI-assisted pilot support these implementation properties. The pilot also exposes a symbolic-bound limitation. Independent expert labels, instructor-grade validation, real-provider evaluation, and learning studies are required before claiming broader accuracy or educational benefit.</w:t>
+        <w:t>CodeVedha links execution evidence, resource estimates, style analysis, and optional AI guidance through an auditable assessment contract. Controlled comparison shows that a fixed failure cap does not enforce the chosen correctness bound. Both multiplication and a ceiling enforce it, while the ceiling preserves more partial credit under that declared policy. Execution contracts and candidate-score consistency checks support the implementation, and an explicitly AI-assisted pilot exposes a symbolic-bound limitation. Independent expert labels, instructor-grade validation, real-provider evaluation, and learning studies remain necessary for broader accuracy or educational claims.</w:t>
       </w:r>
     </w:p>
     <w:p>
@@ -3662,6 +3684,19 @@
       </w:pPr>
       <w:r>
         <w:t>[8] Tree-sitter Contributors, “Tree-sitter: An incremental parsing system for programming tools.” Accessed: Oct. 30, 2026. [Online]. Available: https://github.com/tree-sitter/tree-sitter</w:t>
+      </w:r>
+    </w:p>
+    <w:p>
+      <w:pPr>
+        <w:pStyle w:val="references"/>
+        <w:numPr>
+          <w:numId w:val="0"/>
+        </w:numPr>
+        <w:ind w:hanging="216" w:left="216"/>
+        <w:jc w:val="left"/>
+      </w:pPr>
+      <w:r>
+        <w:t>[9] CodeVedha Project, “Synthetic pilot review-pack generator,” CodeAssessment repository, commit 317152b, 2026. Accessed: Oct. 30, 2026. [Online]. Available: https://github.com/multiagentcodereview2026/CodeAssessment/blob/317152b/backend/analysis/build_research_review_pack.py</w:t>
       </w:r>
     </w:p>
     <w:p>

</xml_diff>

<commit_message>
Align final paper and handoff with tagged public evidence release
</commit_message>
<xml_diff>
--- a/docs/research-paper/CodeVedha_EmergIN2027_Paper.docx
+++ b/docs/research-paper/CodeVedha_EmergIN2027_Paper.docx
@@ -3479,7 +3479,7 @@
         <w:pStyle w:val="BodyText"/>
       </w:pPr>
       <w:r>
-        <w:t>The twenty source fixtures are reproducible from the public, commit-pinned generator [9], including statements, assumptions, source hashes, and AI-assisted provenance. Model label files and the complete experiment package were retained locally, not publicly archived at preparation. Fixture access therefore does not establish full public reproducibility of label agreement. A final artifact release should identify source and label versions and exclude learner records, credentials, and private course cases.</w:t>
+        <w:t>The tagged artifact release [9] provides twenty canonical source fixtures, normalized AI label proposals, provenance hashes, execution reports, frozen-snapshot test transcripts, and reproduction instructions. The tags paper-implementation-20261030 and paper-scoring-experiment-20261030 identify the cited implementation and comparison commits. Proposal aliases are not authenticated reviewer identities; raw review prose is excluded. Published labels retain AI-assisted unverified provenance. The release contains no learner database, credentials, or real private course cases. It supports reproduction of the reported synthetic results, not independent validation of the proposed labels.</w:t>
       </w:r>
     </w:p>
     <w:p>
@@ -3696,7 +3696,7 @@
         <w:jc w:val="left"/>
       </w:pPr>
       <w:r>
-        <w:t>[9] CodeVedha Project, “Synthetic pilot review-pack generator,” CodeAssessment repository, commit 317152b, 2026. Accessed: Oct. 30, 2026. [Online]. Available: https://github.com/multiagentcodereview2026/CodeAssessment/blob/317152b/backend/analysis/build_research_review_pack.py</w:t>
+        <w:t>[9] CodeVedha Project, “Paper evaluation artifacts and reproduction guide,” CodeAssessment repository, release paper-artifacts-20261030, 2026. Accessed: Oct. 30, 2026. [Online]. Available: https://github.com/multiagentcodereview2026/CodeAssessment/tree/paper-artifacts-20261030/docs/research-paper/artifacts</w:t>
       </w:r>
     </w:p>
     <w:p>

</xml_diff>

<commit_message>
Strengthen paper contribution and diagnostic evidence within six pages
</commit_message>
<xml_diff>
--- a/docs/research-paper/CodeVedha_EmergIN2027_Paper.docx
+++ b/docs/research-paper/CodeVedha_EmergIN2027_Paper.docx
@@ -135,7 +135,7 @@
         <w:pStyle w:val="Abstract"/>
       </w:pPr>
       <w:r>
-        <w:t>Abstract—Programming assessment must distinguish observed correctness, inferred resource complexity, and generated advice. CodeVedha combines isolated execution, structural analysis, deterministic style checks, and optional language model assistance under a versioned scoring contract. Its correctness ceiling limits the final grade by the fraction of evaluated cases passed, while missing weighted evidence remains explicit. A separate projection route generates a private candidate, reviews its alignment with displayed guidance, executes it, and measures its score using the saved rubric. We establish the ceiling invariant and compare four scoring rules on the same eighty-four component and weight configurations. Weighted aggregation alone exceeds observed correctness in forty-nine configurations; a fixed failure cap does so in forty-three. Both multiplicative scaling and the proposed ceiling have no unrounded violations, with different partial-credit behavior. Eight live execution contracts meet their expected outcomes, and candidate scores match fresh official scores under two weight configurations. A twenty-snippet AI-assisted pilot across five languages gives nineteen joint exact complexity-label matches with model proposals and identifies a symbolic-bound limitation. These results characterize policy behavior and implementation consistency. They do not establish expert grading accuracy, optimal weights, or educational benefit.</w:t>
+        <w:t>Abstract—Programming assessments can reward an efficient program even when it returns wrong answers, while AI feedback can promise gains that have never been tested. CodeVedha addresses both problems by separating observed correctness, inferred complexity, and advice. It combines isolated code execution with a versioned rubric whose final mark cannot exceed the percentage of evaluated cases passed. Instructors can change component weights without removing this constraint. An optional projection route executes a private candidate implementing the displayed guidance and scores it under the saved rubric. On 84 synthetic configurations per rule, weighted aggregation exceeded observed correctness in 49 cases and a fixed failure cap did so in 43; multiplication and the proposed ceiling had no unrounded violations. All eight live execution contracts met their expected outcomes, and candidate scores matched fresh assessments under two rubrics. A diagnostic set of 20 synthetic snippets exposed a failure to recognize equal loop dimensions. These findings support implementation consistency, not expert grading accuracy, optimal weights, or improved student learning.</w:t>
       </w:r>
     </w:p>
     <w:p>
@@ -170,15 +170,15 @@
         <w:pStyle w:val="BodyText"/>
       </w:pPr>
       <w:r>
-        <w:t>A complexity-focused course makes this separation particularly important. A fast program that returns incorrect answers should not receive unrestricted performance credit in its final mark. Conversely, increasing the correctness weight alone does not specify what should happen when performance evidence is unavailable. Generated revisions create another consistency problem: an anticipated gain is misleading if it comes from an assumed improvement, a different rubric, or an untested replacement algorithm.</w:t>
-      </w:r>
-    </w:p>
-    <w:p>
-      <w:pPr>
-        <w:pStyle w:val="BodyText"/>
-      </w:pPr>
-      <w:r>
-        <w:t>CodeVedha addresses these problems through explicit evidence boundaries. Students run public examples before submission; the server independently checks the submitted source before evaluating the full test suite. The report stores the execution result, complexity evidence, component scores, and rubric snapshot. Optional language model agents provide explanations and staged guidance, while correctness and score aggregation remain governed by explicit code. Instructor functions include assignments, enrollment, analytics, and review of similarity evidence.</w:t>
+        <w:t>Setting correctness to 100% would enforce a correctness-only grade, but it would give equally correct solutions the same mark regardless of their time, storage, or source quality. A complexity-focused course needs to distinguish those solutions. We therefore separate a mandatory correctness bound from the instructor's allocation of quality credit. The bound applies to every valid weight configuration, including zero internal correctness weight; changing weights through the supported interface cannot remove it. Efficiency can reduce the grade of a correct solution, but cannot lift an incorrect solution above its observed correctness. This is a policy distinction, not a claim that the minimum operator is a new mathematical result.</w:t>
+      </w:r>
+    </w:p>
+    <w:p>
+      <w:pPr>
+        <w:pStyle w:val="BodyText"/>
+      </w:pPr>
+      <w:r>
+        <w:t>CodeVedha addresses these problems through explicit evidence boundaries. Students run public examples before submission; the server independently checks the submitted source before evaluating the full test suite. The report stores the execution result, complexity evidence, component scores, and rubric snapshot. Optional language model agents provide explanations and staged guidance, while correctness and score aggregation remain governed by explicit code. Assignment access and due dates are enforced separately from independent practice.</w:t>
       </w:r>
     </w:p>
     <w:p>
@@ -226,6 +226,22 @@
     </w:p>
     <w:p>
       <w:pPr>
+        <w:pStyle w:val="BodyText"/>
+      </w:pPr>
+      <w:r>
+        <w:t>SPEED derives symbolic execution bounds using instrumentation and invariants [7]. Multivariate amortized resource analysis relates several input dimensions through a type-based framework with a soundness argument [8]. CodeVedha instead uses structural heuristics and optional model review; it does not claim comparable soundness or replace these inference methods. Its contribution concerns how uncertain estimates, execution evidence, and candidate scores enter an assessment.</w:t>
+      </w:r>
+    </w:p>
+    <w:p>
+      <w:pPr>
+        <w:pStyle w:val="BodyText"/>
+      </w:pPr>
+      <w:r>
+        <w:t>Jonsson and Svingby distinguish scoring reliability from validity and educational consequences [9]. Their review motivates explicit criteria and independent validation, not our exact numerical weights. Thus formal resource analysis addresses bound derivation, programming-feedback systems address learner advice, and CodeVedha studies the consistency of the grading and projection contract connecting these outputs. This positioning is conceptual; no comparative superiority experiment was conducted.</w:t>
+      </w:r>
+    </w:p>
+    <w:p>
+      <w:pPr>
         <w:pStyle w:val="Heading1"/>
         <w:numPr>
           <w:numId w:val="0"/>
@@ -251,15 +267,15 @@
         <w:pStyle w:val="BodyText"/>
       </w:pPr>
       <w:r>
-        <w:t>Figure 1 separates the official assessment route from the optional projection route. A React frontend communicates with a FastAPI backend, which persists accounts, assignment context, submissions, and assessment artifacts in PostgreSQL. The local deployment uses Docker Compose and a separate execution service. Supported execution languages are Python, C, C++, Java, and JavaScript. Source analysis, style assessment, aggregation, and optional model-assisted explanation are organized as specialized workflow steps; this modular organization does not itself establish superiority over a single model.</w:t>
-      </w:r>
-    </w:p>
-    <w:p>
-      <w:pPr>
-        <w:pStyle w:val="BodyText"/>
-      </w:pPr>
-      <w:r>
-        <w:t>The public run action compiles or interprets the current source and displays example verdicts. Submission eligibility is rechecked on the server against the exact source in the request. A browser flag or an earlier successful run cannot authorize different code. Full assessment then evaluates the configured public and private cases. Passing every evaluated case determines acceptance; an infrastructure outage is distinguished from a student compilation or execution failure. Assignment enrollment, instructor policy, and due-date checks precede execution for course work. Independent practice is stored separately from assignment context.</w:t>
+        <w:t>Figure 1 separates official assessment from optional projection. A React frontend communicates with a FastAPI backend and PostgreSQL storage; a separate container service executes Python, C, C++, Java, and JavaScript. The report persists execution results, complexity evidence, component scores, and the rubric used for that submission. Specialized workflow steps do not themselves establish superiority over a single model.</w:t>
+      </w:r>
+    </w:p>
+    <w:p>
+      <w:pPr>
+        <w:pStyle w:val="BodyText"/>
+      </w:pPr>
+      <w:r>
+        <w:t>Students must pass public examples before submission. The server rechecks eligibility against the exact submitted source, so a browser flag or an earlier successful run cannot authorize changed code. Full assessment evaluates configured public and private cases; passing all determines acceptance. Service outages are distinguished from student compilation or execution failures. Enrollment, instructor policy, and due dates are checked before course execution.</w:t>
       </w:r>
     </w:p>
     <w:p>
@@ -332,23 +348,23 @@
         <w:pStyle w:val="BodyText"/>
       </w:pPr>
       <w:r>
-        <w:t>Each problem must define an executable input contract. Human-readable examples containing labels or nested arrays cannot be assumed to be the bytes consumed by standard input. The execution fixtures include a nested-list contract with an outer count followed by a width and values for each row. For the endpoint-sharing Merge Intervals example, four pairs are serialized as an outer count of four, followed by four rows each prefixed by width two. A program that reads only the outer count and then pairs will consume those widths as data. Correct serialization and a matching parser are therefore prerequisites to judging an algorithm.</w:t>
-      </w:r>
-    </w:p>
-    <w:p>
-      <w:pPr>
-        <w:pStyle w:val="BodyText"/>
-      </w:pPr>
-      <w:r>
-        <w:t>The execution service writes the requested source into a disposable workspace, compiles it when required, and supplies each serialized case through standard input. Per-case results retain compilation status, exit behavior, standard output, standard error, and resource-limit outcomes. Output comparison first normalizes line endings and trailing whitespace, then supports structurally equal JSON, and finally compares whitespace-delimited tokens. It does not generally sort outputs or accept arbitrary numerical tolerances. Problem authors must use the supported output contract; order-insensitive and floating-point tasks may require dedicated comparators. These restrictions are important when interpreting apparent wrong answers.</w:t>
-      </w:r>
-    </w:p>
-    <w:p>
-      <w:pPr>
-        <w:pStyle w:val="BodyText"/>
-      </w:pPr>
-      <w:r>
-        <w:t>Runtime containers use a non-root user, disabled network access, a read-only root filesystem, bounded processes, CPU and memory limits, dropped capabilities, and no-new-privileges. Docker documents the relevant runtime controls [7]. These measures reduce exposure from submitted programs, but container isolation is not a formal security guarantee. Compiler setup, input/output processing, and container overhead must also be separated from an algorithmic complexity claim.</w:t>
+        <w:t>Human-readable labels and nested arrays must be serialized into a documented executable input format. Our nested-list fixtures use an outer count followed by each row's width and values. Thus four interval pairs arrive as count four and four width-two rows. A parser expecting only successive pairs consumes those widths as data. Serialization and parser agreement are prerequisites to judging the algorithm.</w:t>
+      </w:r>
+    </w:p>
+    <w:p>
+      <w:pPr>
+        <w:pStyle w:val="BodyText"/>
+      </w:pPr>
+      <w:r>
+        <w:t>The service compiles the requested source in a disposable workspace and supplies each case through standard input. Results retain compilation status, exit behavior, stdout, stderr, and resource-limit outcomes. Comparison normalizes line endings and trailing whitespace, accepts structurally equal JSON, and otherwise compares whitespace-delimited tokens. It does not generally sort output or apply numeric tolerances; some tasks need dedicated comparators.</w:t>
+      </w:r>
+    </w:p>
+    <w:p>
+      <w:pPr>
+        <w:pStyle w:val="BodyText"/>
+      </w:pPr>
+      <w:r>
+        <w:t>Runtime containers restrict user privileges, networking, filesystem writes, processes, CPU, and memory using Docker controls [10]. These precautions are not a formal security guarantee. Compilation and container overhead are not algorithmic complexity evidence.</w:t>
       </w:r>
     </w:p>
     <w:p>
@@ -367,47 +383,31 @@
         <w:pStyle w:val="BodyText"/>
       </w:pPr>
       <w:r>
-        <w:t>The structural analyzer inspects loop bounds, nesting, recognized operations, function structure, and allocation patterns. Tree-sitter supplies syntax structure [8]; syntax alone does not prove asymptotic cost. The platform records estimated time and space expressions, confidence, method, status, and supporting signals. Complete structural results at or above the configured direct threshold, 0.85 by default, can proceed without an optional model review. This threshold is an engineering heuristic, not a calibrated probability of correctness.</w:t>
-      </w:r>
-    </w:p>
-    <w:p>
-      <w:pPr>
-        <w:pStyle w:val="BodyText"/>
-      </w:pPr>
-      <w:r>
-        <w:t>For weaker evidence, the pipeline can consider observational runtime growth and an enabled AI review. Sparse or noisy observations must not be presented as controlled asymptotic experiments. The production merge preserves existing structural expressions when an AI estimate disagrees, marks unresolved evidence for review, and permits filling genuinely missing fields under the configured policy. Private target complexities are used only by backend scoring; they are not supplied as answers to the reviewer. Missing or unmappable estimates do not receive invented full marks.</w:t>
-      </w:r>
-    </w:p>
-    <w:p>
-      <w:pPr>
-        <w:pStyle w:val="BodyText"/>
-      </w:pPr>
-      <w:r>
-        <w:t>Time and space percentages are obtained by comparing the inferred expression with a curated problem target on a finite scoring ladder. The ten ordered buckets are constant, logarithmic, square-root, linear, linearithmic, quadratic, cubic, fourth-degree-or-higher polynomial, exponential, and factorial. Displayed multivariate expressions are retained, while a deterministic projection maps them onto the scoring ladder. This projection is a grading convention, not a universal equivalence of complexity functions. Incorrect targets or inappropriate dimension assumptions can bias the mark.</w:t>
-      </w:r>
-    </w:p>
-    <w:p>
-      <w:pPr>
-        <w:pStyle w:val="BodyText"/>
-      </w:pPr>
-      <w:r>
-        <w:t>Let the submitted and target ranks be rₛ and rₜ, indexed from one, and let L be the number of buckets. The penalty is twenty-five times max(0, rₛ minus rₜ) divided by max(1, L minus rₜ). Subtracting it from twenty-five, clipping to zero through twenty-five, and rounding to three decimal places gives component marks. Multiplying those marks by four gives a percentage. Time and space follow this relative-rank rule. Unmappable expressions require review instead of a guessed rank.</w:t>
-      </w:r>
-    </w:p>
-    <w:p>
-      <w:pPr>
-        <w:pStyle w:val="BodyText"/>
-      </w:pPr>
-      <w:r>
-        <w:t>Space conventions require particular care. In a function-level snippet, a supplied input array can be excluded from auxiliary storage. In a complete standard-input program, an input-sized container allocated by the submitted program counts under the platform's storage policy. Accordingly, the pilot labels and executable fixtures must record their interface and storage convention rather than silently mixing the two.</w:t>
-      </w:r>
-    </w:p>
-    <w:p>
-      <w:pPr>
-        <w:pStyle w:val="BodyText"/>
-      </w:pPr>
-      <w:r>
-        <w:t>Style is evaluated by deterministic source checks covering naming, readability, modularity, and maintainability. Each category contributes at most twenty-five points to a percentage score. The checks remove comments before evaluation, so missing comments alone do not lower the style score. Findings are heuristics rather than expert aesthetic judgments. Instructor similarity groups are review evidence and do not contribute to a student's numeric grade or establish misconduct.</w:t>
+        <w:t>The analyzer uses Tree-sitter syntax [11], loop bounds, nesting, recognized operations, and allocation patterns. It records expressions, heuristic confidence, method, status, and supporting signals. Complete structural results at the default direct threshold of 0.85 can proceed without optional model review. This confidence is not a calibrated probability of correctness. For weaker evidence, observational runtime growth and enabled AI review may contribute; sparse timings do not establish asymptotic bounds. Conflicting AI estimates do not silently replace existing structural expressions. Private target complexities stay in backend scoring, and missing estimates do not receive invented full marks.</w:t>
+      </w:r>
+    </w:p>
+    <w:p>
+      <w:pPr>
+        <w:pStyle w:val="BodyText"/>
+      </w:pPr>
+      <w:r>
+        <w:t>Time and space percentages compare inferred expressions with curated target ranks on ten ordered buckets: constant, logarithmic, square-root, linear, linearithmic, quadratic, cubic, fourth-degree-or-higher polynomial, exponential, and factorial. Multivariate expressions remain visible, although scoring projects them onto this finite ladder. This is a grading convention, not universal equivalence of complexity functions; incorrect targets or dimension assumptions can bias marks.</w:t>
+      </w:r>
+    </w:p>
+    <w:p>
+      <w:pPr>
+        <w:pStyle w:val="BodyText"/>
+      </w:pPr>
+      <w:r>
+        <w:t>For submitted rank rₛ, target rank rₜ, and L buckets, the penalty is 25 max(0, rₛ − rₜ) / max(1, L − rₜ). Subtracting it from 25, clipping to [0, 25], and rounding to three decimals gives component marks; multiplying by four gives the percentage. Both resource components follow this rule. Unmappable expressions require review.</w:t>
+      </w:r>
+    </w:p>
+    <w:p>
+      <w:pPr>
+        <w:pStyle w:val="BodyText"/>
+      </w:pPr>
+      <w:r>
+        <w:t>Storage conventions depend on the interface: a supplied function input is excluded from auxiliary space, whereas an input-sized container allocated by a submitted standard-input program counts under the platform policy. Deterministic style checks cover naming, readability, modularity, and maintainability, each contributing up to 25 percentage points. Comments are removed before checking, so missing comments alone do not reduce style. These findings are heuristics, not expert aesthetic judgments.</w:t>
       </w:r>
     </w:p>
     <w:p>
@@ -1088,122 +1088,15 @@
         <w:pStyle w:val="BodyText"/>
       </w:pPr>
       <w:r>
-        <w:t>Feedback prioritizes compilation and observed correctness issues before efficiency or style. The report can display a failed public case or intentionally reveal one failed private case as a learning example. Remaining private case data are redacted from learner responses. This is an explicit disclosure policy, not a claim that every private case remains secret. Repeated submissions may expose additional information; deployment policy must account for this tradeoff.</w:t>
-      </w:r>
-    </w:p>
-    <w:p>
-      <w:pPr>
-        <w:pStyle w:val="BodyText"/>
-      </w:pPr>
-      <w:r>
-        <w:t>The default guided workflow asks the learner to implement one scoped change. Stages distinguish foundational repairs, algorithmic correctness, local optimization, data-structure changes, space optimization, and refinement. Guidance is available independently of score projection. It is not a replacement submission, and instructor policies can restrict access to hints or explanations.</w:t>
-      </w:r>
-    </w:p>
-    <w:p>
-      <w:pPr>
-        <w:pStyle w:val="BodyText"/>
-      </w:pPr>
-      <w:r>
-        <w:t>A private candidate generator receives the learner's source, public problem context, stage, and the exact displayed guidance. A separate AI-assisted review examines whether the advice is supported by source operations, whether the candidate implements the material actions, and whether it preserves stage scope. Unsupported claims such as inferring cubic time solely from nested containers should be rejected. Missing evidence or an inconclusive review withholds the projection. Because this remains a model judgment, it is not a formal equivalence or complexity proof.</w:t>
-      </w:r>
-    </w:p>
-    <w:p>
-      <w:pPr>
-        <w:pStyle w:val="BodyText"/>
-      </w:pPr>
-      <w:r>
-        <w:t>Only an eligible candidate proceeds to execution on all configured cases. Every evaluated case must pass, and the weighted assessment must be complete. Its measured score is recomputed with the original submission's saved rubric. Equation (4) defines the displayed difference. This value belongs to the private candidate, not to whatever code the learner may later write. A new learner submission is executed and assessed afresh; cached projection evidence cannot override its official result.</w:t>
-      </w:r>
-    </w:p>
-    <w:p>
-      <w:pPr>
-        <w:pStyle w:val="BodyText"/>
-        <w:ind w:firstLine="0"/>
-        <w:jc w:val="center"/>
-      </w:pPr>
-      <m:oMath>
-        <m:r>
-          <m:t xml:space="preserve">Δ = S(candidate) − S(saved submission).</m:t>
-        </m:r>
-      </m:oMath>
-      <w:r>
-        <w:rPr>
-          <w:sz w:val="18"/>
-        </w:rPr>
-        <w:t xml:space="preserve">   (4)</w:t>
-      </w:r>
-    </w:p>
-    <w:p>
-      <w:pPr>
-        <w:pStyle w:val="BodyText"/>
-      </w:pPr>
-      <w:r>
-        <w:t>The interface distinguishes checking, slower verification, paused status refresh, measured improvement, verified no increase, and unavailable verification. A completed zero or negative difference is retained as an outcome instead of triggering a fabricated positive gain. An expandable table shows component percentages, weights, and weighted contributions. A separate explicit retry can request fresh verification, while Check again resumes reading saved status without generating another candidate.</w:t>
-      </w:r>
-    </w:p>
-    <w:p>
-      <w:pPr>
-        <w:pStyle w:val="BodyText"/>
-      </w:pPr>
-      <w:r>
-        <w:t>Background requests use bounded retries, persisted attempt counts, and request identifiers to avoid stale work replacing a newer stage. Candidate source and private assessment metadata remain server-side. Audit matching includes source fingerprints and evaluation context, including rubric and test configuration. The extra generation and alignment-review steps can increase waiting time; no live-provider latency or success-rate claim is established by the controlled tests below.</w:t>
-      </w:r>
-    </w:p>
-    <w:p>
-      <w:pPr>
-        <w:pStyle w:val="Heading1"/>
-        <w:numPr>
-          <w:numId w:val="0"/>
-        </w:numPr>
-      </w:pPr>
-      <w:r>
-        <w:t>VI. Verification Method and Results</w:t>
-      </w:r>
-    </w:p>
-    <w:p>
-      <w:pPr>
-        <w:pStyle w:val="Heading2"/>
-        <w:numPr>
-          <w:numId w:val="0"/>
-        </w:numPr>
-      </w:pPr>
-      <w:r>
-        <w:t>A. Frozen Implementation and Research Questions</w:t>
-      </w:r>
-    </w:p>
-    <w:p>
-      <w:pPr>
-        <w:pStyle w:val="BodyText"/>
-      </w:pPr>
-      <w:r>
-        <w:t>The implementation snapshot is Git commit d4cdb86, with rubric version complexity-focused-v2 and guidance version six, verified on 30 October 2026. Its source and prompt manifest records SHA-256 values, allowed configuration, Python 3.11.16, Linux x86-64, and twelve reported logical processors. Credentials and database contents are excluded. The evidence separates three questions: whether execution and scoring contracts hold; whether static complexity labels agree with supplied AI proposals; and which findings remain insufficient for human grading or educational claims.</w:t>
-      </w:r>
-    </w:p>
-    <w:p>
-      <w:pPr>
-        <w:pStyle w:val="BodyText"/>
-      </w:pPr>
-      <w:r>
-        <w:t>The backend suite passed 333 tests, projection rendering passed nine checks, and frontend lint and build passed. Coverage includes arithmetic, incomplete evidence, privacy, stale requests, alignment rejection, and API behavior. Optional provider responses are mocked where needed. These counts establish regression behavior, not grading accuracy.</w:t>
-      </w:r>
-    </w:p>
-    <w:p>
-      <w:pPr>
-        <w:pStyle w:val="Heading2"/>
-        <w:numPr>
-          <w:numId w:val="0"/>
-        </w:numPr>
-      </w:pPr>
-      <w:r>
-        <w:t>B. Live Execution and Score Contracts</w:t>
-      </w:r>
-    </w:p>
-    <w:p>
-      <w:pPr>
-        <w:pStyle w:val="BodyText"/>
-      </w:pPr>
-      <w:r>
-        <w:t>Eight live execution checks used original synthetic programs and three inputs per check. Table II summarizes the matrix. Sum programs passed positive, negative, and zero inputs in all five languages. C++ Merge Intervals passed endpoint-sharing, unsorted overlapping, and nested-interval fixtures under the documented row-width contract. A changed incorrect source failed all three cases, and restoring the correct source passed again. Thus all eight checks met their expected outcomes; the intentionally incorrect program is not counted as a successful solution.</w:t>
+        <w:t>Feedback prioritizes compilation and observed correctness before efficiency or style. The report can show a failed public case or intentionally reveal one failed private case as a learning example; remaining private details are redacted. Repeated submissions can disclose additional cases, a deployment tradeoff rather than a secrecy guarantee. Guided stages ask the learner to implement one scoped repair or improvement; instructor policy may restrict assistance.</w:t>
+      </w:r>
+    </w:p>
+    <w:p>
+      <w:pPr>
+        <w:pStyle w:val="BodyText"/>
+      </w:pPr>
+      <w:r>
+        <w:t>Projection is a separate, optional measurement. A private candidate generator receives source, public context, stage, and exact displayed guidance. An AI-assisted review checks whether the advice is supported, the candidate implements its material actions, and the stage scope is preserved. This is model judgment, not a proof of equivalence. Table II summarizes the eligibility gates and observable outcomes.</w:t>
       </w:r>
     </w:p>
     <w:p>
@@ -1216,7 +1109,505 @@
         <w:spacing w:before="100" w:after="80"/>
       </w:pPr>
       <w:r>
-        <w:t>TABLE II. LIVE SYNTHETIC EXECUTION CONTRACTS</w:t>
+        <w:t>TABLE II. CANDIDATE PROJECTION DECISIONS</w:t>
+      </w:r>
+    </w:p>
+    <w:tbl>
+      <w:tblPr>
+        <w:tblW w:type="auto" w:w="0"/>
+        <w:tblLayout w:type="fixed"/>
+        <w:tblLook w:firstColumn="1" w:firstRow="1" w:lastColumn="0" w:lastRow="0" w:noHBand="0" w:noVBand="1" w:val="04A0"/>
+        <w:tblBorders>
+          <w:top w:val="single" w:sz="4" w:color="D9D9D9"/>
+          <w:left w:val="single" w:sz="4" w:color="D9D9D9"/>
+          <w:bottom w:val="single" w:sz="4" w:color="D9D9D9"/>
+          <w:right w:val="single" w:sz="4" w:color="D9D9D9"/>
+          <w:insideH w:val="single" w:sz="4" w:color="D9D9D9"/>
+          <w:insideV w:val="single" w:sz="4" w:color="D9D9D9"/>
+        </w:tblBorders>
+      </w:tblPr>
+      <w:tblGrid>
+        <w:gridCol w:w="2938"/>
+        <w:gridCol w:w="1872"/>
+      </w:tblGrid>
+      <w:tr>
+        <w:trPr>
+          <w:tblHeader/>
+          <w:cantSplit/>
+        </w:trPr>
+        <w:tc>
+          <w:tcPr>
+            <w:tcW w:type="dxa" w:w="2938"/>
+            <w:shd w:fill="EEEEEE"/>
+            <w:tcMar>
+              <w:top w:w="55" w:type="dxa"/>
+              <w:left w:w="55" w:type="dxa"/>
+              <w:bottom w:w="55" w:type="dxa"/>
+              <w:right w:w="55" w:type="dxa"/>
+            </w:tcMar>
+          </w:tcPr>
+          <w:p>
+            <w:pPr>
+              <w:pStyle w:val="tablecopy"/>
+              <w:keepNext/>
+              <w:spacing w:after="20"/>
+              <w:ind w:firstLine="0"/>
+              <w:jc w:val="left"/>
+            </w:pPr>
+            <w:r>
+              <w:rPr>
+                <w:rFonts w:ascii="Times New Roman" w:hAnsi="Times New Roman"/>
+                <w:b/>
+                <w:sz w:val="16"/>
+              </w:rPr>
+              <w:t>Condition</w:t>
+            </w:r>
+          </w:p>
+        </w:tc>
+        <w:tc>
+          <w:tcPr>
+            <w:tcW w:type="dxa" w:w="1872"/>
+            <w:shd w:fill="EEEEEE"/>
+            <w:tcMar>
+              <w:top w:w="55" w:type="dxa"/>
+              <w:left w:w="55" w:type="dxa"/>
+              <w:bottom w:w="55" w:type="dxa"/>
+              <w:right w:w="55" w:type="dxa"/>
+            </w:tcMar>
+          </w:tcPr>
+          <w:p>
+            <w:pPr>
+              <w:pStyle w:val="tablecopy"/>
+              <w:keepNext/>
+              <w:spacing w:after="20"/>
+              <w:ind w:firstLine="0"/>
+              <w:jc w:val="center"/>
+            </w:pPr>
+            <w:r>
+              <w:rPr>
+                <w:rFonts w:ascii="Times New Roman" w:hAnsi="Times New Roman"/>
+                <w:b/>
+                <w:sz w:val="16"/>
+              </w:rPr>
+              <w:t>Outcome</w:t>
+            </w:r>
+          </w:p>
+        </w:tc>
+      </w:tr>
+      <w:tr>
+        <w:trPr>
+          <w:cantSplit/>
+        </w:trPr>
+        <w:tc>
+          <w:tcPr>
+            <w:tcW w:type="dxa" w:w="2938"/>
+            <w:tcMar>
+              <w:top w:w="55" w:type="dxa"/>
+              <w:left w:w="55" w:type="dxa"/>
+              <w:bottom w:w="55" w:type="dxa"/>
+              <w:right w:w="55" w:type="dxa"/>
+            </w:tcMar>
+          </w:tcPr>
+          <w:p>
+            <w:pPr>
+              <w:pStyle w:val="tablecopy"/>
+              <w:keepNext/>
+              <w:spacing w:after="20"/>
+              <w:ind w:firstLine="0"/>
+              <w:jc w:val="left"/>
+            </w:pPr>
+            <w:r>
+              <w:rPr>
+                <w:rFonts w:ascii="Times New Roman" w:hAnsi="Times New Roman"/>
+                <w:b w:val="0"/>
+                <w:sz w:val="16"/>
+              </w:rPr>
+              <w:t>Missing, unsupported, or misaligned guidance/candidate</w:t>
+            </w:r>
+          </w:p>
+        </w:tc>
+        <w:tc>
+          <w:tcPr>
+            <w:tcW w:type="dxa" w:w="1872"/>
+            <w:tcMar>
+              <w:top w:w="55" w:type="dxa"/>
+              <w:left w:w="55" w:type="dxa"/>
+              <w:bottom w:w="55" w:type="dxa"/>
+              <w:right w:w="55" w:type="dxa"/>
+            </w:tcMar>
+          </w:tcPr>
+          <w:p>
+            <w:pPr>
+              <w:pStyle w:val="tablecopy"/>
+              <w:keepNext/>
+              <w:spacing w:after="20"/>
+              <w:ind w:firstLine="0"/>
+              <w:jc w:val="center"/>
+            </w:pPr>
+            <w:r>
+              <w:rPr>
+                <w:rFonts w:ascii="Times New Roman" w:hAnsi="Times New Roman"/>
+                <w:b w:val="0"/>
+                <w:sz w:val="16"/>
+              </w:rPr>
+              <w:t>Withhold measured projection</w:t>
+            </w:r>
+          </w:p>
+        </w:tc>
+      </w:tr>
+      <w:tr>
+        <w:trPr>
+          <w:cantSplit/>
+        </w:trPr>
+        <w:tc>
+          <w:tcPr>
+            <w:tcW w:type="dxa" w:w="2938"/>
+            <w:tcMar>
+              <w:top w:w="55" w:type="dxa"/>
+              <w:left w:w="55" w:type="dxa"/>
+              <w:bottom w:w="55" w:type="dxa"/>
+              <w:right w:w="55" w:type="dxa"/>
+            </w:tcMar>
+          </w:tcPr>
+          <w:p>
+            <w:pPr>
+              <w:pStyle w:val="tablecopy"/>
+              <w:keepNext/>
+              <w:spacing w:after="20"/>
+              <w:ind w:firstLine="0"/>
+              <w:jc w:val="left"/>
+            </w:pPr>
+            <w:r>
+              <w:rPr>
+                <w:rFonts w:ascii="Times New Roman" w:hAnsi="Times New Roman"/>
+                <w:b w:val="0"/>
+                <w:sz w:val="16"/>
+              </w:rPr>
+              <w:t>Alignment passes; execution or assessment incomplete</w:t>
+            </w:r>
+          </w:p>
+        </w:tc>
+        <w:tc>
+          <w:tcPr>
+            <w:tcW w:type="dxa" w:w="1872"/>
+            <w:tcMar>
+              <w:top w:w="55" w:type="dxa"/>
+              <w:left w:w="55" w:type="dxa"/>
+              <w:bottom w:w="55" w:type="dxa"/>
+              <w:right w:w="55" w:type="dxa"/>
+            </w:tcMar>
+          </w:tcPr>
+          <w:p>
+            <w:pPr>
+              <w:pStyle w:val="tablecopy"/>
+              <w:keepNext/>
+              <w:spacing w:after="20"/>
+              <w:ind w:firstLine="0"/>
+              <w:jc w:val="center"/>
+            </w:pPr>
+            <w:r>
+              <w:rPr>
+                <w:rFonts w:ascii="Times New Roman" w:hAnsi="Times New Roman"/>
+                <w:b w:val="0"/>
+                <w:sz w:val="16"/>
+              </w:rPr>
+              <w:t>Checking or unavailable; no promised gain</w:t>
+            </w:r>
+          </w:p>
+        </w:tc>
+      </w:tr>
+      <w:tr>
+        <w:trPr>
+          <w:cantSplit/>
+        </w:trPr>
+        <w:tc>
+          <w:tcPr>
+            <w:tcW w:type="dxa" w:w="2938"/>
+            <w:tcMar>
+              <w:top w:w="55" w:type="dxa"/>
+              <w:left w:w="55" w:type="dxa"/>
+              <w:bottom w:w="55" w:type="dxa"/>
+              <w:right w:w="55" w:type="dxa"/>
+            </w:tcMar>
+          </w:tcPr>
+          <w:p>
+            <w:pPr>
+              <w:pStyle w:val="tablecopy"/>
+              <w:keepNext/>
+              <w:spacing w:after="20"/>
+              <w:ind w:firstLine="0"/>
+              <w:jc w:val="left"/>
+            </w:pPr>
+            <w:r>
+              <w:rPr>
+                <w:rFonts w:ascii="Times New Roman" w:hAnsi="Times New Roman"/>
+                <w:b w:val="0"/>
+                <w:sz w:val="16"/>
+              </w:rPr>
+              <w:t>All cases pass; complete evidence; saved rubric matches</w:t>
+            </w:r>
+          </w:p>
+        </w:tc>
+        <w:tc>
+          <w:tcPr>
+            <w:tcW w:type="dxa" w:w="1872"/>
+            <w:tcMar>
+              <w:top w:w="55" w:type="dxa"/>
+              <w:left w:w="55" w:type="dxa"/>
+              <w:bottom w:w="55" w:type="dxa"/>
+              <w:right w:w="55" w:type="dxa"/>
+            </w:tcMar>
+          </w:tcPr>
+          <w:p>
+            <w:pPr>
+              <w:pStyle w:val="tablecopy"/>
+              <w:keepNext/>
+              <w:spacing w:after="20"/>
+              <w:ind w:firstLine="0"/>
+              <w:jc w:val="center"/>
+            </w:pPr>
+            <w:r>
+              <w:rPr>
+                <w:rFonts w:ascii="Times New Roman" w:hAnsi="Times New Roman"/>
+                <w:b w:val="0"/>
+                <w:sz w:val="16"/>
+              </w:rPr>
+              <w:t>Measure candidate score and difference</w:t>
+            </w:r>
+          </w:p>
+        </w:tc>
+      </w:tr>
+      <w:tr>
+        <w:trPr>
+          <w:cantSplit/>
+        </w:trPr>
+        <w:tc>
+          <w:tcPr>
+            <w:tcW w:type="dxa" w:w="2938"/>
+            <w:tcMar>
+              <w:top w:w="55" w:type="dxa"/>
+              <w:left w:w="55" w:type="dxa"/>
+              <w:bottom w:w="55" w:type="dxa"/>
+              <w:right w:w="55" w:type="dxa"/>
+            </w:tcMar>
+          </w:tcPr>
+          <w:p>
+            <w:pPr>
+              <w:pStyle w:val="tablecopy"/>
+              <w:keepNext/>
+              <w:spacing w:after="20"/>
+              <w:ind w:firstLine="0"/>
+              <w:jc w:val="left"/>
+            </w:pPr>
+            <w:r>
+              <w:rPr>
+                <w:rFonts w:ascii="Times New Roman" w:hAnsi="Times New Roman"/>
+                <w:b w:val="0"/>
+                <w:sz w:val="16"/>
+              </w:rPr>
+              <w:t>Measured difference is zero or negative</w:t>
+            </w:r>
+          </w:p>
+        </w:tc>
+        <w:tc>
+          <w:tcPr>
+            <w:tcW w:type="dxa" w:w="1872"/>
+            <w:tcMar>
+              <w:top w:w="55" w:type="dxa"/>
+              <w:left w:w="55" w:type="dxa"/>
+              <w:bottom w:w="55" w:type="dxa"/>
+              <w:right w:w="55" w:type="dxa"/>
+            </w:tcMar>
+          </w:tcPr>
+          <w:p>
+            <w:pPr>
+              <w:pStyle w:val="tablecopy"/>
+              <w:keepNext/>
+              <w:spacing w:after="20"/>
+              <w:ind w:firstLine="0"/>
+              <w:jc w:val="center"/>
+            </w:pPr>
+            <w:r>
+              <w:rPr>
+                <w:rFonts w:ascii="Times New Roman" w:hAnsi="Times New Roman"/>
+                <w:b w:val="0"/>
+                <w:sz w:val="16"/>
+              </w:rPr>
+              <w:t>Keep verified no increase</w:t>
+            </w:r>
+          </w:p>
+        </w:tc>
+      </w:tr>
+      <w:tr>
+        <w:trPr>
+          <w:cantSplit/>
+        </w:trPr>
+        <w:tc>
+          <w:tcPr>
+            <w:tcW w:type="dxa" w:w="2938"/>
+            <w:tcMar>
+              <w:top w:w="55" w:type="dxa"/>
+              <w:left w:w="55" w:type="dxa"/>
+              <w:bottom w:w="55" w:type="dxa"/>
+              <w:right w:w="55" w:type="dxa"/>
+            </w:tcMar>
+          </w:tcPr>
+          <w:p>
+            <w:pPr>
+              <w:pStyle w:val="tablecopy"/>
+              <w:keepNext w:val="0"/>
+              <w:spacing w:after="20"/>
+              <w:ind w:firstLine="0"/>
+              <w:jc w:val="left"/>
+            </w:pPr>
+            <w:r>
+              <w:rPr>
+                <w:rFonts w:ascii="Times New Roman" w:hAnsi="Times New Roman"/>
+                <w:b w:val="0"/>
+                <w:sz w:val="16"/>
+              </w:rPr>
+              <w:t>Learner submits a later implementation</w:t>
+            </w:r>
+          </w:p>
+        </w:tc>
+        <w:tc>
+          <w:tcPr>
+            <w:tcW w:type="dxa" w:w="1872"/>
+            <w:tcMar>
+              <w:top w:w="55" w:type="dxa"/>
+              <w:left w:w="55" w:type="dxa"/>
+              <w:bottom w:w="55" w:type="dxa"/>
+              <w:right w:w="55" w:type="dxa"/>
+            </w:tcMar>
+          </w:tcPr>
+          <w:p>
+            <w:pPr>
+              <w:pStyle w:val="tablecopy"/>
+              <w:keepNext w:val="0"/>
+              <w:spacing w:after="20"/>
+              <w:ind w:firstLine="0"/>
+              <w:jc w:val="center"/>
+            </w:pPr>
+            <w:r>
+              <w:rPr>
+                <w:rFonts w:ascii="Times New Roman" w:hAnsi="Times New Roman"/>
+                <w:b w:val="0"/>
+                <w:sz w:val="16"/>
+              </w:rPr>
+              <w:t>Execute and assess it afresh</w:t>
+            </w:r>
+          </w:p>
+        </w:tc>
+      </w:tr>
+    </w:tbl>
+    <w:p>
+      <w:pPr>
+        <w:pStyle w:val="BodyText"/>
+        <w:spacing w:after="20"/>
+      </w:pPr>
+    </w:p>
+    <w:p>
+      <w:pPr>
+        <w:pStyle w:val="BodyText"/>
+      </w:pPr>
+      <w:r>
+        <w:t>Only an eligible candidate that passes every configured case and has complete weighted evidence receives a measured score under the original saved rubric. Equation (4) gives the displayed difference. The number belongs to that candidate; it does not guarantee a gain for the learner's later implementation, which is assessed afresh.</w:t>
+      </w:r>
+    </w:p>
+    <w:p>
+      <w:pPr>
+        <w:pStyle w:val="BodyText"/>
+        <w:ind w:firstLine="0"/>
+        <w:jc w:val="center"/>
+      </w:pPr>
+      <m:oMath>
+        <m:r>
+          <m:t xml:space="preserve">Δ = S(candidate) − S(saved submission).</m:t>
+        </m:r>
+      </m:oMath>
+      <w:r>
+        <w:rPr>
+          <w:sz w:val="18"/>
+        </w:rPr>
+        <w:t xml:space="preserve">   (4)</w:t>
+      </w:r>
+    </w:p>
+    <w:p>
+      <w:pPr>
+        <w:pStyle w:val="BodyText"/>
+      </w:pPr>
+      <w:r>
+        <w:t>Zero or negative differences are retained rather than replaced with positive gains. Saved status distinguishes checking, slower verification, paused refresh, and unavailable results. Bounded retries and request identifiers prevent stale work replacing a newer stage. Candidate source and private metadata stay server-side; matching includes source, rubric, and test context. No real-provider latency or success-rate claim follows from the controlled tests.</w:t>
+      </w:r>
+    </w:p>
+    <w:p>
+      <w:pPr>
+        <w:pStyle w:val="Heading1"/>
+        <w:numPr>
+          <w:numId w:val="0"/>
+        </w:numPr>
+      </w:pPr>
+      <w:r>
+        <w:t>VI. Verification Method and Results</w:t>
+      </w:r>
+    </w:p>
+    <w:p>
+      <w:pPr>
+        <w:pStyle w:val="Heading2"/>
+        <w:numPr>
+          <w:numId w:val="0"/>
+        </w:numPr>
+      </w:pPr>
+      <w:r>
+        <w:t>A. Frozen Implementation and Research Questions</w:t>
+      </w:r>
+    </w:p>
+    <w:p>
+      <w:pPr>
+        <w:pStyle w:val="BodyText"/>
+      </w:pPr>
+      <w:r>
+        <w:t>The implementation snapshot is Git commit d4cdb86, with rubric version complexity-focused-v2 and guidance version six, verified on 30 October 2026. Its source and prompt manifest records SHA-256 values, allowed configuration, Python 3.11.16, Linux x86-64, and twelve reported logical processors. Credentials and database contents are excluded. The evidence separates three questions: whether execution and scoring contracts hold; whether static complexity labels agree with supplied AI proposals; and which findings remain insufficient for human grading or educational claims.</w:t>
+      </w:r>
+    </w:p>
+    <w:p>
+      <w:pPr>
+        <w:pStyle w:val="BodyText"/>
+      </w:pPr>
+      <w:r>
+        <w:t>The backend suite passed 333 tests, projection rendering passed nine checks, and frontend lint and build passed. Coverage includes arithmetic, incomplete evidence, privacy, stale requests, alignment rejection, and API behavior. Optional provider responses are mocked where needed. These counts establish regression behavior, not grading accuracy.</w:t>
+      </w:r>
+    </w:p>
+    <w:p>
+      <w:pPr>
+        <w:pStyle w:val="Heading2"/>
+        <w:numPr>
+          <w:numId w:val="0"/>
+        </w:numPr>
+      </w:pPr>
+      <w:r>
+        <w:t>B. Live Execution and Score Contracts</w:t>
+      </w:r>
+    </w:p>
+    <w:p>
+      <w:pPr>
+        <w:pStyle w:val="BodyText"/>
+      </w:pPr>
+      <w:r>
+        <w:t>Eight live execution checks used original synthetic programs and three inputs per check. Table III summarizes the matrix. Sum programs passed positive, negative, and zero inputs in all five languages. C++ Merge Intervals passed endpoint-sharing, unsorted overlapping, and nested-interval fixtures under the documented row-width contract. A changed incorrect source failed all three cases, and restoring the correct source passed again. Thus all eight checks met their expected outcomes; the intentionally incorrect program is not counted as a successful solution.</w:t>
+      </w:r>
+    </w:p>
+    <w:p>
+      <w:pPr>
+        <w:pStyle w:val="tablehead"/>
+        <w:keepNext/>
+        <w:numPr>
+          <w:numId w:val="0"/>
+        </w:numPr>
+        <w:spacing w:before="100" w:after="80"/>
+      </w:pPr>
+      <w:r>
+        <w:t>TABLE III. LIVE SYNTHETIC EXECUTION CONTRACTS</w:t>
       </w:r>
     </w:p>
     <w:tbl>
@@ -1807,31 +2198,23 @@
         </w:numPr>
       </w:pPr>
       <w:r>
-        <w:t>C. AI Assisted Complexity Label Pilot</w:t>
-      </w:r>
-    </w:p>
-    <w:p>
-      <w:pPr>
-        <w:pStyle w:val="BodyText"/>
-      </w:pPr>
-      <w:r>
-        <w:t>The pilot comprises twenty original AI-assisted synthetic function snippets: four variants in each of Python, C, C++, Java, and JavaScript. The variants cover direct summation, deliberately repeated summation, linear search, and binary search, belonging to only two original problem groups. Search inputs are sorted ascending arrays. Function inputs are supplied by the caller; the review convention is worst-case time and auxiliary space excluding those inputs, with unit-cost arithmetic assumptions. The snippets are not a representative sample of student programs or twenty independent problems.</w:t>
-      </w:r>
-    </w:p>
-    <w:p>
-      <w:pPr>
-        <w:pStyle w:val="BodyText"/>
-      </w:pPr>
-      <w:r>
-        <w:t>Two externally supplied files proposed labels for every canonical solution identifier. Model identities, settings, prompts, and independence were not verified. Their provenance remains AI-assisted and unverified. We preserved the original files, used canonical source hashes and problem groups, and recorded returned metadata discrepancies. Neither file supplies human expert reviews or instructor grades.</w:t>
-      </w:r>
-    </w:p>
-    <w:p>
-      <w:pPr>
-        <w:pStyle w:val="BodyText"/>
-      </w:pPr>
-      <w:r>
-        <w:t>With the optional provider disabled for static comparison, both proposed label sets agreed on all twenty time labels and all twenty space labels. The analyzer returned an analyzed result for all twenty snippets. It matched nineteen time labels, twenty space labels, and nineteen joint labels. Table III reports exact counts by language. Overall joint exact label agreement was ninety-five percent with full coverage on this particular pilot. This is agreement with model proposals, not expert-ground-truth accuracy or application-wide accuracy.</w:t>
+        <w:t>C. Diagnostic Complexity Case Study</w:t>
+      </w:r>
+    </w:p>
+    <w:p>
+      <w:pPr>
+        <w:pStyle w:val="BodyText"/>
+      </w:pPr>
+      <w:r>
+        <w:t>We use 20 original AI-assisted synthetic function snippets across Python, C, C++, Java, and JavaScript: direct summation, repeated summation, linear search, and binary search. There are only two problem groups, not 20 independent problems. Search inputs are sorted; the convention is worst-case time and auxiliary space excluding caller-supplied inputs, with unit-cost arithmetic.</w:t>
+      </w:r>
+    </w:p>
+    <w:p>
+      <w:pPr>
+        <w:pStyle w:val="BodyText"/>
+      </w:pPr>
+      <w:r>
+        <w:t>Two supplied AI label files agreed on all 20 time and space labels. Their identities, prompts, settings, and independence were not verified; they are not expert ground truth. With the optional provider disabled, the analyzer answered all 20 snippets and matched 19 time labels, 20 space labels, and 19 joint labels. All disagreement was in python-S02, reproduced in Listing 1. These descriptive counts locate a diagnostic discrepancy; they do not validate grading accuracy or generalization.</w:t>
       </w:r>
     </w:p>
     <w:p>
@@ -1844,1072 +2227,57 @@
         <w:spacing w:before="100" w:after="80"/>
       </w:pPr>
       <w:r>
-        <w:t>TABLE III. EXACT AGREEMENT WITH AI LABEL PROPOSALS</w:t>
-      </w:r>
-    </w:p>
-    <w:tbl>
-      <w:tblPr>
-        <w:tblW w:type="auto" w:w="0"/>
-        <w:tblLayout w:type="fixed"/>
-        <w:tblLook w:firstColumn="1" w:firstRow="1" w:lastColumn="0" w:lastRow="0" w:noHBand="0" w:noVBand="1" w:val="04A0"/>
-        <w:tblBorders>
-          <w:top w:val="single" w:sz="4" w:color="D9D9D9"/>
-          <w:left w:val="single" w:sz="4" w:color="D9D9D9"/>
-          <w:bottom w:val="single" w:sz="4" w:color="D9D9D9"/>
-          <w:right w:val="single" w:sz="4" w:color="D9D9D9"/>
-          <w:insideH w:val="single" w:sz="4" w:color="D9D9D9"/>
-          <w:insideV w:val="single" w:sz="4" w:color="D9D9D9"/>
-        </w:tblBorders>
-      </w:tblPr>
-      <w:tblGrid>
-        <w:gridCol w:w="1613"/>
-        <w:gridCol w:w="389"/>
-        <w:gridCol w:w="936"/>
-        <w:gridCol w:w="936"/>
-        <w:gridCol w:w="936"/>
-      </w:tblGrid>
-      <w:tr>
-        <w:trPr>
-          <w:tblHeader/>
-          <w:cantSplit/>
-        </w:trPr>
-        <w:tc>
-          <w:tcPr>
-            <w:tcW w:type="dxa" w:w="1613"/>
-            <w:shd w:fill="EEEEEE"/>
-            <w:tcMar>
-              <w:top w:w="55" w:type="dxa"/>
-              <w:left w:w="55" w:type="dxa"/>
-              <w:bottom w:w="55" w:type="dxa"/>
-              <w:right w:w="55" w:type="dxa"/>
-            </w:tcMar>
-          </w:tcPr>
-          <w:p>
-            <w:pPr>
-              <w:pStyle w:val="tablecopy"/>
-              <w:keepNext/>
-              <w:spacing w:after="20"/>
-              <w:ind w:firstLine="0"/>
-              <w:jc w:val="left"/>
-            </w:pPr>
-            <w:r>
-              <w:rPr>
-                <w:rFonts w:ascii="Times New Roman" w:hAnsi="Times New Roman"/>
-                <w:b/>
-                <w:sz w:val="16"/>
-              </w:rPr>
-              <w:t>Language</w:t>
-            </w:r>
-          </w:p>
-        </w:tc>
-        <w:tc>
-          <w:tcPr>
-            <w:tcW w:type="dxa" w:w="389"/>
-            <w:shd w:fill="EEEEEE"/>
-            <w:tcMar>
-              <w:top w:w="55" w:type="dxa"/>
-              <w:left w:w="55" w:type="dxa"/>
-              <w:bottom w:w="55" w:type="dxa"/>
-              <w:right w:w="55" w:type="dxa"/>
-            </w:tcMar>
-          </w:tcPr>
-          <w:p>
-            <w:pPr>
-              <w:pStyle w:val="tablecopy"/>
-              <w:keepNext/>
-              <w:spacing w:after="20"/>
-              <w:ind w:firstLine="0"/>
-              <w:jc w:val="center"/>
-            </w:pPr>
-            <w:r>
-              <w:rPr>
-                <w:rFonts w:ascii="Times New Roman" w:hAnsi="Times New Roman"/>
-                <w:b/>
-                <w:sz w:val="16"/>
-              </w:rPr>
-              <w:t>n</w:t>
-            </w:r>
-          </w:p>
-        </w:tc>
-        <w:tc>
-          <w:tcPr>
-            <w:tcW w:type="dxa" w:w="936"/>
-            <w:shd w:fill="EEEEEE"/>
-            <w:tcMar>
-              <w:top w:w="55" w:type="dxa"/>
-              <w:left w:w="55" w:type="dxa"/>
-              <w:bottom w:w="55" w:type="dxa"/>
-              <w:right w:w="55" w:type="dxa"/>
-            </w:tcMar>
-          </w:tcPr>
-          <w:p>
-            <w:pPr>
-              <w:pStyle w:val="tablecopy"/>
-              <w:keepNext/>
-              <w:spacing w:after="20"/>
-              <w:ind w:firstLine="0"/>
-              <w:jc w:val="center"/>
-            </w:pPr>
-            <w:r>
-              <w:rPr>
-                <w:rFonts w:ascii="Times New Roman" w:hAnsi="Times New Roman"/>
-                <w:b/>
-                <w:sz w:val="16"/>
-              </w:rPr>
-              <w:t>Time</w:t>
-            </w:r>
-          </w:p>
-        </w:tc>
-        <w:tc>
-          <w:tcPr>
-            <w:tcW w:type="dxa" w:w="936"/>
-            <w:shd w:fill="EEEEEE"/>
-            <w:tcMar>
-              <w:top w:w="55" w:type="dxa"/>
-              <w:left w:w="55" w:type="dxa"/>
-              <w:bottom w:w="55" w:type="dxa"/>
-              <w:right w:w="55" w:type="dxa"/>
-            </w:tcMar>
-          </w:tcPr>
-          <w:p>
-            <w:pPr>
-              <w:pStyle w:val="tablecopy"/>
-              <w:keepNext/>
-              <w:spacing w:after="20"/>
-              <w:ind w:firstLine="0"/>
-              <w:jc w:val="center"/>
-            </w:pPr>
-            <w:r>
-              <w:rPr>
-                <w:rFonts w:ascii="Times New Roman" w:hAnsi="Times New Roman"/>
-                <w:b/>
-                <w:sz w:val="16"/>
-              </w:rPr>
-              <w:t>Space</w:t>
-            </w:r>
-          </w:p>
-        </w:tc>
-        <w:tc>
-          <w:tcPr>
-            <w:tcW w:type="dxa" w:w="936"/>
-            <w:shd w:fill="EEEEEE"/>
-            <w:tcMar>
-              <w:top w:w="55" w:type="dxa"/>
-              <w:left w:w="55" w:type="dxa"/>
-              <w:bottom w:w="55" w:type="dxa"/>
-              <w:right w:w="55" w:type="dxa"/>
-            </w:tcMar>
-          </w:tcPr>
-          <w:p>
-            <w:pPr>
-              <w:pStyle w:val="tablecopy"/>
-              <w:keepNext/>
-              <w:spacing w:after="20"/>
-              <w:ind w:firstLine="0"/>
-              <w:jc w:val="center"/>
-            </w:pPr>
-            <w:r>
-              <w:rPr>
-                <w:rFonts w:ascii="Times New Roman" w:hAnsi="Times New Roman"/>
-                <w:b/>
-                <w:sz w:val="16"/>
-              </w:rPr>
-              <w:t>Joint</w:t>
-            </w:r>
-          </w:p>
-        </w:tc>
-      </w:tr>
-      <w:tr>
-        <w:trPr>
-          <w:cantSplit/>
-        </w:trPr>
-        <w:tc>
-          <w:tcPr>
-            <w:tcW w:type="dxa" w:w="1613"/>
-            <w:tcMar>
-              <w:top w:w="55" w:type="dxa"/>
-              <w:left w:w="55" w:type="dxa"/>
-              <w:bottom w:w="55" w:type="dxa"/>
-              <w:right w:w="55" w:type="dxa"/>
-            </w:tcMar>
-          </w:tcPr>
-          <w:p>
-            <w:pPr>
-              <w:pStyle w:val="tablecopy"/>
-              <w:keepNext/>
-              <w:spacing w:after="20"/>
-              <w:ind w:firstLine="0"/>
-              <w:jc w:val="left"/>
-            </w:pPr>
-            <w:r>
-              <w:rPr>
-                <w:rFonts w:ascii="Times New Roman" w:hAnsi="Times New Roman"/>
-                <w:b w:val="0"/>
-                <w:sz w:val="16"/>
-              </w:rPr>
-              <w:t>Python</w:t>
-            </w:r>
-          </w:p>
-        </w:tc>
-        <w:tc>
-          <w:tcPr>
-            <w:tcW w:type="dxa" w:w="389"/>
-            <w:tcMar>
-              <w:top w:w="55" w:type="dxa"/>
-              <w:left w:w="55" w:type="dxa"/>
-              <w:bottom w:w="55" w:type="dxa"/>
-              <w:right w:w="55" w:type="dxa"/>
-            </w:tcMar>
-          </w:tcPr>
-          <w:p>
-            <w:pPr>
-              <w:pStyle w:val="tablecopy"/>
-              <w:keepNext/>
-              <w:spacing w:after="20"/>
-              <w:ind w:firstLine="0"/>
-              <w:jc w:val="center"/>
-            </w:pPr>
-            <w:r>
-              <w:rPr>
-                <w:rFonts w:ascii="Times New Roman" w:hAnsi="Times New Roman"/>
-                <w:b w:val="0"/>
-                <w:sz w:val="16"/>
-              </w:rPr>
-              <w:t>4</w:t>
-            </w:r>
-          </w:p>
-        </w:tc>
-        <w:tc>
-          <w:tcPr>
-            <w:tcW w:type="dxa" w:w="936"/>
-            <w:tcMar>
-              <w:top w:w="55" w:type="dxa"/>
-              <w:left w:w="55" w:type="dxa"/>
-              <w:bottom w:w="55" w:type="dxa"/>
-              <w:right w:w="55" w:type="dxa"/>
-            </w:tcMar>
-          </w:tcPr>
-          <w:p>
-            <w:pPr>
-              <w:pStyle w:val="tablecopy"/>
-              <w:keepNext/>
-              <w:spacing w:after="20"/>
-              <w:ind w:firstLine="0"/>
-              <w:jc w:val="center"/>
-            </w:pPr>
-            <w:r>
-              <w:rPr>
-                <w:rFonts w:ascii="Times New Roman" w:hAnsi="Times New Roman"/>
-                <w:b w:val="0"/>
-                <w:sz w:val="16"/>
-              </w:rPr>
-              <w:t>3/4</w:t>
-            </w:r>
-          </w:p>
-        </w:tc>
-        <w:tc>
-          <w:tcPr>
-            <w:tcW w:type="dxa" w:w="936"/>
-            <w:tcMar>
-              <w:top w:w="55" w:type="dxa"/>
-              <w:left w:w="55" w:type="dxa"/>
-              <w:bottom w:w="55" w:type="dxa"/>
-              <w:right w:w="55" w:type="dxa"/>
-            </w:tcMar>
-          </w:tcPr>
-          <w:p>
-            <w:pPr>
-              <w:pStyle w:val="tablecopy"/>
-              <w:keepNext/>
-              <w:spacing w:after="20"/>
-              <w:ind w:firstLine="0"/>
-              <w:jc w:val="center"/>
-            </w:pPr>
-            <w:r>
-              <w:rPr>
-                <w:rFonts w:ascii="Times New Roman" w:hAnsi="Times New Roman"/>
-                <w:b w:val="0"/>
-                <w:sz w:val="16"/>
-              </w:rPr>
-              <w:t>4/4</w:t>
-            </w:r>
-          </w:p>
-        </w:tc>
-        <w:tc>
-          <w:tcPr>
-            <w:tcW w:type="dxa" w:w="936"/>
-            <w:tcMar>
-              <w:top w:w="55" w:type="dxa"/>
-              <w:left w:w="55" w:type="dxa"/>
-              <w:bottom w:w="55" w:type="dxa"/>
-              <w:right w:w="55" w:type="dxa"/>
-            </w:tcMar>
-          </w:tcPr>
-          <w:p>
-            <w:pPr>
-              <w:pStyle w:val="tablecopy"/>
-              <w:keepNext/>
-              <w:spacing w:after="20"/>
-              <w:ind w:firstLine="0"/>
-              <w:jc w:val="center"/>
-            </w:pPr>
-            <w:r>
-              <w:rPr>
-                <w:rFonts w:ascii="Times New Roman" w:hAnsi="Times New Roman"/>
-                <w:b w:val="0"/>
-                <w:sz w:val="16"/>
-              </w:rPr>
-              <w:t>3/4</w:t>
-            </w:r>
-          </w:p>
-        </w:tc>
-      </w:tr>
-      <w:tr>
-        <w:trPr>
-          <w:cantSplit/>
-        </w:trPr>
-        <w:tc>
-          <w:tcPr>
-            <w:tcW w:type="dxa" w:w="1613"/>
-            <w:tcMar>
-              <w:top w:w="55" w:type="dxa"/>
-              <w:left w:w="55" w:type="dxa"/>
-              <w:bottom w:w="55" w:type="dxa"/>
-              <w:right w:w="55" w:type="dxa"/>
-            </w:tcMar>
-          </w:tcPr>
-          <w:p>
-            <w:pPr>
-              <w:pStyle w:val="tablecopy"/>
-              <w:keepNext/>
-              <w:spacing w:after="20"/>
-              <w:ind w:firstLine="0"/>
-              <w:jc w:val="left"/>
-            </w:pPr>
-            <w:r>
-              <w:rPr>
-                <w:rFonts w:ascii="Times New Roman" w:hAnsi="Times New Roman"/>
-                <w:b w:val="0"/>
-                <w:sz w:val="16"/>
-              </w:rPr>
-              <w:t>C</w:t>
-            </w:r>
-          </w:p>
-        </w:tc>
-        <w:tc>
-          <w:tcPr>
-            <w:tcW w:type="dxa" w:w="389"/>
-            <w:tcMar>
-              <w:top w:w="55" w:type="dxa"/>
-              <w:left w:w="55" w:type="dxa"/>
-              <w:bottom w:w="55" w:type="dxa"/>
-              <w:right w:w="55" w:type="dxa"/>
-            </w:tcMar>
-          </w:tcPr>
-          <w:p>
-            <w:pPr>
-              <w:pStyle w:val="tablecopy"/>
-              <w:keepNext/>
-              <w:spacing w:after="20"/>
-              <w:ind w:firstLine="0"/>
-              <w:jc w:val="center"/>
-            </w:pPr>
-            <w:r>
-              <w:rPr>
-                <w:rFonts w:ascii="Times New Roman" w:hAnsi="Times New Roman"/>
-                <w:b w:val="0"/>
-                <w:sz w:val="16"/>
-              </w:rPr>
-              <w:t>4</w:t>
-            </w:r>
-          </w:p>
-        </w:tc>
-        <w:tc>
-          <w:tcPr>
-            <w:tcW w:type="dxa" w:w="936"/>
-            <w:tcMar>
-              <w:top w:w="55" w:type="dxa"/>
-              <w:left w:w="55" w:type="dxa"/>
-              <w:bottom w:w="55" w:type="dxa"/>
-              <w:right w:w="55" w:type="dxa"/>
-            </w:tcMar>
-          </w:tcPr>
-          <w:p>
-            <w:pPr>
-              <w:pStyle w:val="tablecopy"/>
-              <w:keepNext/>
-              <w:spacing w:after="20"/>
-              <w:ind w:firstLine="0"/>
-              <w:jc w:val="center"/>
-            </w:pPr>
-            <w:r>
-              <w:rPr>
-                <w:rFonts w:ascii="Times New Roman" w:hAnsi="Times New Roman"/>
-                <w:b w:val="0"/>
-                <w:sz w:val="16"/>
-              </w:rPr>
-              <w:t>4/4</w:t>
-            </w:r>
-          </w:p>
-        </w:tc>
-        <w:tc>
-          <w:tcPr>
-            <w:tcW w:type="dxa" w:w="936"/>
-            <w:tcMar>
-              <w:top w:w="55" w:type="dxa"/>
-              <w:left w:w="55" w:type="dxa"/>
-              <w:bottom w:w="55" w:type="dxa"/>
-              <w:right w:w="55" w:type="dxa"/>
-            </w:tcMar>
-          </w:tcPr>
-          <w:p>
-            <w:pPr>
-              <w:pStyle w:val="tablecopy"/>
-              <w:keepNext/>
-              <w:spacing w:after="20"/>
-              <w:ind w:firstLine="0"/>
-              <w:jc w:val="center"/>
-            </w:pPr>
-            <w:r>
-              <w:rPr>
-                <w:rFonts w:ascii="Times New Roman" w:hAnsi="Times New Roman"/>
-                <w:b w:val="0"/>
-                <w:sz w:val="16"/>
-              </w:rPr>
-              <w:t>4/4</w:t>
-            </w:r>
-          </w:p>
-        </w:tc>
-        <w:tc>
-          <w:tcPr>
-            <w:tcW w:type="dxa" w:w="936"/>
-            <w:tcMar>
-              <w:top w:w="55" w:type="dxa"/>
-              <w:left w:w="55" w:type="dxa"/>
-              <w:bottom w:w="55" w:type="dxa"/>
-              <w:right w:w="55" w:type="dxa"/>
-            </w:tcMar>
-          </w:tcPr>
-          <w:p>
-            <w:pPr>
-              <w:pStyle w:val="tablecopy"/>
-              <w:keepNext/>
-              <w:spacing w:after="20"/>
-              <w:ind w:firstLine="0"/>
-              <w:jc w:val="center"/>
-            </w:pPr>
-            <w:r>
-              <w:rPr>
-                <w:rFonts w:ascii="Times New Roman" w:hAnsi="Times New Roman"/>
-                <w:b w:val="0"/>
-                <w:sz w:val="16"/>
-              </w:rPr>
-              <w:t>4/4</w:t>
-            </w:r>
-          </w:p>
-        </w:tc>
-      </w:tr>
-      <w:tr>
-        <w:trPr>
-          <w:cantSplit/>
-        </w:trPr>
-        <w:tc>
-          <w:tcPr>
-            <w:tcW w:type="dxa" w:w="1613"/>
-            <w:tcMar>
-              <w:top w:w="55" w:type="dxa"/>
-              <w:left w:w="55" w:type="dxa"/>
-              <w:bottom w:w="55" w:type="dxa"/>
-              <w:right w:w="55" w:type="dxa"/>
-            </w:tcMar>
-          </w:tcPr>
-          <w:p>
-            <w:pPr>
-              <w:pStyle w:val="tablecopy"/>
-              <w:keepNext/>
-              <w:spacing w:after="20"/>
-              <w:ind w:firstLine="0"/>
-              <w:jc w:val="left"/>
-            </w:pPr>
-            <w:r>
-              <w:rPr>
-                <w:rFonts w:ascii="Times New Roman" w:hAnsi="Times New Roman"/>
-                <w:b w:val="0"/>
-                <w:sz w:val="16"/>
-              </w:rPr>
-              <w:t>C++</w:t>
-            </w:r>
-          </w:p>
-        </w:tc>
-        <w:tc>
-          <w:tcPr>
-            <w:tcW w:type="dxa" w:w="389"/>
-            <w:tcMar>
-              <w:top w:w="55" w:type="dxa"/>
-              <w:left w:w="55" w:type="dxa"/>
-              <w:bottom w:w="55" w:type="dxa"/>
-              <w:right w:w="55" w:type="dxa"/>
-            </w:tcMar>
-          </w:tcPr>
-          <w:p>
-            <w:pPr>
-              <w:pStyle w:val="tablecopy"/>
-              <w:keepNext/>
-              <w:spacing w:after="20"/>
-              <w:ind w:firstLine="0"/>
-              <w:jc w:val="center"/>
-            </w:pPr>
-            <w:r>
-              <w:rPr>
-                <w:rFonts w:ascii="Times New Roman" w:hAnsi="Times New Roman"/>
-                <w:b w:val="0"/>
-                <w:sz w:val="16"/>
-              </w:rPr>
-              <w:t>4</w:t>
-            </w:r>
-          </w:p>
-        </w:tc>
-        <w:tc>
-          <w:tcPr>
-            <w:tcW w:type="dxa" w:w="936"/>
-            <w:tcMar>
-              <w:top w:w="55" w:type="dxa"/>
-              <w:left w:w="55" w:type="dxa"/>
-              <w:bottom w:w="55" w:type="dxa"/>
-              <w:right w:w="55" w:type="dxa"/>
-            </w:tcMar>
-          </w:tcPr>
-          <w:p>
-            <w:pPr>
-              <w:pStyle w:val="tablecopy"/>
-              <w:keepNext/>
-              <w:spacing w:after="20"/>
-              <w:ind w:firstLine="0"/>
-              <w:jc w:val="center"/>
-            </w:pPr>
-            <w:r>
-              <w:rPr>
-                <w:rFonts w:ascii="Times New Roman" w:hAnsi="Times New Roman"/>
-                <w:b w:val="0"/>
-                <w:sz w:val="16"/>
-              </w:rPr>
-              <w:t>4/4</w:t>
-            </w:r>
-          </w:p>
-        </w:tc>
-        <w:tc>
-          <w:tcPr>
-            <w:tcW w:type="dxa" w:w="936"/>
-            <w:tcMar>
-              <w:top w:w="55" w:type="dxa"/>
-              <w:left w:w="55" w:type="dxa"/>
-              <w:bottom w:w="55" w:type="dxa"/>
-              <w:right w:w="55" w:type="dxa"/>
-            </w:tcMar>
-          </w:tcPr>
-          <w:p>
-            <w:pPr>
-              <w:pStyle w:val="tablecopy"/>
-              <w:keepNext/>
-              <w:spacing w:after="20"/>
-              <w:ind w:firstLine="0"/>
-              <w:jc w:val="center"/>
-            </w:pPr>
-            <w:r>
-              <w:rPr>
-                <w:rFonts w:ascii="Times New Roman" w:hAnsi="Times New Roman"/>
-                <w:b w:val="0"/>
-                <w:sz w:val="16"/>
-              </w:rPr>
-              <w:t>4/4</w:t>
-            </w:r>
-          </w:p>
-        </w:tc>
-        <w:tc>
-          <w:tcPr>
-            <w:tcW w:type="dxa" w:w="936"/>
-            <w:tcMar>
-              <w:top w:w="55" w:type="dxa"/>
-              <w:left w:w="55" w:type="dxa"/>
-              <w:bottom w:w="55" w:type="dxa"/>
-              <w:right w:w="55" w:type="dxa"/>
-            </w:tcMar>
-          </w:tcPr>
-          <w:p>
-            <w:pPr>
-              <w:pStyle w:val="tablecopy"/>
-              <w:keepNext/>
-              <w:spacing w:after="20"/>
-              <w:ind w:firstLine="0"/>
-              <w:jc w:val="center"/>
-            </w:pPr>
-            <w:r>
-              <w:rPr>
-                <w:rFonts w:ascii="Times New Roman" w:hAnsi="Times New Roman"/>
-                <w:b w:val="0"/>
-                <w:sz w:val="16"/>
-              </w:rPr>
-              <w:t>4/4</w:t>
-            </w:r>
-          </w:p>
-        </w:tc>
-      </w:tr>
-      <w:tr>
-        <w:trPr>
-          <w:cantSplit/>
-        </w:trPr>
-        <w:tc>
-          <w:tcPr>
-            <w:tcW w:type="dxa" w:w="1613"/>
-            <w:tcMar>
-              <w:top w:w="55" w:type="dxa"/>
-              <w:left w:w="55" w:type="dxa"/>
-              <w:bottom w:w="55" w:type="dxa"/>
-              <w:right w:w="55" w:type="dxa"/>
-            </w:tcMar>
-          </w:tcPr>
-          <w:p>
-            <w:pPr>
-              <w:pStyle w:val="tablecopy"/>
-              <w:keepNext/>
-              <w:spacing w:after="20"/>
-              <w:ind w:firstLine="0"/>
-              <w:jc w:val="left"/>
-            </w:pPr>
-            <w:r>
-              <w:rPr>
-                <w:rFonts w:ascii="Times New Roman" w:hAnsi="Times New Roman"/>
-                <w:b w:val="0"/>
-                <w:sz w:val="16"/>
-              </w:rPr>
-              <w:t>Java</w:t>
-            </w:r>
-          </w:p>
-        </w:tc>
-        <w:tc>
-          <w:tcPr>
-            <w:tcW w:type="dxa" w:w="389"/>
-            <w:tcMar>
-              <w:top w:w="55" w:type="dxa"/>
-              <w:left w:w="55" w:type="dxa"/>
-              <w:bottom w:w="55" w:type="dxa"/>
-              <w:right w:w="55" w:type="dxa"/>
-            </w:tcMar>
-          </w:tcPr>
-          <w:p>
-            <w:pPr>
-              <w:pStyle w:val="tablecopy"/>
-              <w:keepNext/>
-              <w:spacing w:after="20"/>
-              <w:ind w:firstLine="0"/>
-              <w:jc w:val="center"/>
-            </w:pPr>
-            <w:r>
-              <w:rPr>
-                <w:rFonts w:ascii="Times New Roman" w:hAnsi="Times New Roman"/>
-                <w:b w:val="0"/>
-                <w:sz w:val="16"/>
-              </w:rPr>
-              <w:t>4</w:t>
-            </w:r>
-          </w:p>
-        </w:tc>
-        <w:tc>
-          <w:tcPr>
-            <w:tcW w:type="dxa" w:w="936"/>
-            <w:tcMar>
-              <w:top w:w="55" w:type="dxa"/>
-              <w:left w:w="55" w:type="dxa"/>
-              <w:bottom w:w="55" w:type="dxa"/>
-              <w:right w:w="55" w:type="dxa"/>
-            </w:tcMar>
-          </w:tcPr>
-          <w:p>
-            <w:pPr>
-              <w:pStyle w:val="tablecopy"/>
-              <w:keepNext/>
-              <w:spacing w:after="20"/>
-              <w:ind w:firstLine="0"/>
-              <w:jc w:val="center"/>
-            </w:pPr>
-            <w:r>
-              <w:rPr>
-                <w:rFonts w:ascii="Times New Roman" w:hAnsi="Times New Roman"/>
-                <w:b w:val="0"/>
-                <w:sz w:val="16"/>
-              </w:rPr>
-              <w:t>4/4</w:t>
-            </w:r>
-          </w:p>
-        </w:tc>
-        <w:tc>
-          <w:tcPr>
-            <w:tcW w:type="dxa" w:w="936"/>
-            <w:tcMar>
-              <w:top w:w="55" w:type="dxa"/>
-              <w:left w:w="55" w:type="dxa"/>
-              <w:bottom w:w="55" w:type="dxa"/>
-              <w:right w:w="55" w:type="dxa"/>
-            </w:tcMar>
-          </w:tcPr>
-          <w:p>
-            <w:pPr>
-              <w:pStyle w:val="tablecopy"/>
-              <w:keepNext/>
-              <w:spacing w:after="20"/>
-              <w:ind w:firstLine="0"/>
-              <w:jc w:val="center"/>
-            </w:pPr>
-            <w:r>
-              <w:rPr>
-                <w:rFonts w:ascii="Times New Roman" w:hAnsi="Times New Roman"/>
-                <w:b w:val="0"/>
-                <w:sz w:val="16"/>
-              </w:rPr>
-              <w:t>4/4</w:t>
-            </w:r>
-          </w:p>
-        </w:tc>
-        <w:tc>
-          <w:tcPr>
-            <w:tcW w:type="dxa" w:w="936"/>
-            <w:tcMar>
-              <w:top w:w="55" w:type="dxa"/>
-              <w:left w:w="55" w:type="dxa"/>
-              <w:bottom w:w="55" w:type="dxa"/>
-              <w:right w:w="55" w:type="dxa"/>
-            </w:tcMar>
-          </w:tcPr>
-          <w:p>
-            <w:pPr>
-              <w:pStyle w:val="tablecopy"/>
-              <w:keepNext/>
-              <w:spacing w:after="20"/>
-              <w:ind w:firstLine="0"/>
-              <w:jc w:val="center"/>
-            </w:pPr>
-            <w:r>
-              <w:rPr>
-                <w:rFonts w:ascii="Times New Roman" w:hAnsi="Times New Roman"/>
-                <w:b w:val="0"/>
-                <w:sz w:val="16"/>
-              </w:rPr>
-              <w:t>4/4</w:t>
-            </w:r>
-          </w:p>
-        </w:tc>
-      </w:tr>
-      <w:tr>
-        <w:trPr>
-          <w:cantSplit/>
-        </w:trPr>
-        <w:tc>
-          <w:tcPr>
-            <w:tcW w:type="dxa" w:w="1613"/>
-            <w:tcMar>
-              <w:top w:w="55" w:type="dxa"/>
-              <w:left w:w="55" w:type="dxa"/>
-              <w:bottom w:w="55" w:type="dxa"/>
-              <w:right w:w="55" w:type="dxa"/>
-            </w:tcMar>
-          </w:tcPr>
-          <w:p>
-            <w:pPr>
-              <w:pStyle w:val="tablecopy"/>
-              <w:keepNext/>
-              <w:spacing w:after="20"/>
-              <w:ind w:firstLine="0"/>
-              <w:jc w:val="left"/>
-            </w:pPr>
-            <w:r>
-              <w:rPr>
-                <w:rFonts w:ascii="Times New Roman" w:hAnsi="Times New Roman"/>
-                <w:b w:val="0"/>
-                <w:sz w:val="16"/>
-              </w:rPr>
-              <w:t>JavaScript</w:t>
-            </w:r>
-          </w:p>
-        </w:tc>
-        <w:tc>
-          <w:tcPr>
-            <w:tcW w:type="dxa" w:w="389"/>
-            <w:tcMar>
-              <w:top w:w="55" w:type="dxa"/>
-              <w:left w:w="55" w:type="dxa"/>
-              <w:bottom w:w="55" w:type="dxa"/>
-              <w:right w:w="55" w:type="dxa"/>
-            </w:tcMar>
-          </w:tcPr>
-          <w:p>
-            <w:pPr>
-              <w:pStyle w:val="tablecopy"/>
-              <w:keepNext/>
-              <w:spacing w:after="20"/>
-              <w:ind w:firstLine="0"/>
-              <w:jc w:val="center"/>
-            </w:pPr>
-            <w:r>
-              <w:rPr>
-                <w:rFonts w:ascii="Times New Roman" w:hAnsi="Times New Roman"/>
-                <w:b w:val="0"/>
-                <w:sz w:val="16"/>
-              </w:rPr>
-              <w:t>4</w:t>
-            </w:r>
-          </w:p>
-        </w:tc>
-        <w:tc>
-          <w:tcPr>
-            <w:tcW w:type="dxa" w:w="936"/>
-            <w:tcMar>
-              <w:top w:w="55" w:type="dxa"/>
-              <w:left w:w="55" w:type="dxa"/>
-              <w:bottom w:w="55" w:type="dxa"/>
-              <w:right w:w="55" w:type="dxa"/>
-            </w:tcMar>
-          </w:tcPr>
-          <w:p>
-            <w:pPr>
-              <w:pStyle w:val="tablecopy"/>
-              <w:keepNext/>
-              <w:spacing w:after="20"/>
-              <w:ind w:firstLine="0"/>
-              <w:jc w:val="center"/>
-            </w:pPr>
-            <w:r>
-              <w:rPr>
-                <w:rFonts w:ascii="Times New Roman" w:hAnsi="Times New Roman"/>
-                <w:b w:val="0"/>
-                <w:sz w:val="16"/>
-              </w:rPr>
-              <w:t>4/4</w:t>
-            </w:r>
-          </w:p>
-        </w:tc>
-        <w:tc>
-          <w:tcPr>
-            <w:tcW w:type="dxa" w:w="936"/>
-            <w:tcMar>
-              <w:top w:w="55" w:type="dxa"/>
-              <w:left w:w="55" w:type="dxa"/>
-              <w:bottom w:w="55" w:type="dxa"/>
-              <w:right w:w="55" w:type="dxa"/>
-            </w:tcMar>
-          </w:tcPr>
-          <w:p>
-            <w:pPr>
-              <w:pStyle w:val="tablecopy"/>
-              <w:keepNext/>
-              <w:spacing w:after="20"/>
-              <w:ind w:firstLine="0"/>
-              <w:jc w:val="center"/>
-            </w:pPr>
-            <w:r>
-              <w:rPr>
-                <w:rFonts w:ascii="Times New Roman" w:hAnsi="Times New Roman"/>
-                <w:b w:val="0"/>
-                <w:sz w:val="16"/>
-              </w:rPr>
-              <w:t>4/4</w:t>
-            </w:r>
-          </w:p>
-        </w:tc>
-        <w:tc>
-          <w:tcPr>
-            <w:tcW w:type="dxa" w:w="936"/>
-            <w:tcMar>
-              <w:top w:w="55" w:type="dxa"/>
-              <w:left w:w="55" w:type="dxa"/>
-              <w:bottom w:w="55" w:type="dxa"/>
-              <w:right w:w="55" w:type="dxa"/>
-            </w:tcMar>
-          </w:tcPr>
-          <w:p>
-            <w:pPr>
-              <w:pStyle w:val="tablecopy"/>
-              <w:keepNext/>
-              <w:spacing w:after="20"/>
-              <w:ind w:firstLine="0"/>
-              <w:jc w:val="center"/>
-            </w:pPr>
-            <w:r>
-              <w:rPr>
-                <w:rFonts w:ascii="Times New Roman" w:hAnsi="Times New Roman"/>
-                <w:b w:val="0"/>
-                <w:sz w:val="16"/>
-              </w:rPr>
-              <w:t>4/4</w:t>
-            </w:r>
-          </w:p>
-        </w:tc>
-      </w:tr>
-      <w:tr>
-        <w:trPr>
-          <w:cantSplit/>
-        </w:trPr>
-        <w:tc>
-          <w:tcPr>
-            <w:tcW w:type="dxa" w:w="1613"/>
-            <w:tcMar>
-              <w:top w:w="55" w:type="dxa"/>
-              <w:left w:w="55" w:type="dxa"/>
-              <w:bottom w:w="55" w:type="dxa"/>
-              <w:right w:w="55" w:type="dxa"/>
-            </w:tcMar>
-          </w:tcPr>
-          <w:p>
-            <w:pPr>
-              <w:pStyle w:val="tablecopy"/>
-              <w:keepNext w:val="0"/>
-              <w:spacing w:after="20"/>
-              <w:ind w:firstLine="0"/>
-              <w:jc w:val="left"/>
-            </w:pPr>
-            <w:r>
-              <w:rPr>
-                <w:rFonts w:ascii="Times New Roman" w:hAnsi="Times New Roman"/>
-                <w:b w:val="0"/>
-                <w:sz w:val="16"/>
-              </w:rPr>
-              <w:t>Total</w:t>
-            </w:r>
-          </w:p>
-        </w:tc>
-        <w:tc>
-          <w:tcPr>
-            <w:tcW w:type="dxa" w:w="389"/>
-            <w:tcMar>
-              <w:top w:w="55" w:type="dxa"/>
-              <w:left w:w="55" w:type="dxa"/>
-              <w:bottom w:w="55" w:type="dxa"/>
-              <w:right w:w="55" w:type="dxa"/>
-            </w:tcMar>
-          </w:tcPr>
-          <w:p>
-            <w:pPr>
-              <w:pStyle w:val="tablecopy"/>
-              <w:keepNext w:val="0"/>
-              <w:spacing w:after="20"/>
-              <w:ind w:firstLine="0"/>
-              <w:jc w:val="center"/>
-            </w:pPr>
-            <w:r>
-              <w:rPr>
-                <w:rFonts w:ascii="Times New Roman" w:hAnsi="Times New Roman"/>
-                <w:b w:val="0"/>
-                <w:sz w:val="16"/>
-              </w:rPr>
-              <w:t>20</w:t>
-            </w:r>
-          </w:p>
-        </w:tc>
-        <w:tc>
-          <w:tcPr>
-            <w:tcW w:type="dxa" w:w="936"/>
-            <w:tcMar>
-              <w:top w:w="55" w:type="dxa"/>
-              <w:left w:w="55" w:type="dxa"/>
-              <w:bottom w:w="55" w:type="dxa"/>
-              <w:right w:w="55" w:type="dxa"/>
-            </w:tcMar>
-          </w:tcPr>
-          <w:p>
-            <w:pPr>
-              <w:pStyle w:val="tablecopy"/>
-              <w:keepNext w:val="0"/>
-              <w:spacing w:after="20"/>
-              <w:ind w:firstLine="0"/>
-              <w:jc w:val="center"/>
-            </w:pPr>
-            <w:r>
-              <w:rPr>
-                <w:rFonts w:ascii="Times New Roman" w:hAnsi="Times New Roman"/>
-                <w:b w:val="0"/>
-                <w:sz w:val="16"/>
-              </w:rPr>
-              <w:t>19/20</w:t>
-            </w:r>
-          </w:p>
-        </w:tc>
-        <w:tc>
-          <w:tcPr>
-            <w:tcW w:type="dxa" w:w="936"/>
-            <w:tcMar>
-              <w:top w:w="55" w:type="dxa"/>
-              <w:left w:w="55" w:type="dxa"/>
-              <w:bottom w:w="55" w:type="dxa"/>
-              <w:right w:w="55" w:type="dxa"/>
-            </w:tcMar>
-          </w:tcPr>
-          <w:p>
-            <w:pPr>
-              <w:pStyle w:val="tablecopy"/>
-              <w:keepNext w:val="0"/>
-              <w:spacing w:after="20"/>
-              <w:ind w:firstLine="0"/>
-              <w:jc w:val="center"/>
-            </w:pPr>
-            <w:r>
-              <w:rPr>
-                <w:rFonts w:ascii="Times New Roman" w:hAnsi="Times New Roman"/>
-                <w:b w:val="0"/>
-                <w:sz w:val="16"/>
-              </w:rPr>
-              <w:t>20/20</w:t>
-            </w:r>
-          </w:p>
-        </w:tc>
-        <w:tc>
-          <w:tcPr>
-            <w:tcW w:type="dxa" w:w="936"/>
-            <w:tcMar>
-              <w:top w:w="55" w:type="dxa"/>
-              <w:left w:w="55" w:type="dxa"/>
-              <w:bottom w:w="55" w:type="dxa"/>
-              <w:right w:w="55" w:type="dxa"/>
-            </w:tcMar>
-          </w:tcPr>
-          <w:p>
-            <w:pPr>
-              <w:pStyle w:val="tablecopy"/>
-              <w:keepNext w:val="0"/>
-              <w:spacing w:after="20"/>
-              <w:ind w:firstLine="0"/>
-              <w:jc w:val="center"/>
-            </w:pPr>
-            <w:r>
-              <w:rPr>
-                <w:rFonts w:ascii="Times New Roman" w:hAnsi="Times New Roman"/>
-                <w:b w:val="0"/>
-                <w:sz w:val="16"/>
-              </w:rPr>
-              <w:t>19/20</w:t>
-            </w:r>
-          </w:p>
-        </w:tc>
-      </w:tr>
-    </w:tbl>
-    <w:p>
-      <w:pPr>
-        <w:pStyle w:val="BodyText"/>
-        <w:spacing w:after="20"/>
-      </w:pPr>
-    </w:p>
-    <w:p>
-      <w:pPr>
-        <w:pStyle w:val="BodyText"/>
-      </w:pPr>
-      <w:r>
-        <w:t>The mismatch is informative. A Python program repeatedly sums the same array inside a loop over that array's length. Both bounds denote the same size, so its work is quadratic under the stated convention. The analyzer reports a product of two symbolic bounds instead of consolidating them into one squared bound. Those expressions specialize to the same growth when the symbols are equal, but the strict comparison retains the mismatch. Global normalization of every two-variable product to a squared single-variable expression would hide valid distinctions and was not applied to improve the reported count.</w:t>
-      </w:r>
-    </w:p>
-    <w:p>
-      <w:pPr>
-        <w:pStyle w:val="BodyText"/>
-      </w:pPr>
-      <w:r>
-        <w:t>We report descriptive counts rather than inferential confidence intervals: translated variants and related approaches violate a simple independent-sample interpretation. No model-only versus hybrid superiority claim is made, because controlled provider predictions and independently adjudicated labels were not available. The static-only comparison is a reproducible baseline for a subsequent broader study.</w:t>
+        <w:t>Listing 1. Original diagnostic fixture python-S02.</w:t>
+      </w:r>
+    </w:p>
+    <w:p>
+      <w:pPr>
+        <w:pStyle w:val="BodyText"/>
+        <w:keepLines/>
+        <w:ind w:firstLine="0" w:left="144"/>
+        <w:jc w:val="left"/>
+      </w:pPr>
+      <w:r>
+        <w:rPr>
+          <w:sz w:val="18"/>
+        </w:rPr>
+        <w:t>def solve(a):</w:t>
+        <w:br/>
+        <w:t xml:space="preserve">    total = 0</w:t>
+        <w:br/>
+        <w:t xml:space="preserve">    for i in range(len(a)):</w:t>
+        <w:br/>
+        <w:t xml:space="preserve">        total = 0</w:t>
+        <w:br/>
+        <w:t xml:space="preserve">        for value in a:</w:t>
+        <w:br/>
+        <w:t xml:space="preserve">            total += value</w:t>
+        <w:br/>
+        <w:t xml:space="preserve">    return total</w:t>
+      </w:r>
+    </w:p>
+    <w:p>
+      <w:pPr>
+        <w:pStyle w:val="BodyText"/>
+      </w:pPr>
+      <w:r>
+        <w:t>The recorded output was O(m*n) time and O(1) space, with heuristic confidence 0.95. Both AI proposals gave O(n²) and O(1). Here the outer range and inner traversal both use a: for n = len(a), the inner addition executes n² times. The matching mathematical specialization is m = n, not an independent dimension. Thus this is a lost size relation and a strict-label mismatch, not evidence that every product bound is incorrect. The reset of total also makes the algorithm functionally wasteful: for nonempty input, only the last recomputed sum is returned.</w:t>
+      </w:r>
+    </w:p>
+    <w:p>
+      <w:pPr>
+        <w:pStyle w:val="BodyText"/>
+      </w:pPr>
+      <w:r>
+        <w:t>The issue can arise when separate syntactic traversals, aliases, or helper results refer to the same collection size without carrying that relation into the bound. Conversely, independent arrays of lengths m and n require O(m*n). Replacing every product with O(n²) would erase genuine multivariate costs, whose importance is established in [8]. A future repair should track collection identity and proven size equalities, then test equal and independent dimensions on held-out cases. We preserve the existing analyzer and reporting mismatch rather than tune it on this diagnostic set.</w:t>
+      </w:r>
+    </w:p>
+    <w:p>
+      <w:pPr>
+        <w:pStyle w:val="BodyText"/>
+      </w:pPr>
+      <w:r>
+        <w:t>Coverage is answered cases divided by eligible cases; exact agreement uses the answered-case denominator, separately for time, space, and joint labels. Both denominators happen to be 20 here. Related cross-language variants and AI proposals preclude an independent-sample accuracy interpretation. Human complexity validation remains pending.</w:t>
       </w:r>
     </w:p>
     <w:p>
@@ -3452,15 +2820,528 @@
         <w:pStyle w:val="BodyText"/>
       </w:pPr>
       <w:r>
-        <w:t>Weights still matter. With complete correctness, time and space percentages of fifty, and style eighty, the default gives 68.0, equal weighting 70.0, and correctness-heavier weighting 73.0. Higher totals do not establish a better rubric. For correctness weight w below one and remaining weighted contribution B, the ceiling is active when C is no larger than B divided by one minus w. Reducing correctness's internal weight can therefore change both grades and the region where optimization becomes visible.</w:t>
-      </w:r>
-    </w:p>
-    <w:p>
-      <w:pPr>
-        <w:pStyle w:val="BodyText"/>
-      </w:pPr>
-      <w:r>
-        <w:t>For future label studies, coverage should be the number of scoreable analyzer answers divided by the number of eligible programs. Exact agreement conditional on answering should use the answered-program denominator, with time, space, and joint counts reported separately. In this pilot, those denominators coincide at twenty; they will not coincide when the analyzer abstains. Keeping both metrics prevents a selective system from appearing accurate by silently omitting difficult programs.</w:t>
+        <w:t>Weights still matter. Table V summarizes the final unrounded ceiling scores for the same 28 vectors under each profile. The grid is synthetic and equally weighted, so its mean and median describe policy sensitivity, not a student grade distribution. At C = 100, T = M = 50, Y = 80, scores are 68.0, 70.0, and 73.0. None identifies the best rubric without independent instructor judgments.</w:t>
+      </w:r>
+    </w:p>
+    <w:p>
+      <w:pPr>
+        <w:pStyle w:val="tablehead"/>
+        <w:keepNext/>
+        <w:numPr>
+          <w:numId w:val="0"/>
+        </w:numPr>
+        <w:spacing w:before="100" w:after="80"/>
+      </w:pPr>
+      <w:r>
+        <w:t>TABLE V. WEIGHT SENSITIVITY ON THE SAME SYNTHETIC GRID</w:t>
+      </w:r>
+    </w:p>
+    <w:tbl>
+      <w:tblPr>
+        <w:tblW w:type="auto" w:w="0"/>
+        <w:tblLayout w:type="fixed"/>
+        <w:tblLook w:firstColumn="1" w:firstRow="1" w:lastColumn="0" w:lastRow="0" w:noHBand="0" w:noVBand="1" w:val="04A0"/>
+        <w:tblBorders>
+          <w:top w:val="single" w:sz="4" w:color="D9D9D9"/>
+          <w:left w:val="single" w:sz="4" w:color="D9D9D9"/>
+          <w:bottom w:val="single" w:sz="4" w:color="D9D9D9"/>
+          <w:right w:val="single" w:sz="4" w:color="D9D9D9"/>
+          <w:insideH w:val="single" w:sz="4" w:color="D9D9D9"/>
+          <w:insideV w:val="single" w:sz="4" w:color="D9D9D9"/>
+        </w:tblBorders>
+      </w:tblPr>
+      <w:tblGrid>
+        <w:gridCol w:w="2160"/>
+        <w:gridCol w:w="749"/>
+        <w:gridCol w:w="835"/>
+        <w:gridCol w:w="1066"/>
+      </w:tblGrid>
+      <w:tr>
+        <w:trPr>
+          <w:tblHeader/>
+          <w:cantSplit/>
+        </w:trPr>
+        <w:tc>
+          <w:tcPr>
+            <w:tcW w:type="dxa" w:w="2160"/>
+            <w:shd w:fill="EEEEEE"/>
+            <w:tcMar>
+              <w:top w:w="55" w:type="dxa"/>
+              <w:left w:w="55" w:type="dxa"/>
+              <w:bottom w:w="55" w:type="dxa"/>
+              <w:right w:w="55" w:type="dxa"/>
+            </w:tcMar>
+          </w:tcPr>
+          <w:p>
+            <w:pPr>
+              <w:pStyle w:val="tablecopy"/>
+              <w:keepNext/>
+              <w:spacing w:after="20"/>
+              <w:ind w:firstLine="0"/>
+              <w:jc w:val="left"/>
+            </w:pPr>
+            <w:r>
+              <w:rPr>
+                <w:rFonts w:ascii="Times New Roman" w:hAnsi="Times New Roman"/>
+                <w:b/>
+                <w:sz w:val="16"/>
+              </w:rPr>
+              <w:t>C/T/M/Y profile</w:t>
+            </w:r>
+          </w:p>
+        </w:tc>
+        <w:tc>
+          <w:tcPr>
+            <w:tcW w:type="dxa" w:w="749"/>
+            <w:shd w:fill="EEEEEE"/>
+            <w:tcMar>
+              <w:top w:w="55" w:type="dxa"/>
+              <w:left w:w="55" w:type="dxa"/>
+              <w:bottom w:w="55" w:type="dxa"/>
+              <w:right w:w="55" w:type="dxa"/>
+            </w:tcMar>
+          </w:tcPr>
+          <w:p>
+            <w:pPr>
+              <w:pStyle w:val="tablecopy"/>
+              <w:keepNext/>
+              <w:spacing w:after="20"/>
+              <w:ind w:firstLine="0"/>
+              <w:jc w:val="center"/>
+            </w:pPr>
+            <w:r>
+              <w:rPr>
+                <w:rFonts w:ascii="Times New Roman" w:hAnsi="Times New Roman"/>
+                <w:b/>
+                <w:sz w:val="16"/>
+              </w:rPr>
+              <w:t>Mean</w:t>
+            </w:r>
+          </w:p>
+        </w:tc>
+        <w:tc>
+          <w:tcPr>
+            <w:tcW w:type="dxa" w:w="835"/>
+            <w:shd w:fill="EEEEEE"/>
+            <w:tcMar>
+              <w:top w:w="55" w:type="dxa"/>
+              <w:left w:w="55" w:type="dxa"/>
+              <w:bottom w:w="55" w:type="dxa"/>
+              <w:right w:w="55" w:type="dxa"/>
+            </w:tcMar>
+          </w:tcPr>
+          <w:p>
+            <w:pPr>
+              <w:pStyle w:val="tablecopy"/>
+              <w:keepNext/>
+              <w:spacing w:after="20"/>
+              <w:ind w:firstLine="0"/>
+              <w:jc w:val="center"/>
+            </w:pPr>
+            <w:r>
+              <w:rPr>
+                <w:rFonts w:ascii="Times New Roman" w:hAnsi="Times New Roman"/>
+                <w:b/>
+                <w:sz w:val="16"/>
+              </w:rPr>
+              <w:t>Median</w:t>
+            </w:r>
+          </w:p>
+        </w:tc>
+        <w:tc>
+          <w:tcPr>
+            <w:tcW w:type="dxa" w:w="1066"/>
+            <w:shd w:fill="EEEEEE"/>
+            <w:tcMar>
+              <w:top w:w="55" w:type="dxa"/>
+              <w:left w:w="55" w:type="dxa"/>
+              <w:bottom w:w="55" w:type="dxa"/>
+              <w:right w:w="55" w:type="dxa"/>
+            </w:tcMar>
+          </w:tcPr>
+          <w:p>
+            <w:pPr>
+              <w:pStyle w:val="tablecopy"/>
+              <w:keepNext/>
+              <w:spacing w:after="20"/>
+              <w:ind w:firstLine="0"/>
+              <w:jc w:val="center"/>
+            </w:pPr>
+            <w:r>
+              <w:rPr>
+                <w:rFonts w:ascii="Times New Roman" w:hAnsi="Times New Roman"/>
+                <w:b/>
+                <w:sz w:val="16"/>
+              </w:rPr>
+              <w:t>Q &gt; C</w:t>
+            </w:r>
+          </w:p>
+        </w:tc>
+      </w:tr>
+      <w:tr>
+        <w:trPr>
+          <w:cantSplit/>
+        </w:trPr>
+        <w:tc>
+          <w:tcPr>
+            <w:tcW w:type="dxa" w:w="2160"/>
+            <w:tcMar>
+              <w:top w:w="55" w:type="dxa"/>
+              <w:left w:w="55" w:type="dxa"/>
+              <w:bottom w:w="55" w:type="dxa"/>
+              <w:right w:w="55" w:type="dxa"/>
+            </w:tcMar>
+          </w:tcPr>
+          <w:p>
+            <w:pPr>
+              <w:pStyle w:val="tablecopy"/>
+              <w:keepNext/>
+              <w:spacing w:after="20"/>
+              <w:ind w:firstLine="0"/>
+              <w:jc w:val="left"/>
+            </w:pPr>
+            <w:r>
+              <w:rPr>
+                <w:rFonts w:ascii="Times New Roman" w:hAnsi="Times New Roman"/>
+                <w:b w:val="0"/>
+                <w:sz w:val="16"/>
+              </w:rPr>
+              <w:t>Default 30/35/25/10</w:t>
+            </w:r>
+          </w:p>
+        </w:tc>
+        <w:tc>
+          <w:tcPr>
+            <w:tcW w:type="dxa" w:w="749"/>
+            <w:tcMar>
+              <w:top w:w="55" w:type="dxa"/>
+              <w:left w:w="55" w:type="dxa"/>
+              <w:bottom w:w="55" w:type="dxa"/>
+              <w:right w:w="55" w:type="dxa"/>
+            </w:tcMar>
+          </w:tcPr>
+          <w:p>
+            <w:pPr>
+              <w:pStyle w:val="tablecopy"/>
+              <w:keepNext/>
+              <w:spacing w:after="20"/>
+              <w:ind w:firstLine="0"/>
+              <w:jc w:val="center"/>
+            </w:pPr>
+            <w:r>
+              <w:rPr>
+                <w:rFonts w:ascii="Times New Roman" w:hAnsi="Times New Roman"/>
+                <w:b w:val="0"/>
+                <w:sz w:val="16"/>
+              </w:rPr>
+              <w:t>55.88</w:t>
+            </w:r>
+          </w:p>
+        </w:tc>
+        <w:tc>
+          <w:tcPr>
+            <w:tcW w:type="dxa" w:w="835"/>
+            <w:tcMar>
+              <w:top w:w="55" w:type="dxa"/>
+              <w:left w:w="55" w:type="dxa"/>
+              <w:bottom w:w="55" w:type="dxa"/>
+              <w:right w:w="55" w:type="dxa"/>
+            </w:tcMar>
+          </w:tcPr>
+          <w:p>
+            <w:pPr>
+              <w:pStyle w:val="tablecopy"/>
+              <w:keepNext/>
+              <w:spacing w:after="20"/>
+              <w:ind w:firstLine="0"/>
+              <w:jc w:val="center"/>
+            </w:pPr>
+            <w:r>
+              <w:rPr>
+                <w:rFonts w:ascii="Times New Roman" w:hAnsi="Times New Roman"/>
+                <w:b w:val="0"/>
+                <w:sz w:val="16"/>
+              </w:rPr>
+              <w:t>66.35</w:t>
+            </w:r>
+          </w:p>
+        </w:tc>
+        <w:tc>
+          <w:tcPr>
+            <w:tcW w:type="dxa" w:w="1066"/>
+            <w:tcMar>
+              <w:top w:w="55" w:type="dxa"/>
+              <w:left w:w="55" w:type="dxa"/>
+              <w:bottom w:w="55" w:type="dxa"/>
+              <w:right w:w="55" w:type="dxa"/>
+            </w:tcMar>
+          </w:tcPr>
+          <w:p>
+            <w:pPr>
+              <w:pStyle w:val="tablecopy"/>
+              <w:keepNext/>
+              <w:spacing w:after="20"/>
+              <w:ind w:firstLine="0"/>
+              <w:jc w:val="center"/>
+            </w:pPr>
+            <w:r>
+              <w:rPr>
+                <w:rFonts w:ascii="Times New Roman" w:hAnsi="Times New Roman"/>
+                <w:b w:val="0"/>
+                <w:sz w:val="16"/>
+              </w:rPr>
+              <w:t>16/28</w:t>
+            </w:r>
+          </w:p>
+        </w:tc>
+      </w:tr>
+      <w:tr>
+        <w:trPr>
+          <w:cantSplit/>
+        </w:trPr>
+        <w:tc>
+          <w:tcPr>
+            <w:tcW w:type="dxa" w:w="2160"/>
+            <w:tcMar>
+              <w:top w:w="55" w:type="dxa"/>
+              <w:left w:w="55" w:type="dxa"/>
+              <w:bottom w:w="55" w:type="dxa"/>
+              <w:right w:w="55" w:type="dxa"/>
+            </w:tcMar>
+          </w:tcPr>
+          <w:p>
+            <w:pPr>
+              <w:pStyle w:val="tablecopy"/>
+              <w:keepNext/>
+              <w:spacing w:after="20"/>
+              <w:ind w:firstLine="0"/>
+              <w:jc w:val="left"/>
+            </w:pPr>
+            <w:r>
+              <w:rPr>
+                <w:rFonts w:ascii="Times New Roman" w:hAnsi="Times New Roman"/>
+                <w:b w:val="0"/>
+                <w:sz w:val="16"/>
+              </w:rPr>
+              <w:t>Equal 25/25/25/25</w:t>
+            </w:r>
+          </w:p>
+        </w:tc>
+        <w:tc>
+          <w:tcPr>
+            <w:tcW w:type="dxa" w:w="749"/>
+            <w:tcMar>
+              <w:top w:w="55" w:type="dxa"/>
+              <w:left w:w="55" w:type="dxa"/>
+              <w:bottom w:w="55" w:type="dxa"/>
+              <w:right w:w="55" w:type="dxa"/>
+            </w:tcMar>
+          </w:tcPr>
+          <w:p>
+            <w:pPr>
+              <w:pStyle w:val="tablecopy"/>
+              <w:keepNext/>
+              <w:spacing w:after="20"/>
+              <w:ind w:firstLine="0"/>
+              <w:jc w:val="center"/>
+            </w:pPr>
+            <w:r>
+              <w:rPr>
+                <w:rFonts w:ascii="Times New Roman" w:hAnsi="Times New Roman"/>
+                <w:b w:val="0"/>
+                <w:sz w:val="16"/>
+              </w:rPr>
+              <w:t>56.23</w:t>
+            </w:r>
+          </w:p>
+        </w:tc>
+        <w:tc>
+          <w:tcPr>
+            <w:tcW w:type="dxa" w:w="835"/>
+            <w:tcMar>
+              <w:top w:w="55" w:type="dxa"/>
+              <w:left w:w="55" w:type="dxa"/>
+              <w:bottom w:w="55" w:type="dxa"/>
+              <w:right w:w="55" w:type="dxa"/>
+            </w:tcMar>
+          </w:tcPr>
+          <w:p>
+            <w:pPr>
+              <w:pStyle w:val="tablecopy"/>
+              <w:keepNext/>
+              <w:spacing w:after="20"/>
+              <w:ind w:firstLine="0"/>
+              <w:jc w:val="center"/>
+            </w:pPr>
+            <w:r>
+              <w:rPr>
+                <w:rFonts w:ascii="Times New Roman" w:hAnsi="Times New Roman"/>
+                <w:b w:val="0"/>
+                <w:sz w:val="16"/>
+              </w:rPr>
+              <w:t>68.62</w:t>
+            </w:r>
+          </w:p>
+        </w:tc>
+        <w:tc>
+          <w:tcPr>
+            <w:tcW w:type="dxa" w:w="1066"/>
+            <w:tcMar>
+              <w:top w:w="55" w:type="dxa"/>
+              <w:left w:w="55" w:type="dxa"/>
+              <w:bottom w:w="55" w:type="dxa"/>
+              <w:right w:w="55" w:type="dxa"/>
+            </w:tcMar>
+          </w:tcPr>
+          <w:p>
+            <w:pPr>
+              <w:pStyle w:val="tablecopy"/>
+              <w:keepNext/>
+              <w:spacing w:after="20"/>
+              <w:ind w:firstLine="0"/>
+              <w:jc w:val="center"/>
+            </w:pPr>
+            <w:r>
+              <w:rPr>
+                <w:rFonts w:ascii="Times New Roman" w:hAnsi="Times New Roman"/>
+                <w:b w:val="0"/>
+                <w:sz w:val="16"/>
+              </w:rPr>
+              <w:t>17/28</w:t>
+            </w:r>
+          </w:p>
+        </w:tc>
+      </w:tr>
+      <w:tr>
+        <w:trPr>
+          <w:cantSplit/>
+        </w:trPr>
+        <w:tc>
+          <w:tcPr>
+            <w:tcW w:type="dxa" w:w="2160"/>
+            <w:tcMar>
+              <w:top w:w="55" w:type="dxa"/>
+              <w:left w:w="55" w:type="dxa"/>
+              <w:bottom w:w="55" w:type="dxa"/>
+              <w:right w:w="55" w:type="dxa"/>
+            </w:tcMar>
+          </w:tcPr>
+          <w:p>
+            <w:pPr>
+              <w:pStyle w:val="tablecopy"/>
+              <w:keepNext w:val="0"/>
+              <w:spacing w:after="20"/>
+              <w:ind w:firstLine="0"/>
+              <w:jc w:val="left"/>
+            </w:pPr>
+            <w:r>
+              <w:rPr>
+                <w:rFonts w:ascii="Times New Roman" w:hAnsi="Times New Roman"/>
+                <w:b w:val="0"/>
+                <w:sz w:val="16"/>
+              </w:rPr>
+              <w:t>Correctness 40/30/20/10</w:t>
+            </w:r>
+          </w:p>
+        </w:tc>
+        <w:tc>
+          <w:tcPr>
+            <w:tcW w:type="dxa" w:w="749"/>
+            <w:tcMar>
+              <w:top w:w="55" w:type="dxa"/>
+              <w:left w:w="55" w:type="dxa"/>
+              <w:bottom w:w="55" w:type="dxa"/>
+              <w:right w:w="55" w:type="dxa"/>
+            </w:tcMar>
+          </w:tcPr>
+          <w:p>
+            <w:pPr>
+              <w:pStyle w:val="tablecopy"/>
+              <w:keepNext w:val="0"/>
+              <w:spacing w:after="20"/>
+              <w:ind w:firstLine="0"/>
+              <w:jc w:val="center"/>
+            </w:pPr>
+            <w:r>
+              <w:rPr>
+                <w:rFonts w:ascii="Times New Roman" w:hAnsi="Times New Roman"/>
+                <w:b w:val="0"/>
+                <w:sz w:val="16"/>
+              </w:rPr>
+              <w:t>56.92</w:t>
+            </w:r>
+          </w:p>
+        </w:tc>
+        <w:tc>
+          <w:tcPr>
+            <w:tcW w:type="dxa" w:w="835"/>
+            <w:tcMar>
+              <w:top w:w="55" w:type="dxa"/>
+              <w:left w:w="55" w:type="dxa"/>
+              <w:bottom w:w="55" w:type="dxa"/>
+              <w:right w:w="55" w:type="dxa"/>
+            </w:tcMar>
+          </w:tcPr>
+          <w:p>
+            <w:pPr>
+              <w:pStyle w:val="tablecopy"/>
+              <w:keepNext w:val="0"/>
+              <w:spacing w:after="20"/>
+              <w:ind w:firstLine="0"/>
+              <w:jc w:val="center"/>
+            </w:pPr>
+            <w:r>
+              <w:rPr>
+                <w:rFonts w:ascii="Times New Roman" w:hAnsi="Times New Roman"/>
+                <w:b w:val="0"/>
+                <w:sz w:val="16"/>
+              </w:rPr>
+              <w:t>70.80</w:t>
+            </w:r>
+          </w:p>
+        </w:tc>
+        <w:tc>
+          <w:tcPr>
+            <w:tcW w:type="dxa" w:w="1066"/>
+            <w:tcMar>
+              <w:top w:w="55" w:type="dxa"/>
+              <w:left w:w="55" w:type="dxa"/>
+              <w:bottom w:w="55" w:type="dxa"/>
+              <w:right w:w="55" w:type="dxa"/>
+            </w:tcMar>
+          </w:tcPr>
+          <w:p>
+            <w:pPr>
+              <w:pStyle w:val="tablecopy"/>
+              <w:keepNext w:val="0"/>
+              <w:spacing w:after="20"/>
+              <w:ind w:firstLine="0"/>
+              <w:jc w:val="center"/>
+            </w:pPr>
+            <w:r>
+              <w:rPr>
+                <w:rFonts w:ascii="Times New Roman" w:hAnsi="Times New Roman"/>
+                <w:b w:val="0"/>
+                <w:sz w:val="16"/>
+              </w:rPr>
+              <w:t>16/28</w:t>
+            </w:r>
+          </w:p>
+        </w:tc>
+      </w:tr>
+    </w:tbl>
+    <w:p>
+      <w:pPr>
+        <w:pStyle w:val="BodyText"/>
+        <w:spacing w:after="20"/>
+      </w:pPr>
+    </w:p>
+    <w:p>
+      <w:pPr>
+        <w:pStyle w:val="BodyText"/>
+      </w:pPr>
+      <w:r>
+        <w:t>For correctness weight w below one and remaining weighted contribution B, the ceiling is active when C is no larger than B divided by one minus w. Reducing correctness's internal weight can therefore change both grades and the region where optimization becomes visible.</w:t>
       </w:r>
     </w:p>
     <w:p>
@@ -3479,7 +3360,7 @@
         <w:pStyle w:val="BodyText"/>
       </w:pPr>
       <w:r>
-        <w:t>The tagged artifact release [9] provides twenty canonical source fixtures, normalized AI label proposals, provenance hashes, execution reports, frozen-snapshot test transcripts, and reproduction instructions. The tags paper-implementation-20261030 and paper-scoring-experiment-20261030 identify the cited implementation and comparison commits. Proposal aliases are not authenticated reviewer identities; raw review prose is excluded. Published labels retain AI-assisted unverified provenance. The release contains no learner database, credentials, or real private course cases. It supports reproduction of the reported synthetic results, not independent validation of the proposed labels.</w:t>
+        <w:t>The tagged artifact release [12] provides twenty canonical source fixtures, normalized AI label proposals, provenance hashes, execution reports, frozen-snapshot test transcripts, and reproduction instructions. The tags paper-implementation-20261030 and paper-scoring-experiment-20261030 identify the cited implementation and comparison commits. Proposal aliases are not authenticated reviewer identities; raw review prose is excluded. Published labels retain AI-assisted unverified provenance. The release contains no learner database, credentials, or real private course cases. It supports reproduction of the reported synthetic results, not independent validation of the proposed labels.</w:t>
       </w:r>
     </w:p>
     <w:p>
@@ -3549,7 +3430,7 @@
         <w:pStyle w:val="BodyText"/>
       </w:pPr>
       <w:r>
-        <w:t>CodeVedha links execution evidence, resource estimates, style analysis, and optional AI guidance through an auditable assessment contract. Controlled comparison shows that a fixed failure cap does not enforce the chosen correctness bound. Both multiplication and a ceiling enforce it, while the ceiling preserves more partial credit under that declared policy. Execution contracts and candidate-score consistency checks support the implementation, and an explicitly AI-assisted pilot exposes a symbolic-bound limitation. Independent expert labels, instructor-grade validation, real-provider evaluation, and learning studies remain necessary for broader accuracy or educational claims.</w:t>
+        <w:t>CodeVedha links execution evidence, resource estimates, style analysis, and optional AI guidance through an auditable assessment contract. Controlled comparison shows that a fixed failure cap does not enforce the chosen correctness bound. Both multiplication and a ceiling enforce it, while the ceiling preserves more partial credit under that declared policy. Execution contracts and candidate-score consistency checks support the implementation, and a diagnostic case study exposes a missing symbolic size relation. Independent expert labels, instructor-grade validation, real-provider evaluation, and learning studies remain necessary for broader accuracy or educational claims.</w:t>
       </w:r>
     </w:p>
     <w:p>
@@ -3670,7 +3551,7 @@
         <w:jc w:val="left"/>
       </w:pPr>
       <w:r>
-        <w:t>[7] Docker, Inc., “docker container run,” Docker Documentation. Accessed: Oct. 30, 2026. [Online]. Available: https://docs.docker.com/reference/cli/docker/container/run/</w:t>
+        <w:t>[7] S. Gulwani, K. K. Mehra, and T. Chilimbi, “SPEED: Precise and efficient static estimation of program computational complexity,” in Proceedings of the 36th ACM SIGPLAN-SIGACT Symposium on Principles of Programming Languages, 2009. [Online]. Available: https://www.microsoft.com/en-us/research/wp-content/uploads/2016/02/popl09_speed.pdf</w:t>
       </w:r>
     </w:p>
     <w:p>
@@ -3683,7 +3564,7 @@
         <w:jc w:val="left"/>
       </w:pPr>
       <w:r>
-        <w:t>[8] Tree-sitter Contributors, “Tree-sitter: An incremental parsing system for programming tools.” Accessed: Oct. 30, 2026. [Online]. Available: https://github.com/tree-sitter/tree-sitter</w:t>
+        <w:t>[8] J. Hoffmann, K. Aehlig, and M. Hofmann, “Multivariate amortized resource analysis,” in Proceedings of the 38th ACM SIGPLAN-SIGACT Symposium on Principles of Programming Languages, 2011, pp. 357–370, doi: 10.1145/1926385.1926427.</w:t>
       </w:r>
     </w:p>
     <w:p>
@@ -3696,7 +3577,46 @@
         <w:jc w:val="left"/>
       </w:pPr>
       <w:r>
-        <w:t>[9] CodeVedha Project, “Paper evaluation artifacts and reproduction guide,” CodeAssessment repository, release paper-artifacts-20261030, 2026. Accessed: Oct. 30, 2026. [Online]. Available: https://github.com/multiagentcodereview2026/CodeAssessment/tree/paper-artifacts-20261030/docs/research-paper/artifacts</w:t>
+        <w:t>[9] A. Jonsson and G. Svingby, “The use of scoring rubrics: Reliability, validity and educational consequences,” Educational Research Review, vol. 2, no. 2, pp. 130–144, 2007, doi: 10.1016/j.edurev.2007.05.002.</w:t>
+      </w:r>
+    </w:p>
+    <w:p>
+      <w:pPr>
+        <w:pStyle w:val="references"/>
+        <w:numPr>
+          <w:numId w:val="0"/>
+        </w:numPr>
+        <w:ind w:hanging="216" w:left="216"/>
+        <w:jc w:val="left"/>
+      </w:pPr>
+      <w:r>
+        <w:t>[10] Docker, Inc., “docker container run,” Docker Documentation. Accessed: Oct. 30, 2026. [Online]. Available: https://docs.docker.com/reference/cli/docker/container/run/</w:t>
+      </w:r>
+    </w:p>
+    <w:p>
+      <w:pPr>
+        <w:pStyle w:val="references"/>
+        <w:numPr>
+          <w:numId w:val="0"/>
+        </w:numPr>
+        <w:ind w:hanging="216" w:left="216"/>
+        <w:jc w:val="left"/>
+      </w:pPr>
+      <w:r>
+        <w:t>[11] Tree-sitter Contributors, “Tree-sitter: An incremental parsing system for programming tools.” Accessed: Oct. 30, 2026. [Online]. Available: https://github.com/tree-sitter/tree-sitter</w:t>
+      </w:r>
+    </w:p>
+    <w:p>
+      <w:pPr>
+        <w:pStyle w:val="references"/>
+        <w:numPr>
+          <w:numId w:val="0"/>
+        </w:numPr>
+        <w:ind w:hanging="216" w:left="216"/>
+        <w:jc w:val="left"/>
+      </w:pPr>
+      <w:r>
+        <w:t>[12] CodeVedha Project, “Paper evaluation artifacts and reproduction guide,” CodeAssessment repository, release paper-artifacts-20261030, 2026. Accessed: Oct. 30, 2026. [Online]. Available: https://github.com/multiagentcodereview2026/CodeAssessment/tree/paper-artifacts-20261030/docs/research-paper/artifacts</w:t>
       </w:r>
     </w:p>
     <w:p>

</xml_diff>

<commit_message>
Remove administrative reminders from submission manuscript
</commit_message>
<xml_diff>
--- a/docs/research-paper/CodeVedha_EmergIN2027_Paper.docx
+++ b/docs/research-paper/CodeVedha_EmergIN2027_Paper.docx
@@ -2277,7 +2277,7 @@
         <w:pStyle w:val="BodyText"/>
       </w:pPr>
       <w:r>
-        <w:t>Coverage is answered cases divided by eligible cases; exact agreement uses the answered-case denominator, separately for time, space, and joint labels. Both denominators happen to be 20 here. Related cross-language variants and AI proposals preclude an independent-sample accuracy interpretation. Human complexity validation remains pending.</w:t>
+        <w:t>Coverage is answered cases divided by eligible cases; exact agreement uses the answered-case denominator, separately for time, space, and joint labels. Both denominators happen to be 20 here. Related cross-language variants and AI proposals preclude an independent-sample accuracy interpretation.</w:t>
       </w:r>
     </w:p>
     <w:p>
@@ -3403,15 +3403,15 @@
         <w:pStyle w:val="BodyText"/>
       </w:pPr>
       <w:r>
-        <w:t>Before broader efficacy claims, two qualified reviewers should label a diverse corpus and adjudicate disagreements with problem-level holdouts. Blinded instructor grades would permit comparisons of policy error and agreement. Feedback should be rated for factuality, relevance, actionability, and private-data disclosure. Repeated warm and cold requests should report latency distributions and provider failures.</w:t>
-      </w:r>
-    </w:p>
-    <w:p>
-      <w:pPr>
-        <w:pStyle w:val="BodyText"/>
-      </w:pPr>
-      <w:r>
-        <w:t>The reported evaluation uses synthetic fixtures and supplied AI review artifacts; it does not analyze identifiable learner records or report participant outcomes. No human-study ethics approval is asserted. Imported public problem collections are not treated as a publication dataset with assumed redistribution rights. A reproducibility package should include only fixtures and artifacts for which the authors have permission, and should exclude credentials, private course data, and real judge secrets. Similarity evidence is not proof of plagiarism, and this work does not claim plagiarism-screening clearance.</w:t>
+        <w:t>Further evaluation can compare complexity estimates with independently adjudicated labels on problem-level holdouts and compare grading policies against blinded instructor judgments. Feedback factuality, relevance, actionability, and disclosure, together with warm/cold latency distributions and provider failures, are separate evaluation targets.</w:t>
+      </w:r>
+    </w:p>
+    <w:p>
+      <w:pPr>
+        <w:pStyle w:val="BodyText"/>
+      </w:pPr>
+      <w:r>
+        <w:t>The reported evaluation uses synthetic fixtures and supplied AI review artifacts; it does not analyze identifiable learner records or report participant outcomes. The published package excludes credentials, private course data, and real judge secrets. Imported public problem collections are not redistributed as the publication dataset.</w:t>
       </w:r>
     </w:p>
     <w:p>
@@ -3449,7 +3449,7 @@
         <w:pStyle w:val="BodyText"/>
       </w:pPr>
       <w:r>
-        <w:t>OpenAI Codex was used to draft and revise the abstract and Sections I–VIII, assist with verification scripts and synthetic fixtures, and generate the architecture illustration. The pilot label proposals were supplied as external AI-assisted artifacts, with unverified self-reported model identities. They are reported as AI proposals, not human expert judgments. Authors are responsible for checking the final text, references, results, and disclosures before submission.</w:t>
+        <w:t>OpenAI Codex was used to draft and revise the abstract and Sections I–VIII, assist with verification scripts and synthetic fixtures, and generate the architecture illustration. The pilot label proposals were supplied as external AI-assisted artifacts, with unverified self-reported model identities. They are reported as AI proposals, not human expert judgments.</w:t>
       </w:r>
     </w:p>
     <w:p>

</xml_diff>

<commit_message>
Document complexity safeguards and verified diagnostic repair in paper
</commit_message>
<xml_diff>
--- a/docs/research-paper/CodeVedha_EmergIN2027_Paper.docx
+++ b/docs/research-paper/CodeVedha_EmergIN2027_Paper.docx
@@ -1567,15 +1567,15 @@
         <w:pStyle w:val="BodyText"/>
       </w:pPr>
       <w:r>
-        <w:t>The implementation snapshot is Git commit d4cdb86, with rubric version complexity-focused-v2 and guidance version six, verified on 30 October 2026. Its source and prompt manifest records SHA-256 values, allowed configuration, Python 3.11.16, Linux x86-64, and twelve reported logical processors. Credentials and database contents are excluded. The evidence separates three questions: whether execution and scoring contracts hold; whether static complexity labels agree with supplied AI proposals; and which findings remain insufficient for human grading or educational claims.</w:t>
-      </w:r>
-    </w:p>
-    <w:p>
-      <w:pPr>
-        <w:pStyle w:val="BodyText"/>
-      </w:pPr>
-      <w:r>
-        <w:t>The backend suite passed 333 tests, projection rendering passed nine checks, and frontend lint and build passed. Coverage includes arithmetic, incomplete evidence, privacy, stale requests, alignment rejection, and API behavior. Optional provider responses are mocked where needed. These counts establish regression behavior, not grading accuracy.</w:t>
+        <w:t>The baseline implementation snapshot is Git commit d4cdb86, with rubric version complexity-focused-v2 and guidance version six, verified on 30 October 2026. Its source and prompt manifest records SHA-256 values, allowed configuration, Python 3.11.16, Linux x86-64, and twelve reported logical processors. Credentials and database contents are excluded. The evidence separates three questions: whether execution and scoring contracts hold; whether static complexity labels agree with supplied AI proposals; and which findings remain insufficient for human grading or educational claims.</w:t>
+      </w:r>
+    </w:p>
+    <w:p>
+      <w:pPr>
+        <w:pStyle w:val="BodyText"/>
+      </w:pPr>
+      <w:r>
+        <w:t>The baseline backend suite passed 333 tests, projection rendering passed nine checks, and frontend lint and build passed. Coverage includes arithmetic, incomplete evidence, privacy, stale requests, alignment rejection, and API behavior. Optional provider responses are mocked where needed. These counts establish regression behavior, not grading accuracy.</w:t>
       </w:r>
     </w:p>
     <w:p>
@@ -2261,15 +2261,31 @@
         <w:pStyle w:val="BodyText"/>
       </w:pPr>
       <w:r>
-        <w:t>The recorded output was O(m*n) time and O(1) space, with heuristic confidence 0.95. Both AI proposals gave O(n²) and O(1). Here the outer range and inner traversal both use a: for n = len(a), the inner addition executes n² times. The matching mathematical specialization is m = n, not an independent dimension. Thus this is a lost size relation and a strict-label mismatch, not evidence that every product bound is incorrect. The reset of total also makes the algorithm functionally wasteful: for nonempty input, only the last recomputed sum is returned.</w:t>
-      </w:r>
-    </w:p>
-    <w:p>
-      <w:pPr>
-        <w:pStyle w:val="BodyText"/>
-      </w:pPr>
-      <w:r>
-        <w:t>The issue can arise when separate syntactic traversals, aliases, or helper results refer to the same collection size without carrying that relation into the bound. Conversely, independent arrays of lengths m and n require O(m*n). Replacing every product with O(n²) would erase genuine multivariate costs, whose importance is established in [8]. A future repair should track collection identity and proven size equalities, then test equal and independent dimensions on held-out cases. We preserve the existing analyzer and reporting mismatch rather than tune it on this diagnostic set.</w:t>
+        <w:t>At the frozen baseline, the recorded output was O(m*n) time and O(1) space, with heuristic confidence 0.95. Both AI proposals gave O(n²) and O(1). Here the outer range and inner traversal both use a: for n = len(a), the inner addition executes n² times. The matching mathematical specialization is m = n, not an independent dimension. Thus this is a lost size relation and a strict-label mismatch, not evidence that every product bound is incorrect. The reset of total also makes the algorithm functionally wasteful: for nonempty input, only the last recomputed sum is returned.</w:t>
+      </w:r>
+    </w:p>
+    <w:p>
+      <w:pPr>
+        <w:pStyle w:val="BodyText"/>
+      </w:pPr>
+      <w:r>
+        <w:t>The issue can arise when separate syntactic traversals, aliases, or helper results refer to the same collection size without carrying that relation into the bound. Conversely, independent arrays of lengths m and n require O(m*n). Replacing every product with O(n²) would erase genuine multivariate costs, whose importance is established in [8]. The baseline product and quadratic labels map to the same scoring bucket, so this discrepancy alone does not demonstrate a wrong grade. The original output remains in the frozen evidence.</w:t>
+      </w:r>
+    </w:p>
+    <w:p>
+      <w:pPr>
+        <w:pStyle w:val="BodyText"/>
+      </w:pPr>
+      <w:r>
+        <w:t>A follow-up repair at commit 752c0d0 resolves direct traversal, range(len(a)), enumerate(a), and simple stable aliases by source identity. It also prevents the substring total += 1 from being mistaken for the pointer update l += 1, which had incorrectly collapsed some nested scans to linear time. Selected unresolved Python cases—opaque iterator bounds or loop-call costs, rebound size aliases, shadowed iteration builtins, and mutation of a traversed collection—now block finalized complexity marks. Confidence, runtime agreement, and model agreement cannot override this structural block; the existing rubric reports an incomplete total without redistributing the missing weights. Thus mitigation includes deterministic identity checks, abstention, and scoring enforcement rather than model fallback alone.</w:t>
+      </w:r>
+    </w:p>
+    <w:p>
+      <w:pPr>
+        <w:pStyle w:val="BodyText"/>
+      </w:pPr>
+      <w:r>
+        <w:t>The follow-up passed 359 backend tests, including 23 new regressions, and nine frontend checks, lint, and build. It matched all 20 AI label proposals on rerun. This is a post-hoc repair on a known diagnostic set, not held-out validation. These narrow safeguards do not cover arbitrary aliasing, custom iterators, interprocedural costs, or all languages; heuristic false positives and false negatives remain possible.</w:t>
       </w:r>
     </w:p>
     <w:p>
@@ -3387,7 +3403,7 @@
         <w:pStyle w:val="BodyText"/>
       </w:pPr>
       <w:r>
-        <w:t>Several threats constrain interpretation. Test-case correctness depends on specification quality, input serialization, comparator semantics, and coverage of boundary cases. The finite complexity ladder compresses multivariate and library-dependent costs. Confidence is heuristic, and runtime observations can reflect compilation, scheduling, or container overhead. The pilot has two problem groups, related cross-language variants, AI-proposed labels, and no held-out test set. The remaining symbolic-bound discrepancy is retained as a limitation rather than repaired on the reporting set.</w:t>
+        <w:t>Several threats constrain interpretation. Test-case correctness depends on specification quality, input serialization, comparator semantics, and coverage of boundary cases. The finite complexity ladder compresses multivariate and library-dependent costs. Confidence is heuristic, and runtime observations can reflect compilation, scheduling, or container overhead. The pilot has two problem groups, related cross-language variants, AI-proposed labels, and no held-out test set. The baseline symbolic-bound failure and separately identified post-hoc repair remain distinguishable; the new tests do not establish robustness on unconstrained student code.</w:t>
       </w:r>
     </w:p>
     <w:p>

</xml_diff>

<commit_message>
Add Sri Tulasi Aeloori first and finalize six-page submission PDF
</commit_message>
<xml_diff>
--- a/docs/research-paper/CodeVedha_EmergIN2027_Paper.docx
+++ b/docs/research-paper/CodeVedha_EmergIN2027_Paper.docx
@@ -15,7 +15,7 @@
         <w:pStyle w:val="Author"/>
       </w:pPr>
       <w:r>
-        <w:t>A. Manigreeva</w:t>
+        <w:t>Sri Tulasi Aeloori</w:t>
       </w:r>
       <w:r>
         <w:rPr>
@@ -27,7 +27,7 @@
         <w:t xml:space="preserve">, </w:t>
       </w:r>
       <w:r>
-        <w:t>D. Nayaneesh</w:t>
+        <w:t>A. Manigreeva</w:t>
       </w:r>
       <w:r>
         <w:rPr>
@@ -39,7 +39,7 @@
         <w:t xml:space="preserve">, </w:t>
       </w:r>
       <w:r>
-        <w:t>Kantam Pavan Sai Reddy</w:t>
+        <w:t>D. Nayaneesh</w:t>
       </w:r>
       <w:r>
         <w:rPr>
@@ -51,7 +51,7 @@
         <w:t xml:space="preserve">, </w:t>
       </w:r>
       <w:r>
-        <w:t>Kura Vignesh Reddy</w:t>
+        <w:t>Kantam Pavan Sai Reddy</w:t>
       </w:r>
       <w:r>
         <w:rPr>
@@ -60,13 +60,10 @@
         <w:t>4</w:t>
       </w:r>
       <w:r>
-        <w:t>*</w:t>
-      </w:r>
-      <w:r>
         <w:t xml:space="preserve">, </w:t>
       </w:r>
       <w:r>
-        <w:t>Vitta Karthikeya</w:t>
+        <w:t>Kura Vignesh Reddy</w:t>
       </w:r>
       <w:r>
         <w:rPr>
@@ -74,13 +71,28 @@
         </w:rPr>
         <w:t>5</w:t>
       </w:r>
+      <w:r>
+        <w:t>*</w:t>
+      </w:r>
+      <w:r>
+        <w:t xml:space="preserve">, </w:t>
+      </w:r>
+      <w:r>
+        <w:t>Vitta Karthikeya</w:t>
+      </w:r>
+      <w:r>
+        <w:rPr>
+          <w:vertAlign w:val="superscript"/>
+        </w:rPr>
+        <w:t>6</w:t>
+      </w:r>
     </w:p>
     <w:p>
       <w:pPr>
         <w:pStyle w:val="Affiliation"/>
       </w:pPr>
       <w:r>
-        <w:t>Department of Computer Science and Engineering</w:t>
+        <w:t>1 CSE (AI &amp; ML); 2–6 Department of Computer Science and Engineering</w:t>
         <w:br/>
         <w:t>Keshav Memorial Institute of Technology</w:t>
         <w:br/>
@@ -92,7 +104,7 @@
         <w:pStyle w:val="Affiliation"/>
       </w:pPr>
       <w:r>
-        <w:t>1 a.manigreeva@gmail.com;  2 nayaneesh6607@gmail.com</w:t>
+        <w:t>1 sritulasi447@gmail.com;  2 a.manigreeva@gmail.com</w:t>
       </w:r>
     </w:p>
     <w:p>
@@ -100,7 +112,7 @@
         <w:pStyle w:val="Affiliation"/>
       </w:pPr>
       <w:r>
-        <w:t>3 kantampavansaireddy30@gmail.com;  4 kvigneshreddy963@gmail.com</w:t>
+        <w:t>3 nayaneesh6607@gmail.com;  4 kantampavansaireddy30@gmail.com</w:t>
       </w:r>
     </w:p>
     <w:p>
@@ -108,7 +120,7 @@
         <w:pStyle w:val="Affiliation"/>
       </w:pPr>
       <w:r>
-        <w:t>5 vittakarthikeya@gmail.com</w:t>
+        <w:t>5 kvigneshreddy963@gmail.com;  6 vittakarthikeya@gmail.com</w:t>
       </w:r>
     </w:p>
     <w:p>
@@ -116,7 +128,7 @@
         <w:pStyle w:val="Affiliation"/>
       </w:pPr>
       <w:r>
-        <w:t>*Corresponding author: Kura Vignesh Reddy</w:t>
+        <w:t>*Corresponding author: Kura Vignesh Reddy, kvigneshreddy963@gmail.com</w:t>
       </w:r>
     </w:p>
     <w:p>

</xml_diff>

<commit_message>
Match conference template author blocks and verify final six-page PDF
</commit_message>
<xml_diff>
--- a/docs/research-paper/CodeVedha_EmergIN2027_Paper.docx
+++ b/docs/research-paper/CodeVedha_EmergIN2027_Paper.docx
@@ -10,119 +10,628 @@
         <w:t>CodeVedha An Auditable Programming Assessment Platform with Correctness Bounded Scoring</w:t>
       </w:r>
     </w:p>
-    <w:p>
-      <w:pPr>
-        <w:pStyle w:val="Author"/>
-      </w:pPr>
-      <w:r>
-        <w:t>Sri Tulasi Aeloori</w:t>
-      </w:r>
-      <w:r>
-        <w:rPr>
-          <w:vertAlign w:val="superscript"/>
-        </w:rPr>
-        <w:t>1</w:t>
-      </w:r>
-      <w:r>
-        <w:t xml:space="preserve">, </w:t>
-      </w:r>
-      <w:r>
-        <w:t>A. Manigreeva</w:t>
-      </w:r>
-      <w:r>
-        <w:rPr>
-          <w:vertAlign w:val="superscript"/>
-        </w:rPr>
-        <w:t>2</w:t>
-      </w:r>
-      <w:r>
-        <w:t xml:space="preserve">, </w:t>
-      </w:r>
-      <w:r>
-        <w:t>D. Nayaneesh</w:t>
-      </w:r>
-      <w:r>
-        <w:rPr>
-          <w:vertAlign w:val="superscript"/>
-        </w:rPr>
-        <w:t>3</w:t>
-      </w:r>
-      <w:r>
-        <w:t xml:space="preserve">, </w:t>
-      </w:r>
-      <w:r>
-        <w:t>Kantam Pavan Sai Reddy</w:t>
-      </w:r>
-      <w:r>
-        <w:rPr>
-          <w:vertAlign w:val="superscript"/>
-        </w:rPr>
-        <w:t>4</w:t>
-      </w:r>
-      <w:r>
-        <w:t xml:space="preserve">, </w:t>
-      </w:r>
-      <w:r>
-        <w:t>Kura Vignesh Reddy</w:t>
-      </w:r>
-      <w:r>
-        <w:rPr>
-          <w:vertAlign w:val="superscript"/>
-        </w:rPr>
-        <w:t>5</w:t>
-      </w:r>
-      <w:r>
-        <w:t>*</w:t>
-      </w:r>
-      <w:r>
-        <w:t xml:space="preserve">, </w:t>
-      </w:r>
-      <w:r>
-        <w:t>Vitta Karthikeya</w:t>
-      </w:r>
-      <w:r>
-        <w:rPr>
-          <w:vertAlign w:val="superscript"/>
-        </w:rPr>
-        <w:t>6</w:t>
-      </w:r>
-    </w:p>
-    <w:p>
-      <w:pPr>
-        <w:pStyle w:val="Affiliation"/>
-      </w:pPr>
-      <w:r>
-        <w:t>1 CSE (AI &amp; ML); 2–6 Department of Computer Science and Engineering</w:t>
-        <w:br/>
-        <w:t>Keshav Memorial Institute of Technology</w:t>
-        <w:br/>
-        <w:t>3-5-1026, Narayanguda, Hyderabad, Telangana 500029, India</w:t>
-      </w:r>
-    </w:p>
-    <w:p>
-      <w:pPr>
-        <w:pStyle w:val="Affiliation"/>
-      </w:pPr>
-      <w:r>
-        <w:t>1 sritulasi447@gmail.com;  2 a.manigreeva@gmail.com</w:t>
-      </w:r>
-    </w:p>
-    <w:p>
-      <w:pPr>
-        <w:pStyle w:val="Affiliation"/>
-      </w:pPr>
-      <w:r>
-        <w:t>3 nayaneesh6607@gmail.com;  4 kantampavansaireddy30@gmail.com</w:t>
-      </w:r>
-    </w:p>
-    <w:p>
-      <w:pPr>
-        <w:pStyle w:val="Affiliation"/>
-      </w:pPr>
-      <w:r>
-        <w:t>5 kvigneshreddy963@gmail.com;  6 vittakarthikeya@gmail.com</w:t>
-      </w:r>
-    </w:p>
+    <w:tbl>
+      <w:tblPr>
+        <w:tblW w:type="auto" w:w="0"/>
+        <w:tblLayout w:type="fixed"/>
+        <w:tblLook w:firstColumn="1" w:firstRow="1" w:lastColumn="0" w:lastRow="0" w:noHBand="0" w:noVBand="1" w:val="04A0"/>
+      </w:tblPr>
+      <w:tblGrid>
+        <w:gridCol w:w="3364"/>
+        <w:gridCol w:w="3364"/>
+        <w:gridCol w:w="3364"/>
+      </w:tblGrid>
+      <w:tr>
+        <w:tc>
+          <w:tcPr>
+            <w:tcW w:type="dxa" w:w="3283"/>
+          </w:tcPr>
+          <w:p>
+            <w:pPr>
+              <w:keepNext/>
+              <w:spacing w:before="0" w:after="0" w:line="240" w:lineRule="auto"/>
+              <w:ind w:firstLine="0"/>
+              <w:jc w:val="center"/>
+            </w:pPr>
+            <w:r>
+              <w:rPr>
+                <w:rFonts w:ascii="Times New Roman" w:hAnsi="Times New Roman"/>
+                <w:i w:val="0"/>
+                <w:sz w:val="20"/>
+              </w:rPr>
+              <w:t>Sri Tulasi Aeloori</w:t>
+            </w:r>
+          </w:p>
+          <w:p>
+            <w:pPr>
+              <w:keepNext/>
+              <w:spacing w:before="0" w:after="0" w:line="240" w:lineRule="auto"/>
+              <w:ind w:firstLine="0"/>
+              <w:jc w:val="center"/>
+            </w:pPr>
+            <w:r>
+              <w:rPr>
+                <w:rFonts w:ascii="Times New Roman" w:hAnsi="Times New Roman"/>
+                <w:i/>
+                <w:sz w:val="17"/>
+              </w:rPr>
+              <w:t>CSE (AI &amp; ML)</w:t>
+            </w:r>
+          </w:p>
+          <w:p>
+            <w:pPr>
+              <w:keepNext/>
+              <w:spacing w:before="0" w:after="0" w:line="240" w:lineRule="auto"/>
+              <w:ind w:firstLine="0"/>
+              <w:jc w:val="center"/>
+            </w:pPr>
+            <w:r>
+              <w:rPr>
+                <w:rFonts w:ascii="Times New Roman" w:hAnsi="Times New Roman"/>
+                <w:i/>
+                <w:sz w:val="17"/>
+              </w:rPr>
+              <w:t>Keshav Memorial Institute of Technology</w:t>
+            </w:r>
+          </w:p>
+          <w:p>
+            <w:pPr>
+              <w:keepNext/>
+              <w:spacing w:before="0" w:after="0" w:line="240" w:lineRule="auto"/>
+              <w:ind w:firstLine="0"/>
+              <w:jc w:val="center"/>
+            </w:pPr>
+            <w:r>
+              <w:rPr>
+                <w:rFonts w:ascii="Times New Roman" w:hAnsi="Times New Roman"/>
+                <w:i w:val="0"/>
+                <w:sz w:val="17"/>
+              </w:rPr>
+              <w:t>3-5-1026, Narayanguda</w:t>
+            </w:r>
+          </w:p>
+          <w:p>
+            <w:pPr>
+              <w:keepNext/>
+              <w:spacing w:before="0" w:after="0" w:line="240" w:lineRule="auto"/>
+              <w:ind w:firstLine="0"/>
+              <w:jc w:val="center"/>
+            </w:pPr>
+            <w:r>
+              <w:rPr>
+                <w:rFonts w:ascii="Times New Roman" w:hAnsi="Times New Roman"/>
+                <w:i w:val="0"/>
+                <w:sz w:val="17"/>
+              </w:rPr>
+              <w:t>Hyderabad, Telangana 500029, India</w:t>
+            </w:r>
+          </w:p>
+          <w:p>
+            <w:pPr>
+              <w:keepNext/>
+              <w:spacing w:before="0" w:after="100" w:line="240" w:lineRule="auto"/>
+              <w:ind w:firstLine="0"/>
+              <w:jc w:val="center"/>
+            </w:pPr>
+            <w:r>
+              <w:rPr>
+                <w:rFonts w:ascii="Times New Roman" w:hAnsi="Times New Roman"/>
+                <w:i w:val="0"/>
+                <w:sz w:val="17"/>
+              </w:rPr>
+              <w:t>sritulasi447@gmail.com</w:t>
+            </w:r>
+          </w:p>
+        </w:tc>
+        <w:tc>
+          <w:tcPr>
+            <w:tcW w:type="dxa" w:w="3283"/>
+          </w:tcPr>
+          <w:p>
+            <w:pPr>
+              <w:keepNext/>
+              <w:spacing w:before="0" w:after="0" w:line="240" w:lineRule="auto"/>
+              <w:ind w:firstLine="0"/>
+              <w:jc w:val="center"/>
+            </w:pPr>
+            <w:r>
+              <w:rPr>
+                <w:rFonts w:ascii="Times New Roman" w:hAnsi="Times New Roman"/>
+                <w:i w:val="0"/>
+                <w:sz w:val="20"/>
+              </w:rPr>
+              <w:t>A. Manigreeva</w:t>
+            </w:r>
+          </w:p>
+          <w:p>
+            <w:pPr>
+              <w:keepNext/>
+              <w:spacing w:before="0" w:after="0" w:line="240" w:lineRule="auto"/>
+              <w:ind w:firstLine="0"/>
+              <w:jc w:val="center"/>
+            </w:pPr>
+            <w:r>
+              <w:rPr>
+                <w:rFonts w:ascii="Times New Roman" w:hAnsi="Times New Roman"/>
+                <w:i/>
+                <w:sz w:val="17"/>
+              </w:rPr>
+              <w:t>Computer Science and Engineering</w:t>
+            </w:r>
+          </w:p>
+          <w:p>
+            <w:pPr>
+              <w:keepNext/>
+              <w:spacing w:before="0" w:after="0" w:line="240" w:lineRule="auto"/>
+              <w:ind w:firstLine="0"/>
+              <w:jc w:val="center"/>
+            </w:pPr>
+            <w:r>
+              <w:rPr>
+                <w:rFonts w:ascii="Times New Roman" w:hAnsi="Times New Roman"/>
+                <w:i/>
+                <w:sz w:val="17"/>
+              </w:rPr>
+              <w:t>Keshav Memorial Institute of Technology</w:t>
+            </w:r>
+          </w:p>
+          <w:p>
+            <w:pPr>
+              <w:keepNext/>
+              <w:spacing w:before="0" w:after="0" w:line="240" w:lineRule="auto"/>
+              <w:ind w:firstLine="0"/>
+              <w:jc w:val="center"/>
+            </w:pPr>
+            <w:r>
+              <w:rPr>
+                <w:rFonts w:ascii="Times New Roman" w:hAnsi="Times New Roman"/>
+                <w:i w:val="0"/>
+                <w:sz w:val="17"/>
+              </w:rPr>
+              <w:t>3-5-1026, Narayanguda</w:t>
+            </w:r>
+          </w:p>
+          <w:p>
+            <w:pPr>
+              <w:keepNext/>
+              <w:spacing w:before="0" w:after="0" w:line="240" w:lineRule="auto"/>
+              <w:ind w:firstLine="0"/>
+              <w:jc w:val="center"/>
+            </w:pPr>
+            <w:r>
+              <w:rPr>
+                <w:rFonts w:ascii="Times New Roman" w:hAnsi="Times New Roman"/>
+                <w:i w:val="0"/>
+                <w:sz w:val="17"/>
+              </w:rPr>
+              <w:t>Hyderabad, Telangana 500029, India</w:t>
+            </w:r>
+          </w:p>
+          <w:p>
+            <w:pPr>
+              <w:keepNext/>
+              <w:spacing w:before="0" w:after="100" w:line="240" w:lineRule="auto"/>
+              <w:ind w:firstLine="0"/>
+              <w:jc w:val="center"/>
+            </w:pPr>
+            <w:r>
+              <w:rPr>
+                <w:rFonts w:ascii="Times New Roman" w:hAnsi="Times New Roman"/>
+                <w:i w:val="0"/>
+                <w:sz w:val="17"/>
+              </w:rPr>
+              <w:t>a.manigreeva@gmail.com</w:t>
+            </w:r>
+          </w:p>
+        </w:tc>
+        <w:tc>
+          <w:tcPr>
+            <w:tcW w:type="dxa" w:w="3283"/>
+          </w:tcPr>
+          <w:p>
+            <w:pPr>
+              <w:keepNext/>
+              <w:spacing w:before="0" w:after="0" w:line="240" w:lineRule="auto"/>
+              <w:ind w:firstLine="0"/>
+              <w:jc w:val="center"/>
+            </w:pPr>
+            <w:r>
+              <w:rPr>
+                <w:rFonts w:ascii="Times New Roman" w:hAnsi="Times New Roman"/>
+                <w:i w:val="0"/>
+                <w:sz w:val="20"/>
+              </w:rPr>
+              <w:t>D. Nayaneesh</w:t>
+            </w:r>
+          </w:p>
+          <w:p>
+            <w:pPr>
+              <w:keepNext/>
+              <w:spacing w:before="0" w:after="0" w:line="240" w:lineRule="auto"/>
+              <w:ind w:firstLine="0"/>
+              <w:jc w:val="center"/>
+            </w:pPr>
+            <w:r>
+              <w:rPr>
+                <w:rFonts w:ascii="Times New Roman" w:hAnsi="Times New Roman"/>
+                <w:i/>
+                <w:sz w:val="17"/>
+              </w:rPr>
+              <w:t>Computer Science and Engineering</w:t>
+            </w:r>
+          </w:p>
+          <w:p>
+            <w:pPr>
+              <w:keepNext/>
+              <w:spacing w:before="0" w:after="0" w:line="240" w:lineRule="auto"/>
+              <w:ind w:firstLine="0"/>
+              <w:jc w:val="center"/>
+            </w:pPr>
+            <w:r>
+              <w:rPr>
+                <w:rFonts w:ascii="Times New Roman" w:hAnsi="Times New Roman"/>
+                <w:i/>
+                <w:sz w:val="17"/>
+              </w:rPr>
+              <w:t>Keshav Memorial Institute of Technology</w:t>
+            </w:r>
+          </w:p>
+          <w:p>
+            <w:pPr>
+              <w:keepNext/>
+              <w:spacing w:before="0" w:after="0" w:line="240" w:lineRule="auto"/>
+              <w:ind w:firstLine="0"/>
+              <w:jc w:val="center"/>
+            </w:pPr>
+            <w:r>
+              <w:rPr>
+                <w:rFonts w:ascii="Times New Roman" w:hAnsi="Times New Roman"/>
+                <w:i w:val="0"/>
+                <w:sz w:val="17"/>
+              </w:rPr>
+              <w:t>3-5-1026, Narayanguda</w:t>
+            </w:r>
+          </w:p>
+          <w:p>
+            <w:pPr>
+              <w:keepNext/>
+              <w:spacing w:before="0" w:after="0" w:line="240" w:lineRule="auto"/>
+              <w:ind w:firstLine="0"/>
+              <w:jc w:val="center"/>
+            </w:pPr>
+            <w:r>
+              <w:rPr>
+                <w:rFonts w:ascii="Times New Roman" w:hAnsi="Times New Roman"/>
+                <w:i w:val="0"/>
+                <w:sz w:val="17"/>
+              </w:rPr>
+              <w:t>Hyderabad, Telangana 500029, India</w:t>
+            </w:r>
+          </w:p>
+          <w:p>
+            <w:pPr>
+              <w:keepNext/>
+              <w:spacing w:before="0" w:after="100" w:line="240" w:lineRule="auto"/>
+              <w:ind w:firstLine="0"/>
+              <w:jc w:val="center"/>
+            </w:pPr>
+            <w:r>
+              <w:rPr>
+                <w:rFonts w:ascii="Times New Roman" w:hAnsi="Times New Roman"/>
+                <w:i w:val="0"/>
+                <w:sz w:val="17"/>
+              </w:rPr>
+              <w:t>nayaneesh6607@gmail.com</w:t>
+            </w:r>
+          </w:p>
+        </w:tc>
+      </w:tr>
+      <w:tr>
+        <w:tc>
+          <w:tcPr>
+            <w:tcW w:type="dxa" w:w="3283"/>
+          </w:tcPr>
+          <w:p>
+            <w:pPr>
+              <w:keepNext/>
+              <w:spacing w:before="0" w:after="0" w:line="240" w:lineRule="auto"/>
+              <w:ind w:firstLine="0"/>
+              <w:jc w:val="center"/>
+            </w:pPr>
+            <w:r>
+              <w:rPr>
+                <w:rFonts w:ascii="Times New Roman" w:hAnsi="Times New Roman"/>
+                <w:i w:val="0"/>
+                <w:sz w:val="20"/>
+              </w:rPr>
+              <w:t>Kantam Pavan Sai Reddy</w:t>
+            </w:r>
+          </w:p>
+          <w:p>
+            <w:pPr>
+              <w:keepNext/>
+              <w:spacing w:before="0" w:after="0" w:line="240" w:lineRule="auto"/>
+              <w:ind w:firstLine="0"/>
+              <w:jc w:val="center"/>
+            </w:pPr>
+            <w:r>
+              <w:rPr>
+                <w:rFonts w:ascii="Times New Roman" w:hAnsi="Times New Roman"/>
+                <w:i/>
+                <w:sz w:val="17"/>
+              </w:rPr>
+              <w:t>Computer Science and Engineering</w:t>
+            </w:r>
+          </w:p>
+          <w:p>
+            <w:pPr>
+              <w:keepNext/>
+              <w:spacing w:before="0" w:after="0" w:line="240" w:lineRule="auto"/>
+              <w:ind w:firstLine="0"/>
+              <w:jc w:val="center"/>
+            </w:pPr>
+            <w:r>
+              <w:rPr>
+                <w:rFonts w:ascii="Times New Roman" w:hAnsi="Times New Roman"/>
+                <w:i/>
+                <w:sz w:val="17"/>
+              </w:rPr>
+              <w:t>Keshav Memorial Institute of Technology</w:t>
+            </w:r>
+          </w:p>
+          <w:p>
+            <w:pPr>
+              <w:keepNext/>
+              <w:spacing w:before="0" w:after="0" w:line="240" w:lineRule="auto"/>
+              <w:ind w:firstLine="0"/>
+              <w:jc w:val="center"/>
+            </w:pPr>
+            <w:r>
+              <w:rPr>
+                <w:rFonts w:ascii="Times New Roman" w:hAnsi="Times New Roman"/>
+                <w:i w:val="0"/>
+                <w:sz w:val="17"/>
+              </w:rPr>
+              <w:t>3-5-1026, Narayanguda</w:t>
+            </w:r>
+          </w:p>
+          <w:p>
+            <w:pPr>
+              <w:keepNext/>
+              <w:spacing w:before="0" w:after="0" w:line="240" w:lineRule="auto"/>
+              <w:ind w:firstLine="0"/>
+              <w:jc w:val="center"/>
+            </w:pPr>
+            <w:r>
+              <w:rPr>
+                <w:rFonts w:ascii="Times New Roman" w:hAnsi="Times New Roman"/>
+                <w:i w:val="0"/>
+                <w:sz w:val="17"/>
+              </w:rPr>
+              <w:t>Hyderabad, Telangana 500029, India</w:t>
+            </w:r>
+          </w:p>
+          <w:p>
+            <w:pPr>
+              <w:keepNext/>
+              <w:spacing w:before="0" w:after="100" w:line="240" w:lineRule="auto"/>
+              <w:ind w:firstLine="0"/>
+              <w:jc w:val="center"/>
+            </w:pPr>
+            <w:r>
+              <w:rPr>
+                <w:rFonts w:ascii="Times New Roman" w:hAnsi="Times New Roman"/>
+                <w:i w:val="0"/>
+                <w:sz w:val="17"/>
+              </w:rPr>
+              <w:t>kantampavansaireddy30@gmail.com</w:t>
+            </w:r>
+          </w:p>
+        </w:tc>
+        <w:tc>
+          <w:tcPr>
+            <w:tcW w:type="dxa" w:w="3283"/>
+          </w:tcPr>
+          <w:p>
+            <w:pPr>
+              <w:keepNext/>
+              <w:spacing w:before="0" w:after="0" w:line="240" w:lineRule="auto"/>
+              <w:ind w:firstLine="0"/>
+              <w:jc w:val="center"/>
+            </w:pPr>
+            <w:r>
+              <w:rPr>
+                <w:rFonts w:ascii="Times New Roman" w:hAnsi="Times New Roman"/>
+                <w:i w:val="0"/>
+                <w:sz w:val="20"/>
+              </w:rPr>
+              <w:t>Kura Vignesh Reddy*</w:t>
+            </w:r>
+          </w:p>
+          <w:p>
+            <w:pPr>
+              <w:keepNext/>
+              <w:spacing w:before="0" w:after="0" w:line="240" w:lineRule="auto"/>
+              <w:ind w:firstLine="0"/>
+              <w:jc w:val="center"/>
+            </w:pPr>
+            <w:r>
+              <w:rPr>
+                <w:rFonts w:ascii="Times New Roman" w:hAnsi="Times New Roman"/>
+                <w:i/>
+                <w:sz w:val="17"/>
+              </w:rPr>
+              <w:t>Computer Science and Engineering</w:t>
+            </w:r>
+          </w:p>
+          <w:p>
+            <w:pPr>
+              <w:keepNext/>
+              <w:spacing w:before="0" w:after="0" w:line="240" w:lineRule="auto"/>
+              <w:ind w:firstLine="0"/>
+              <w:jc w:val="center"/>
+            </w:pPr>
+            <w:r>
+              <w:rPr>
+                <w:rFonts w:ascii="Times New Roman" w:hAnsi="Times New Roman"/>
+                <w:i/>
+                <w:sz w:val="17"/>
+              </w:rPr>
+              <w:t>Keshav Memorial Institute of Technology</w:t>
+            </w:r>
+          </w:p>
+          <w:p>
+            <w:pPr>
+              <w:keepNext/>
+              <w:spacing w:before="0" w:after="0" w:line="240" w:lineRule="auto"/>
+              <w:ind w:firstLine="0"/>
+              <w:jc w:val="center"/>
+            </w:pPr>
+            <w:r>
+              <w:rPr>
+                <w:rFonts w:ascii="Times New Roman" w:hAnsi="Times New Roman"/>
+                <w:i w:val="0"/>
+                <w:sz w:val="17"/>
+              </w:rPr>
+              <w:t>3-5-1026, Narayanguda</w:t>
+            </w:r>
+          </w:p>
+          <w:p>
+            <w:pPr>
+              <w:keepNext/>
+              <w:spacing w:before="0" w:after="0" w:line="240" w:lineRule="auto"/>
+              <w:ind w:firstLine="0"/>
+              <w:jc w:val="center"/>
+            </w:pPr>
+            <w:r>
+              <w:rPr>
+                <w:rFonts w:ascii="Times New Roman" w:hAnsi="Times New Roman"/>
+                <w:i w:val="0"/>
+                <w:sz w:val="17"/>
+              </w:rPr>
+              <w:t>Hyderabad, Telangana 500029, India</w:t>
+            </w:r>
+          </w:p>
+          <w:p>
+            <w:pPr>
+              <w:keepNext/>
+              <w:spacing w:before="0" w:after="100" w:line="240" w:lineRule="auto"/>
+              <w:ind w:firstLine="0"/>
+              <w:jc w:val="center"/>
+            </w:pPr>
+            <w:r>
+              <w:rPr>
+                <w:rFonts w:ascii="Times New Roman" w:hAnsi="Times New Roman"/>
+                <w:i w:val="0"/>
+                <w:sz w:val="17"/>
+              </w:rPr>
+              <w:t>kvigneshreddy963@gmail.com</w:t>
+            </w:r>
+          </w:p>
+        </w:tc>
+        <w:tc>
+          <w:tcPr>
+            <w:tcW w:type="dxa" w:w="3283"/>
+          </w:tcPr>
+          <w:p>
+            <w:pPr>
+              <w:keepNext/>
+              <w:spacing w:before="0" w:after="0" w:line="240" w:lineRule="auto"/>
+              <w:ind w:firstLine="0"/>
+              <w:jc w:val="center"/>
+            </w:pPr>
+            <w:r>
+              <w:rPr>
+                <w:rFonts w:ascii="Times New Roman" w:hAnsi="Times New Roman"/>
+                <w:i w:val="0"/>
+                <w:sz w:val="20"/>
+              </w:rPr>
+              <w:t>Vitta Karthikeya</w:t>
+            </w:r>
+          </w:p>
+          <w:p>
+            <w:pPr>
+              <w:keepNext/>
+              <w:spacing w:before="0" w:after="0" w:line="240" w:lineRule="auto"/>
+              <w:ind w:firstLine="0"/>
+              <w:jc w:val="center"/>
+            </w:pPr>
+            <w:r>
+              <w:rPr>
+                <w:rFonts w:ascii="Times New Roman" w:hAnsi="Times New Roman"/>
+                <w:i/>
+                <w:sz w:val="17"/>
+              </w:rPr>
+              <w:t>Computer Science and Engineering</w:t>
+            </w:r>
+          </w:p>
+          <w:p>
+            <w:pPr>
+              <w:keepNext/>
+              <w:spacing w:before="0" w:after="0" w:line="240" w:lineRule="auto"/>
+              <w:ind w:firstLine="0"/>
+              <w:jc w:val="center"/>
+            </w:pPr>
+            <w:r>
+              <w:rPr>
+                <w:rFonts w:ascii="Times New Roman" w:hAnsi="Times New Roman"/>
+                <w:i/>
+                <w:sz w:val="17"/>
+              </w:rPr>
+              <w:t>Keshav Memorial Institute of Technology</w:t>
+            </w:r>
+          </w:p>
+          <w:p>
+            <w:pPr>
+              <w:keepNext/>
+              <w:spacing w:before="0" w:after="0" w:line="240" w:lineRule="auto"/>
+              <w:ind w:firstLine="0"/>
+              <w:jc w:val="center"/>
+            </w:pPr>
+            <w:r>
+              <w:rPr>
+                <w:rFonts w:ascii="Times New Roman" w:hAnsi="Times New Roman"/>
+                <w:i w:val="0"/>
+                <w:sz w:val="17"/>
+              </w:rPr>
+              <w:t>3-5-1026, Narayanguda</w:t>
+            </w:r>
+          </w:p>
+          <w:p>
+            <w:pPr>
+              <w:keepNext/>
+              <w:spacing w:before="0" w:after="0" w:line="240" w:lineRule="auto"/>
+              <w:ind w:firstLine="0"/>
+              <w:jc w:val="center"/>
+            </w:pPr>
+            <w:r>
+              <w:rPr>
+                <w:rFonts w:ascii="Times New Roman" w:hAnsi="Times New Roman"/>
+                <w:i w:val="0"/>
+                <w:sz w:val="17"/>
+              </w:rPr>
+              <w:t>Hyderabad, Telangana 500029, India</w:t>
+            </w:r>
+          </w:p>
+          <w:p>
+            <w:pPr>
+              <w:keepNext/>
+              <w:spacing w:before="0" w:after="100" w:line="240" w:lineRule="auto"/>
+              <w:ind w:firstLine="0"/>
+              <w:jc w:val="center"/>
+            </w:pPr>
+            <w:r>
+              <w:rPr>
+                <w:rFonts w:ascii="Times New Roman" w:hAnsi="Times New Roman"/>
+                <w:i w:val="0"/>
+                <w:sz w:val="17"/>
+              </w:rPr>
+              <w:t>vittakarthikeya@gmail.com</w:t>
+            </w:r>
+          </w:p>
+        </w:tc>
+      </w:tr>
+    </w:tbl>
     <w:p>
       <w:pPr>
         <w:pStyle w:val="Affiliation"/>

</xml_diff>

<commit_message>
Polish submission title and clarify raw score sensitivity heading
</commit_message>
<xml_diff>
--- a/docs/research-paper/CodeVedha_EmergIN2027_Paper.docx
+++ b/docs/research-paper/CodeVedha_EmergIN2027_Paper.docx
@@ -7,7 +7,7 @@
         <w:pStyle w:val="Title"/>
       </w:pPr>
       <w:r>
-        <w:t>CodeVedha An Auditable Programming Assessment Platform with Correctness Bounded Scoring</w:t>
+        <w:t>CodeVedha: An Auditable Programming Assessment Platform with Correctness-Bounded Scoring</w:t>
       </w:r>
     </w:p>
     <w:tbl>
@@ -3388,10 +3388,10 @@
         </w:tblBorders>
       </w:tblPr>
       <w:tblGrid>
-        <w:gridCol w:w="2160"/>
-        <w:gridCol w:w="749"/>
-        <w:gridCol w:w="835"/>
-        <w:gridCol w:w="1066"/>
+        <w:gridCol w:w="1872"/>
+        <w:gridCol w:w="648"/>
+        <w:gridCol w:w="706"/>
+        <w:gridCol w:w="1584"/>
       </w:tblGrid>
       <w:tr>
         <w:trPr>
@@ -3400,7 +3400,7 @@
         </w:trPr>
         <w:tc>
           <w:tcPr>
-            <w:tcW w:type="dxa" w:w="2160"/>
+            <w:tcW w:type="dxa" w:w="1872"/>
             <w:shd w:fill="EEEEEE"/>
             <w:tcMar>
               <w:top w:w="55" w:type="dxa"/>
@@ -3429,7 +3429,7 @@
         </w:tc>
         <w:tc>
           <w:tcPr>
-            <w:tcW w:type="dxa" w:w="749"/>
+            <w:tcW w:type="dxa" w:w="648"/>
             <w:shd w:fill="EEEEEE"/>
             <w:tcMar>
               <w:top w:w="55" w:type="dxa"/>
@@ -3458,7 +3458,7 @@
         </w:tc>
         <w:tc>
           <w:tcPr>
-            <w:tcW w:type="dxa" w:w="835"/>
+            <w:tcW w:type="dxa" w:w="706"/>
             <w:shd w:fill="EEEEEE"/>
             <w:tcMar>
               <w:top w:w="55" w:type="dxa"/>
@@ -3487,7 +3487,7 @@
         </w:tc>
         <w:tc>
           <w:tcPr>
-            <w:tcW w:type="dxa" w:w="1066"/>
+            <w:tcW w:type="dxa" w:w="1584"/>
             <w:shd w:fill="EEEEEE"/>
             <w:tcMar>
               <w:top w:w="55" w:type="dxa"/>
@@ -3510,7 +3510,7 @@
                 <w:b/>
                 <w:sz w:val="16"/>
               </w:rPr>
-              <w:t>Q &gt; C</w:t>
+              <w:t>Raw weighted score exceeds correctness (Q &gt; C)</w:t>
             </w:r>
           </w:p>
         </w:tc>
@@ -3521,7 +3521,7 @@
         </w:trPr>
         <w:tc>
           <w:tcPr>
-            <w:tcW w:type="dxa" w:w="2160"/>
+            <w:tcW w:type="dxa" w:w="1872"/>
             <w:tcMar>
               <w:top w:w="55" w:type="dxa"/>
               <w:left w:w="55" w:type="dxa"/>
@@ -3549,7 +3549,7 @@
         </w:tc>
         <w:tc>
           <w:tcPr>
-            <w:tcW w:type="dxa" w:w="749"/>
+            <w:tcW w:type="dxa" w:w="648"/>
             <w:tcMar>
               <w:top w:w="55" w:type="dxa"/>
               <w:left w:w="55" w:type="dxa"/>
@@ -3577,7 +3577,7 @@
         </w:tc>
         <w:tc>
           <w:tcPr>
-            <w:tcW w:type="dxa" w:w="835"/>
+            <w:tcW w:type="dxa" w:w="706"/>
             <w:tcMar>
               <w:top w:w="55" w:type="dxa"/>
               <w:left w:w="55" w:type="dxa"/>
@@ -3605,7 +3605,7 @@
         </w:tc>
         <w:tc>
           <w:tcPr>
-            <w:tcW w:type="dxa" w:w="1066"/>
+            <w:tcW w:type="dxa" w:w="1584"/>
             <w:tcMar>
               <w:top w:w="55" w:type="dxa"/>
               <w:left w:w="55" w:type="dxa"/>
@@ -3638,7 +3638,7 @@
         </w:trPr>
         <w:tc>
           <w:tcPr>
-            <w:tcW w:type="dxa" w:w="2160"/>
+            <w:tcW w:type="dxa" w:w="1872"/>
             <w:tcMar>
               <w:top w:w="55" w:type="dxa"/>
               <w:left w:w="55" w:type="dxa"/>
@@ -3666,7 +3666,7 @@
         </w:tc>
         <w:tc>
           <w:tcPr>
-            <w:tcW w:type="dxa" w:w="749"/>
+            <w:tcW w:type="dxa" w:w="648"/>
             <w:tcMar>
               <w:top w:w="55" w:type="dxa"/>
               <w:left w:w="55" w:type="dxa"/>
@@ -3694,7 +3694,7 @@
         </w:tc>
         <w:tc>
           <w:tcPr>
-            <w:tcW w:type="dxa" w:w="835"/>
+            <w:tcW w:type="dxa" w:w="706"/>
             <w:tcMar>
               <w:top w:w="55" w:type="dxa"/>
               <w:left w:w="55" w:type="dxa"/>
@@ -3722,7 +3722,7 @@
         </w:tc>
         <w:tc>
           <w:tcPr>
-            <w:tcW w:type="dxa" w:w="1066"/>
+            <w:tcW w:type="dxa" w:w="1584"/>
             <w:tcMar>
               <w:top w:w="55" w:type="dxa"/>
               <w:left w:w="55" w:type="dxa"/>
@@ -3755,7 +3755,7 @@
         </w:trPr>
         <w:tc>
           <w:tcPr>
-            <w:tcW w:type="dxa" w:w="2160"/>
+            <w:tcW w:type="dxa" w:w="1872"/>
             <w:tcMar>
               <w:top w:w="55" w:type="dxa"/>
               <w:left w:w="55" w:type="dxa"/>
@@ -3783,7 +3783,7 @@
         </w:tc>
         <w:tc>
           <w:tcPr>
-            <w:tcW w:type="dxa" w:w="749"/>
+            <w:tcW w:type="dxa" w:w="648"/>
             <w:tcMar>
               <w:top w:w="55" w:type="dxa"/>
               <w:left w:w="55" w:type="dxa"/>
@@ -3811,7 +3811,7 @@
         </w:tc>
         <w:tc>
           <w:tcPr>
-            <w:tcW w:type="dxa" w:w="835"/>
+            <w:tcW w:type="dxa" w:w="706"/>
             <w:tcMar>
               <w:top w:w="55" w:type="dxa"/>
               <w:left w:w="55" w:type="dxa"/>
@@ -3839,7 +3839,7 @@
         </w:tc>
         <w:tc>
           <w:tcPr>
-            <w:tcW w:type="dxa" w:w="1066"/>
+            <w:tcW w:type="dxa" w:w="1584"/>
             <w:tcMar>
               <w:top w:w="55" w:type="dxa"/>
               <w:left w:w="55" w:type="dxa"/>
@@ -3940,7 +3940,7 @@
         <w:pStyle w:val="BodyText"/>
       </w:pPr>
       <w:r>
-        <w:t>Further evaluation can compare complexity estimates with independently adjudicated labels on problem-level holdouts and compare grading policies against blinded instructor judgments. Feedback factuality, relevance, actionability, and disclosure, together with warm/cold latency distributions and provider failures, are separate evaluation targets.</w:t>
+        <w:t>Future evaluation should compare complexity estimates with independently adjudicated labels on problem-held-out data, compare grades with blinded instructor judgments, and measure feedback quality, latency, and provider failures.</w:t>
       </w:r>
     </w:p>
     <w:p>
@@ -3948,7 +3948,7 @@
         <w:pStyle w:val="BodyText"/>
       </w:pPr>
       <w:r>
-        <w:t>The reported evaluation uses synthetic fixtures and supplied AI review artifacts; it does not analyze identifiable learner records or report participant outcomes. The published package excludes credentials, private course data, and real judge secrets. Imported public problem collections are not redistributed as the publication dataset.</w:t>
+        <w:t>The evaluation uses synthetic fixtures and supplied AI artifacts, without identifiable learner data or participant outcomes. The public package excludes credentials, private course data, real judge secrets, and imported problem collections.</w:t>
       </w:r>
     </w:p>
     <w:p>

</xml_diff>